<commit_message>
docs: formalize chapter 2 criteria with math formulas and fix chapter numbering sequence
</commit_message>
<xml_diff>
--- a/thesis/_output/JHerrera_XAI_Tesis_Doctorado.docx
+++ b/thesis/_output/JHerrera_XAI_Tesis_Doctorado.docx
@@ -765,182 +765,585 @@
       </w:r>
     </w:p>
     <w:bookmarkEnd w:id="28"/>
-    <w:bookmarkStart w:id="44" w:name="marco-teórico"/>
+    <w:bookmarkStart w:id="43" w:name="marco-metodológico"/>
     <w:p>
       <w:pPr>
         <w:pStyle w:val="Ttulo1"/>
       </w:pPr>
       <w:r>
-        <w:t xml:space="preserve">2. Marco teórico</w:t>
-      </w:r>
-    </w:p>
-    <w:bookmarkStart w:id="29" w:name="X7133ed101bf9a9b0f87ccc84aa7c501df9ebcd7"/>
+        <w:t xml:space="preserve">2. Marco Metodológico</w:t>
+      </w:r>
+    </w:p>
+    <w:bookmarkStart w:id="29" w:name="problema-de-investigación"/>
     <w:p>
       <w:pPr>
         <w:pStyle w:val="Ttulo2"/>
       </w:pPr>
       <w:r>
-        <w:t xml:space="preserve">2.1 Estado del arte en XAI e interpretabilidad agnóstica</w:t>
+        <w:t xml:space="preserve">2.1 Problema de investigación</w:t>
       </w:r>
     </w:p>
     <w:bookmarkEnd w:id="29"/>
-    <w:bookmarkStart w:id="30" w:name="problema-de-investigación"/>
+    <w:bookmarkStart w:id="30" w:name="justificación-científica-y-práctica"/>
     <w:p>
       <w:pPr>
         <w:pStyle w:val="Ttulo2"/>
       </w:pPr>
       <w:r>
-        <w:t xml:space="preserve">2.2 Problema de investigación</w:t>
+        <w:t xml:space="preserve">2.2 Justificación científica y práctica</w:t>
       </w:r>
     </w:p>
     <w:bookmarkEnd w:id="30"/>
-    <w:bookmarkStart w:id="31" w:name="justificación-científica-y-práctica"/>
+    <w:bookmarkStart w:id="34" w:name="objetivos-e-hipótesis"/>
     <w:p>
       <w:pPr>
         <w:pStyle w:val="Ttulo2"/>
       </w:pPr>
       <w:r>
-        <w:t xml:space="preserve">2.3 Justificación científica y práctica</w:t>
+        <w:t xml:space="preserve">2.3 Objetivos e hipótesis</w:t>
+      </w:r>
+    </w:p>
+    <w:bookmarkStart w:id="31" w:name="objetivo-general"/>
+    <w:p>
+      <w:pPr>
+        <w:pStyle w:val="Ttulo3"/>
+      </w:pPr>
+      <w:r>
+        <w:t xml:space="preserve">2.3.1 Objetivo general</w:t>
       </w:r>
     </w:p>
     <w:bookmarkEnd w:id="31"/>
-    <w:bookmarkStart w:id="35" w:name="objetivos-e-hipótesis"/>
+    <w:bookmarkStart w:id="32" w:name="objetivos-específicos"/>
+    <w:p>
+      <w:pPr>
+        <w:pStyle w:val="Ttulo3"/>
+      </w:pPr>
+      <w:r>
+        <w:t xml:space="preserve">2.3.2 Objetivos específicos</w:t>
+      </w:r>
+    </w:p>
+    <w:bookmarkEnd w:id="32"/>
+    <w:bookmarkStart w:id="33" w:name="hipótesis-o-proposiciones-de-trabajo"/>
+    <w:p>
+      <w:pPr>
+        <w:pStyle w:val="Ttulo3"/>
+      </w:pPr>
+      <w:r>
+        <w:t xml:space="preserve">2.3.3 Hipótesis o proposiciones de trabajo</w:t>
+      </w:r>
+    </w:p>
+    <w:bookmarkEnd w:id="33"/>
+    <w:bookmarkEnd w:id="34"/>
+    <w:bookmarkStart w:id="42" w:name="metodología-general-de-la-investigación"/>
     <w:p>
       <w:pPr>
         <w:pStyle w:val="Ttulo2"/>
       </w:pPr>
       <w:r>
-        <w:t xml:space="preserve">2.4 Objetivos e hipótesis</w:t>
-      </w:r>
-    </w:p>
-    <w:bookmarkStart w:id="32" w:name="objetivo-general"/>
+        <w:t xml:space="preserve">2.4 Metodología general de la investigación</w:t>
+      </w:r>
+    </w:p>
+    <w:bookmarkStart w:id="35" w:name="enfoque"/>
     <w:p>
       <w:pPr>
         <w:pStyle w:val="Ttulo3"/>
       </w:pPr>
       <w:r>
-        <w:t xml:space="preserve">2.4.1 Objetivo general</w:t>
-      </w:r>
-    </w:p>
-    <w:bookmarkEnd w:id="32"/>
-    <w:bookmarkStart w:id="33" w:name="objetivos-específicos"/>
+        <w:t xml:space="preserve">2.4.1 Enfoque</w:t>
+      </w:r>
+    </w:p>
+    <w:bookmarkEnd w:id="35"/>
+    <w:bookmarkStart w:id="36" w:name="tipo-de-investigación"/>
     <w:p>
       <w:pPr>
         <w:pStyle w:val="Ttulo3"/>
       </w:pPr>
       <w:r>
-        <w:t xml:space="preserve">2.4.2 Objetivos específicos</w:t>
-      </w:r>
-    </w:p>
-    <w:bookmarkEnd w:id="33"/>
-    <w:bookmarkStart w:id="34" w:name="hipótesis-o-proposiciones-de-trabajo"/>
+        <w:t xml:space="preserve">2.4.2 Tipo de investigación</w:t>
+      </w:r>
+    </w:p>
+    <w:bookmarkEnd w:id="36"/>
+    <w:bookmarkStart w:id="37" w:name="universo-y-contexto-experimental"/>
     <w:p>
       <w:pPr>
         <w:pStyle w:val="Ttulo3"/>
       </w:pPr>
       <w:r>
-        <w:t xml:space="preserve">2.4.3 Hipótesis o proposiciones de trabajo</w:t>
-      </w:r>
-    </w:p>
-    <w:bookmarkEnd w:id="34"/>
-    <w:bookmarkEnd w:id="35"/>
-    <w:bookmarkStart w:id="43" w:name="metodología-general-de-la-investigación"/>
-    <w:p>
-      <w:pPr>
-        <w:pStyle w:val="Ttulo2"/>
-      </w:pPr>
-      <w:r>
-        <w:t xml:space="preserve">2.5 Metodología general de la investigación</w:t>
-      </w:r>
-    </w:p>
-    <w:bookmarkStart w:id="36" w:name="enfoque"/>
+        <w:t xml:space="preserve">2.4.3 Universo y contexto experimental</w:t>
+      </w:r>
+    </w:p>
+    <w:bookmarkEnd w:id="37"/>
+    <w:bookmarkStart w:id="38" w:name="Xdcd1be9d99c262f87a75615ad9164d40f630ac9"/>
     <w:p>
       <w:pPr>
         <w:pStyle w:val="Ttulo3"/>
       </w:pPr>
       <w:r>
-        <w:t xml:space="preserve">2.5.1 Enfoque</w:t>
-      </w:r>
-    </w:p>
-    <w:bookmarkEnd w:id="36"/>
-    <w:bookmarkStart w:id="37" w:name="tipo-de-investigación"/>
+        <w:t xml:space="preserve">2.4.4 Muestra de datasets, modelos y métodos XAI</w:t>
+      </w:r>
+    </w:p>
+    <w:bookmarkEnd w:id="38"/>
+    <w:bookmarkStart w:id="39" w:name="criterios-de-inclusión-y-exclusión"/>
     <w:p>
       <w:pPr>
         <w:pStyle w:val="Ttulo3"/>
       </w:pPr>
       <w:r>
-        <w:t xml:space="preserve">2.5.2 Tipo de investigación</w:t>
-      </w:r>
-    </w:p>
-    <w:bookmarkEnd w:id="37"/>
-    <w:bookmarkStart w:id="38" w:name="universo-y-contexto-experimental"/>
+        <w:t xml:space="preserve">2.4.5 Criterios de inclusión y exclusión</w:t>
+      </w:r>
+    </w:p>
+    <w:bookmarkEnd w:id="39"/>
+    <w:bookmarkStart w:id="40" w:name="variables-dimensiones-y-métricas"/>
     <w:p>
       <w:pPr>
         <w:pStyle w:val="Ttulo3"/>
       </w:pPr>
       <w:r>
-        <w:t xml:space="preserve">2.5.3 Universo y contexto experimental</w:t>
-      </w:r>
-    </w:p>
-    <w:bookmarkEnd w:id="38"/>
-    <w:bookmarkStart w:id="39" w:name="Xdcd1be9d99c262f87a75615ad9164d40f630ac9"/>
+        <w:t xml:space="preserve">2.4.6 Variables, dimensiones y métricas</w:t>
+      </w:r>
+    </w:p>
+    <w:bookmarkEnd w:id="40"/>
+    <w:bookmarkStart w:id="41" w:name="estrategia-procedimental"/>
     <w:p>
       <w:pPr>
         <w:pStyle w:val="Ttulo3"/>
       </w:pPr>
       <w:r>
-        <w:t xml:space="preserve">2.5.4 Muestra de datasets, modelos y métodos XAI</w:t>
-      </w:r>
-    </w:p>
-    <w:bookmarkEnd w:id="39"/>
-    <w:bookmarkStart w:id="40" w:name="criterios-de-inclusión-y-exclusión"/>
-    <w:p>
-      <w:pPr>
-        <w:pStyle w:val="Ttulo3"/>
-      </w:pPr>
-      <w:r>
-        <w:t xml:space="preserve">2.5.5 Criterios de inclusión y exclusión</w:t>
-      </w:r>
-    </w:p>
-    <w:bookmarkEnd w:id="40"/>
-    <w:bookmarkStart w:id="41" w:name="variables-dimensiones-y-métricas"/>
-    <w:p>
-      <w:pPr>
-        <w:pStyle w:val="Ttulo3"/>
-      </w:pPr>
-      <w:r>
-        <w:t xml:space="preserve">2.5.6 Variables, dimensiones y métricas</w:t>
+        <w:t xml:space="preserve">2.4.7 Estrategia procedimental</w:t>
       </w:r>
     </w:p>
     <w:bookmarkEnd w:id="41"/>
-    <w:bookmarkStart w:id="42" w:name="estrategia-procedimental"/>
-    <w:p>
-      <w:pPr>
-        <w:pStyle w:val="Ttulo3"/>
-      </w:pPr>
-      <w:r>
-        <w:t xml:space="preserve">2.5.7 Estrategia procedimental</w:t>
-      </w:r>
-    </w:p>
     <w:bookmarkEnd w:id="42"/>
     <w:bookmarkEnd w:id="43"/>
+    <w:bookmarkStart w:id="54" w:name="X5df853d312351836bad75f10c25fdcfe7ebc358"/>
+    <w:p>
+      <w:pPr>
+        <w:pStyle w:val="Ttulo1"/>
+      </w:pPr>
+      <w:r>
+        <w:t xml:space="preserve">3. Marco teórico específico / fundamentos conceptuales</w:t>
+      </w:r>
+    </w:p>
+    <w:bookmarkStart w:id="44" w:name="X7133ed101bf9a9b0f87ccc84aa7c501df9ebcd7"/>
+    <w:p>
+      <w:pPr>
+        <w:pStyle w:val="Ttulo2"/>
+      </w:pPr>
+      <w:r>
+        <w:t xml:space="preserve">3.1 Estado del arte en XAI e interpretabilidad agnóstica</w:t>
+      </w:r>
+    </w:p>
+    <w:p>
+      <w:pPr>
+        <w:pStyle w:val="FirstParagraph"/>
+      </w:pPr>
+      <w:r>
+        <w:t xml:space="preserve">El campo de la Inteligencia Artificial Explicable (XAI) ha experimentado una</w:t>
+      </w:r>
+      <w:r>
+        <w:t xml:space="preserve"> </w:t>
+      </w:r>
+      <w:r>
+        <w:t xml:space="preserve">expansión sin precedentes en la última década, consolidándose como un pilar</w:t>
+      </w:r>
+      <w:r>
+        <w:t xml:space="preserve"> </w:t>
+      </w:r>
+      <w:r>
+        <w:t xml:space="preserve">crítico para la adopción de modelos de caja negra en sectores de alta</w:t>
+      </w:r>
+      <w:r>
+        <w:t xml:space="preserve"> </w:t>
+      </w:r>
+      <w:r>
+        <w:t xml:space="preserve">responsabilidad. Las revisiones sistemáticas más recientes</w:t>
+      </w:r>
+      <w:r>
+        <w:t xml:space="preserve"> </w:t>
+      </w:r>
+      <w:r>
+        <w:t xml:space="preserve">(Abdul Kadir et al. 2023; Canha et al. 2025)</w:t>
+      </w:r>
+      <w:r>
+        <w:t xml:space="preserve"> </w:t>
+      </w:r>
+      <w:r>
+        <w:t xml:space="preserve">coinciden en que, si bien la literatura ha producido un crecimiento</w:t>
+      </w:r>
+      <w:r>
+        <w:t xml:space="preserve"> </w:t>
+      </w:r>
+      <w:r>
+        <w:t xml:space="preserve">asintótico en el número de algoritmos propuestos —destacando métodos líderes</w:t>
+      </w:r>
+      <w:r>
+        <w:t xml:space="preserve"> </w:t>
+      </w:r>
+      <w:r>
+        <w:t xml:space="preserve">como LIME</w:t>
+      </w:r>
+      <w:r>
+        <w:t xml:space="preserve"> </w:t>
+      </w:r>
+      <w:r>
+        <w:t xml:space="preserve">(Ribeiro 2016)</w:t>
+      </w:r>
+      <w:r>
+        <w:t xml:space="preserve">, SHAP</w:t>
+      </w:r>
+      <w:r>
+        <w:t xml:space="preserve"> </w:t>
+      </w:r>
+      <w:r>
+        <w:t xml:space="preserve">(Lundberg 2017)</w:t>
+      </w:r>
+      <w:r>
+        <w:t xml:space="preserve"> </w:t>
+      </w:r>
+      <w:r>
+        <w:t xml:space="preserve">y Anchors</w:t>
+      </w:r>
+      <w:r>
+        <w:t xml:space="preserve"> </w:t>
+      </w:r>
+      <w:r>
+        <w:t xml:space="preserve">(Ribeiro 2018)</w:t>
+      </w:r>
+      <w:r>
+        <w:t xml:space="preserve">—, el</w:t>
+      </w:r>
+      <w:r>
+        <w:t xml:space="preserve"> </w:t>
+      </w:r>
+      <w:r>
+        <w:t xml:space="preserve">desarrollo de protocolos de evaluación estandarizados no ha seguido el mismo</w:t>
+      </w:r>
+      <w:r>
+        <w:t xml:space="preserve"> </w:t>
+      </w:r>
+      <w:r>
+        <w:t xml:space="preserve">ritmo. De hecho, un análisis basado en la metodología PRISMA realizado por</w:t>
+      </w:r>
+      <w:r>
+        <w:t xml:space="preserve"> </w:t>
+      </w:r>
+      <w:r>
+        <w:t xml:space="preserve">Abdul Kadir et al. (2023)</w:t>
+      </w:r>
+      <w:r>
+        <w:t xml:space="preserve"> </w:t>
+      </w:r>
+      <w:r>
+        <w:t xml:space="preserve">revela que, a pesar de la madurez percibida del área, solo una</w:t>
+      </w:r>
+      <w:r>
+        <w:t xml:space="preserve"> </w:t>
+      </w:r>
+      <w:r>
+        <w:t xml:space="preserve">fracción marginal de la producción científica (estimada en un 14%) incorpora</w:t>
+      </w:r>
+      <w:r>
+        <w:t xml:space="preserve"> </w:t>
+      </w:r>
+      <w:r>
+        <w:t xml:space="preserve">marcos de evaluación cuantitativa rigurosos, limitándose mayoritariamente a</w:t>
+      </w:r>
+      <w:r>
+        <w:t xml:space="preserve"> </w:t>
+      </w:r>
+      <w:r>
+        <w:t xml:space="preserve">validaciones cualitativas o anecdóticas.</w:t>
+      </w:r>
+    </w:p>
+    <w:p>
+      <w:pPr>
+        <w:pStyle w:val="Textoindependiente"/>
+      </w:pPr>
+      <w:r>
+        <w:t xml:space="preserve">Esta fragmentación ha dado lugar a lo que</w:t>
+      </w:r>
+      <w:r>
+        <w:t xml:space="preserve"> </w:t>
+      </w:r>
+      <w:r>
+        <w:t xml:space="preserve">Pawlicki et al. (2024)</w:t>
+      </w:r>
+      <w:r>
+        <w:t xml:space="preserve"> </w:t>
+      </w:r>
+      <w:r>
+        <w:t xml:space="preserve">define como una</w:t>
+      </w:r>
+      <w:r>
+        <w:t xml:space="preserve"> </w:t>
+      </w:r>
+      <w:r>
+        <w:t xml:space="preserve">proliferación de métricas inconexas, donde la duplicidad de criterios y la falta</w:t>
+      </w:r>
+      <w:r>
+        <w:t xml:space="preserve"> </w:t>
+      </w:r>
+      <w:r>
+        <w:t xml:space="preserve">de consenso sobre las propiedades fundamentales de una explicación (como la</w:t>
+      </w:r>
+      <w:r>
+        <w:t xml:space="preserve"> </w:t>
+      </w:r>
+      <w:r>
+        <w:t xml:space="preserve">fidelidad, la estabilidad y la robustez) dificultan la comparación objetiva</w:t>
+      </w:r>
+      <w:r>
+        <w:t xml:space="preserve"> </w:t>
+      </w:r>
+      <w:r>
+        <w:t xml:space="preserve">entre aproximaciones. Investigaciones contemporáneas</w:t>
+      </w:r>
+      <w:r>
+        <w:t xml:space="preserve"> </w:t>
+      </w:r>
+      <w:r>
+        <w:t xml:space="preserve">(Bhattacharya and Verbert 2024; Nizam and Zafar 2023)</w:t>
+      </w:r>
+      <w:r>
+        <w:t xml:space="preserve"> </w:t>
+      </w:r>
+      <w:r>
+        <w:t xml:space="preserve">argumentan que la falta de un estándar unificado impide valorar la</w:t>
+      </w:r>
+      <w:r>
+        <w:t xml:space="preserve"> </w:t>
+      </w:r>
+      <w:r>
+        <w:t xml:space="preserve">explicabilidad de manera multidimensional, ignorando a menudo el hecho de que</w:t>
+      </w:r>
+      <w:r>
+        <w:t xml:space="preserve"> </w:t>
+      </w:r>
+      <w:r>
+        <w:t xml:space="preserve">los sistemas de IA modernos no solo requieren precisión técnica, sino también</w:t>
+      </w:r>
+      <w:r>
+        <w:t xml:space="preserve"> </w:t>
+      </w:r>
+      <w:r>
+        <w:t xml:space="preserve">validez semántica para sus destinatarios humanos. En respuesta a este vacío, han</w:t>
+      </w:r>
+      <w:r>
+        <w:t xml:space="preserve"> </w:t>
+      </w:r>
+      <w:r>
+        <w:t xml:space="preserve">surgido ecosistemas de benchmarking integrales como Quantus</w:t>
+      </w:r>
+      <w:r>
+        <w:t xml:space="preserve"> </w:t>
+      </w:r>
+      <w:r>
+        <w:t xml:space="preserve">(Hedström et al. 2023)</w:t>
+      </w:r>
+      <w:r>
+        <w:t xml:space="preserve"> </w:t>
+      </w:r>
+      <w:r>
+        <w:t xml:space="preserve">y</w:t>
+      </w:r>
+      <w:r>
+        <w:t xml:space="preserve"> </w:t>
+      </w:r>
+      <w:r>
+        <w:t xml:space="preserve">OpenXAI</w:t>
+      </w:r>
+      <w:r>
+        <w:t xml:space="preserve"> </w:t>
+      </w:r>
+      <w:r>
+        <w:t xml:space="preserve">(Agarwal et al. 2022)</w:t>
+      </w:r>
+      <w:r>
+        <w:t xml:space="preserve">, los cuales intentan sistematizar el proceso de</w:t>
+      </w:r>
+      <w:r>
+        <w:t xml:space="preserve"> </w:t>
+      </w:r>
+      <w:r>
+        <w:t xml:space="preserve">quantificación mediante toolkits automatizados que agrupan métricas por afinidad</w:t>
+      </w:r>
+      <w:r>
+        <w:t xml:space="preserve"> </w:t>
+      </w:r>
+      <w:r>
+        <w:t xml:space="preserve">lógica. Sin embargo, como señala</w:t>
+      </w:r>
+      <w:r>
+        <w:t xml:space="preserve"> </w:t>
+      </w:r>
+      <w:r>
+        <w:t xml:space="preserve">Zheng et al. (2025)</w:t>
+      </w:r>
+      <w:r>
+        <w:t xml:space="preserve">, incluso estos marcos enfrentan retos</w:t>
+      </w:r>
+      <w:r>
+        <w:t xml:space="preserve"> </w:t>
+      </w:r>
+      <w:r>
+        <w:t xml:space="preserve">técnicos significativos, como la inestabilidad de las métricas ante datos fuera</w:t>
+      </w:r>
+      <w:r>
+        <w:t xml:space="preserve"> </w:t>
+      </w:r>
+      <w:r>
+        <w:t xml:space="preserve">de la distribución (OOD), lo que subraya la necesidad de seguir evolucionando</w:t>
+      </w:r>
+      <w:r>
+        <w:t xml:space="preserve"> </w:t>
+      </w:r>
+      <w:r>
+        <w:t xml:space="preserve">hacia marcos de evaluación multinivel y más robustos, tal como se propone en el</w:t>
+      </w:r>
+      <w:r>
+        <w:t xml:space="preserve"> </w:t>
+      </w:r>
+      <w:r>
+        <w:t xml:space="preserve">presente estudio.</w:t>
+      </w:r>
+    </w:p>
     <w:bookmarkEnd w:id="44"/>
-    <w:bookmarkStart w:id="62" w:name="X5df853d312351836bad75f10c25fdcfe7ebc358"/>
-    <w:p>
-      <w:pPr>
-        <w:pStyle w:val="Ttulo1"/>
-      </w:pPr>
-      <w:r>
-        <w:t xml:space="preserve">3. Marco teórico específico / fundamentos conceptuales</w:t>
-      </w:r>
-    </w:p>
     <w:bookmarkStart w:id="45" w:name="fundamentos-de-ia-de-caja-negra"/>
     <w:p>
       <w:pPr>
         <w:pStyle w:val="Ttulo2"/>
       </w:pPr>
       <w:r>
-        <w:t xml:space="preserve">3.1 Fundamentos de IA de caja negra</w:t>
+        <w:t xml:space="preserve">3.2 Fundamentos de IA de caja negra</w:t>
+      </w:r>
+    </w:p>
+    <w:p>
+      <w:pPr>
+        <w:pStyle w:val="FirstParagraph"/>
+      </w:pPr>
+      <w:r>
+        <w:t xml:space="preserve">Para comprender el estado actual de la XAI, es imperativo analizar la naturaleza</w:t>
+      </w:r>
+      <w:r>
+        <w:t xml:space="preserve"> </w:t>
+      </w:r>
+      <w:r>
+        <w:t xml:space="preserve">técnica de la</w:t>
+      </w:r>
+      <w:r>
+        <w:t xml:space="preserve"> </w:t>
+      </w:r>
+      <w:r>
+        <w:t xml:space="preserve">“caja negra”</w:t>
+      </w:r>
+      <w:r>
+        <w:t xml:space="preserve"> </w:t>
+      </w:r>
+      <w:r>
+        <w:t xml:space="preserve">(</w:t>
+      </w:r>
+      <w:r>
+        <w:rPr>
+          <w:i/>
+          <w:iCs/>
+        </w:rPr>
+        <w:t xml:space="preserve">black-box models</w:t>
+      </w:r>
+      <w:r>
+        <w:t xml:space="preserve">). La evolución de la IA ha pasado</w:t>
+      </w:r>
+      <w:r>
+        <w:t xml:space="preserve"> </w:t>
+      </w:r>
+      <w:r>
+        <w:t xml:space="preserve">de modelos estadísticos transparentes —como la regresión lineal o árboles de</w:t>
+      </w:r>
+      <w:r>
+        <w:t xml:space="preserve"> </w:t>
+      </w:r>
+      <w:r>
+        <w:t xml:space="preserve">decisión simples— a sistemas cuya lógica interna es inescrutable debido a su</w:t>
+      </w:r>
+      <w:r>
+        <w:t xml:space="preserve"> </w:t>
+      </w:r>
+      <w:r>
+        <w:t xml:space="preserve">altísima dimensionalidad y no linealidad. Los modelos de ensamble (Random Forest,</w:t>
+      </w:r>
+      <w:r>
+        <w:t xml:space="preserve"> </w:t>
+      </w:r>
+      <w:r>
+        <w:t xml:space="preserve">XGBoost) y las Redes Neuronales Profundas (DNN) logran niveles de precisión</w:t>
+      </w:r>
+      <w:r>
+        <w:t xml:space="preserve"> </w:t>
+      </w:r>
+      <w:r>
+        <w:t xml:space="preserve">sobresalientes sacrificando la interpretabilidad directa. Esta opacidad no es un</w:t>
+      </w:r>
+      <w:r>
+        <w:t xml:space="preserve"> </w:t>
+      </w:r>
+      <w:r>
+        <w:t xml:space="preserve">fallo de diseño, sino una consecuencia de la complejidad requerida para capturar</w:t>
+      </w:r>
+      <w:r>
+        <w:t xml:space="preserve"> </w:t>
+      </w:r>
+      <w:r>
+        <w:t xml:space="preserve">patrones en datos no estructurados. Como señalan</w:t>
+      </w:r>
+      <w:r>
+        <w:t xml:space="preserve"> </w:t>
+      </w:r>
+      <w:r>
+        <w:t xml:space="preserve">Canha et al. (2025)</w:t>
+      </w:r>
+      <w:r>
+        <w:t xml:space="preserve"> </w:t>
+      </w:r>
+      <w:r>
+        <w:t xml:space="preserve">y</w:t>
+      </w:r>
+      <w:r>
+        <w:t xml:space="preserve"> </w:t>
+      </w:r>
+      <w:r>
+        <w:t xml:space="preserve">Pawlicki et al. (2024)</w:t>
+      </w:r>
+      <w:r>
+        <w:t xml:space="preserve">, esto</w:t>
+      </w:r>
+      <w:r>
+        <w:t xml:space="preserve"> </w:t>
+      </w:r>
+      <w:r>
+        <w:t xml:space="preserve">genera un</w:t>
+      </w:r>
+      <w:r>
+        <w:t xml:space="preserve"> </w:t>
+      </w:r>
+      <w:r>
+        <w:t xml:space="preserve">“dilema de confianza”</w:t>
+      </w:r>
+      <w:r>
+        <w:t xml:space="preserve"> </w:t>
+      </w:r>
+      <w:r>
+        <w:t xml:space="preserve">donde el usuario debe aceptar una decisión sin</w:t>
+      </w:r>
+      <w:r>
+        <w:t xml:space="preserve"> </w:t>
+      </w:r>
+      <w:r>
+        <w:t xml:space="preserve">acceso a su proceso deductivo, marcando el punto de partida para las técnicas de</w:t>
+      </w:r>
+      <w:r>
+        <w:t xml:space="preserve"> </w:t>
+      </w:r>
+      <w:r>
+        <w:t xml:space="preserve">explicabilidad agnóstica.</w:t>
       </w:r>
     </w:p>
     <w:bookmarkEnd w:id="45"/>
@@ -950,402 +1353,1555 @@
         <w:pStyle w:val="Ttulo2"/>
       </w:pPr>
       <w:r>
-        <w:t xml:space="preserve">3.2 Interpretabilidad y explicabilidad</w:t>
+        <w:t xml:space="preserve">3.3 Interpretabilidad y explicabilidad</w:t>
+      </w:r>
+    </w:p>
+    <w:p>
+      <w:pPr>
+        <w:pStyle w:val="FirstParagraph"/>
+      </w:pPr>
+      <w:r>
+        <w:t xml:space="preserve">A pesar de que los términos</w:t>
+      </w:r>
+      <w:r>
+        <w:t xml:space="preserve"> </w:t>
+      </w:r>
+      <w:r>
+        <w:t xml:space="preserve">“interpretabilidad”</w:t>
+      </w:r>
+      <w:r>
+        <w:t xml:space="preserve"> </w:t>
+      </w:r>
+      <w:r>
+        <w:t xml:space="preserve">y</w:t>
+      </w:r>
+      <w:r>
+        <w:t xml:space="preserve"> </w:t>
+      </w:r>
+      <w:r>
+        <w:t xml:space="preserve">“explicabilidad”</w:t>
+      </w:r>
+      <w:r>
+        <w:t xml:space="preserve"> </w:t>
+      </w:r>
+      <w:r>
+        <w:t xml:space="preserve">se utilizan a</w:t>
+      </w:r>
+      <w:r>
+        <w:t xml:space="preserve"> </w:t>
+      </w:r>
+      <w:r>
+        <w:t xml:space="preserve">menudo como sinónimos en la literatura técnica, revisiones sistemáticas de gran</w:t>
+      </w:r>
+      <w:r>
+        <w:t xml:space="preserve"> </w:t>
+      </w:r>
+      <w:r>
+        <w:t xml:space="preserve">escala destacadas por</w:t>
+      </w:r>
+      <w:r>
+        <w:t xml:space="preserve"> </w:t>
+      </w:r>
+      <w:r>
+        <w:t xml:space="preserve">Abdul Kadir et al. (2023)</w:t>
+      </w:r>
+      <w:r>
+        <w:t xml:space="preserve"> </w:t>
+      </w:r>
+      <w:r>
+        <w:t xml:space="preserve">destacan una falta de consenso</w:t>
+      </w:r>
+      <w:r>
+        <w:t xml:space="preserve"> </w:t>
+      </w:r>
+      <w:r>
+        <w:t xml:space="preserve">terminológico que fragmenta el campo. Para los propósitos de este marco</w:t>
+      </w:r>
+      <w:r>
+        <w:t xml:space="preserve"> </w:t>
+      </w:r>
+      <w:r>
+        <w:t xml:space="preserve">multinivel, es fundamental establecer una distinción operativa basada en el</w:t>
+      </w:r>
+      <w:r>
+        <w:t xml:space="preserve"> </w:t>
+      </w:r>
+      <w:r>
+        <w:t xml:space="preserve">destinatario final de la información: el ser humano. Mientras que la</w:t>
+      </w:r>
+      <w:r>
+        <w:t xml:space="preserve"> </w:t>
+      </w:r>
+      <w:r>
+        <w:t xml:space="preserve">interpretabilidad se asocia frecuentemente con la transparencia intrínseca de los</w:t>
+      </w:r>
+      <w:r>
+        <w:t xml:space="preserve"> </w:t>
+      </w:r>
+      <w:r>
+        <w:t xml:space="preserve">mecanismos internos de un modelo, la explicabilidad emerge como un concepto que</w:t>
+      </w:r>
+      <w:r>
+        <w:t xml:space="preserve"> </w:t>
+      </w:r>
+      <w:r>
+        <w:t xml:space="preserve">busca traducir esa complejidad en un lenguaje comprensible para el usuario</w:t>
+      </w:r>
+      <w:r>
+        <w:t xml:space="preserve"> </w:t>
+      </w:r>
+      <w:r>
+        <w:t xml:space="preserve">(Canha et al. 2025)</w:t>
+      </w:r>
+      <w:r>
+        <w:t xml:space="preserve">.</w:t>
+      </w:r>
+    </w:p>
+    <w:p>
+      <w:pPr>
+        <w:pStyle w:val="Textoindependiente"/>
+      </w:pPr>
+      <w:r>
+        <w:t xml:space="preserve">Siguiendo la propuesta de</w:t>
+      </w:r>
+      <w:r>
+        <w:t xml:space="preserve"> </w:t>
+      </w:r>
+      <w:r>
+        <w:t xml:space="preserve">(</w:t>
+      </w:r>
+      <w:r>
+        <w:rPr>
+          <w:b/>
+          <w:bCs/>
+        </w:rPr>
+        <w:t xml:space="preserve">linardatos2021?</w:t>
+      </w:r>
+      <w:r>
+        <w:t xml:space="preserve">)</w:t>
+      </w:r>
+      <w:r>
+        <w:t xml:space="preserve">, se define la interpretabilidad como la</w:t>
+      </w:r>
+      <w:r>
+        <w:t xml:space="preserve"> </w:t>
+      </w:r>
+      <w:r>
+        <w:t xml:space="preserve">capacidad de discernir la mecánica interna de un sistema sin necesidad de conocer</w:t>
+      </w:r>
+      <w:r>
+        <w:t xml:space="preserve"> </w:t>
+      </w:r>
+      <w:r>
+        <w:t xml:space="preserve">el</w:t>
+      </w:r>
+      <w:r>
+        <w:t xml:space="preserve"> </w:t>
+      </w:r>
+      <w:r>
+        <w:t xml:space="preserve">“porqué”</w:t>
+      </w:r>
+      <w:r>
+        <w:t xml:space="preserve"> </w:t>
+      </w:r>
+      <w:r>
+        <w:t xml:space="preserve">profundo de cada decisión, conectando primordialmente con la</w:t>
+      </w:r>
+      <w:r>
+        <w:t xml:space="preserve"> </w:t>
+      </w:r>
+      <w:r>
+        <w:t xml:space="preserve">intuición técnica. Por el contrario, la explicabilidad añade una</w:t>
+      </w:r>
+      <w:r>
+        <w:t xml:space="preserve"> </w:t>
+      </w:r>
+      <w:r>
+        <w:t xml:space="preserve">“capa de</w:t>
+      </w:r>
+      <w:r>
+        <w:t xml:space="preserve"> </w:t>
+      </w:r>
+      <w:r>
+        <w:t xml:space="preserve">razonamiento”</w:t>
+      </w:r>
+      <w:r>
+        <w:t xml:space="preserve"> </w:t>
+      </w:r>
+      <w:r>
+        <w:t xml:space="preserve">(</w:t>
+      </w:r>
+      <w:r>
+        <w:rPr>
+          <w:i/>
+          <w:iCs/>
+        </w:rPr>
+        <w:t xml:space="preserve">reasoning layer</w:t>
+      </w:r>
+      <w:r>
+        <w:t xml:space="preserve">) sobre los mecanismos técnicos para clarificar</w:t>
+      </w:r>
+      <w:r>
+        <w:t xml:space="preserve"> </w:t>
+      </w:r>
+      <w:r>
+        <w:t xml:space="preserve">el proceso lógico que condujo a una salida específica</w:t>
+      </w:r>
+      <w:r>
+        <w:t xml:space="preserve"> </w:t>
+      </w:r>
+      <w:r>
+        <w:t xml:space="preserve">(Canha et al. 2025)</w:t>
+      </w:r>
+      <w:r>
+        <w:t xml:space="preserve">. Esta</w:t>
+      </w:r>
+      <w:r>
+        <w:t xml:space="preserve"> </w:t>
+      </w:r>
+      <w:r>
+        <w:t xml:space="preserve">distinción es especialmente relevante para esta tesis, ya que justifica la</w:t>
+      </w:r>
+      <w:r>
+        <w:t xml:space="preserve"> </w:t>
+      </w:r>
+      <w:r>
+        <w:t xml:space="preserve">necesidad de no solo evaluar la</w:t>
+      </w:r>
+      <w:r>
+        <w:t xml:space="preserve"> </w:t>
+      </w:r>
+      <w:r>
+        <w:t xml:space="preserve">“fidelidad”</w:t>
+      </w:r>
+      <w:r>
+        <w:t xml:space="preserve"> </w:t>
+      </w:r>
+      <w:r>
+        <w:t xml:space="preserve">al modelo (parámetro técnico), sino</w:t>
+      </w:r>
+      <w:r>
+        <w:t xml:space="preserve"> </w:t>
+      </w:r>
+      <w:r>
+        <w:t xml:space="preserve">también la</w:t>
+      </w:r>
+      <w:r>
+        <w:t xml:space="preserve"> </w:t>
+      </w:r>
+      <w:r>
+        <w:t xml:space="preserve">“coherencia semántica”</w:t>
+      </w:r>
+      <w:r>
+        <w:t xml:space="preserve"> </w:t>
+      </w:r>
+      <w:r>
+        <w:t xml:space="preserve">(capa de razonamiento humano) sustentada por</w:t>
+      </w:r>
+      <w:r>
+        <w:t xml:space="preserve"> </w:t>
+      </w:r>
+      <w:r>
+        <w:t xml:space="preserve">criterios multidimensionales</w:t>
+      </w:r>
+      <w:r>
+        <w:t xml:space="preserve"> </w:t>
+      </w:r>
+      <w:r>
+        <w:t xml:space="preserve">(Bhattacharya and Verbert 2024)</w:t>
+      </w:r>
+      <w:r>
+        <w:t xml:space="preserve">.</w:t>
       </w:r>
     </w:p>
     <w:bookmarkEnd w:id="46"/>
-    <w:bookmarkStart w:id="51" w:name="métodos-agnósticos-de-explicación"/>
+    <w:bookmarkStart w:id="53" w:name="criterios-de-evaluación-de-explicaciones"/>
     <w:p>
       <w:pPr>
         <w:pStyle w:val="Ttulo2"/>
       </w:pPr>
       <w:r>
-        <w:t xml:space="preserve">3.3 Métodos agnósticos de explicación</w:t>
-      </w:r>
-    </w:p>
-    <w:bookmarkStart w:id="47" w:name="lime"/>
+        <w:t xml:space="preserve">3.4 Criterios de evaluación de explicaciones</w:t>
+      </w:r>
+    </w:p>
+    <w:p>
+      <w:pPr>
+        <w:pStyle w:val="FirstParagraph"/>
+      </w:pPr>
+      <w:r>
+        <w:t xml:space="preserve">La evaluación de la calidad de una explicación es un proceso multidimensional que</w:t>
+      </w:r>
+      <w:r>
+        <w:t xml:space="preserve"> </w:t>
+      </w:r>
+      <w:r>
+        <w:t xml:space="preserve">requiere la cuantificación de diversas propiedades funcionales. A continuación,</w:t>
+      </w:r>
+      <w:r>
+        <w:t xml:space="preserve"> </w:t>
+      </w:r>
+      <w:r>
+        <w:t xml:space="preserve">se detallan los criterios técnicos fundamentales adoptados en este estudio,</w:t>
+      </w:r>
+      <w:r>
+        <w:t xml:space="preserve"> </w:t>
+      </w:r>
+      <w:r>
+        <w:t xml:space="preserve">sustentados en la jerarquía funcional propuesta por</w:t>
+      </w:r>
+      <w:r>
+        <w:t xml:space="preserve"> </w:t>
+      </w:r>
+      <w:r>
+        <w:t xml:space="preserve">Canha et al. (2025)</w:t>
+      </w:r>
+      <w:r>
+        <w:t xml:space="preserve"> </w:t>
+      </w:r>
+      <w:r>
+        <w:t xml:space="preserve">y los marcos de</w:t>
+      </w:r>
+      <w:r>
+        <w:t xml:space="preserve"> </w:t>
+      </w:r>
+      <w:r>
+        <w:t xml:space="preserve">benchmarking de</w:t>
+      </w:r>
+      <w:r>
+        <w:t xml:space="preserve"> </w:t>
+      </w:r>
+      <w:r>
+        <w:t xml:space="preserve">Agarwal et al. (2022)</w:t>
+      </w:r>
+      <w:r>
+        <w:t xml:space="preserve">.</w:t>
+      </w:r>
+    </w:p>
+    <w:bookmarkStart w:id="47" w:name="fidelidad"/>
     <w:p>
       <w:pPr>
         <w:pStyle w:val="Ttulo3"/>
       </w:pPr>
       <w:r>
-        <w:t xml:space="preserve">3.3.1 LIME</w:t>
+        <w:t xml:space="preserve">3.4.1 Fidelidad</w:t>
+      </w:r>
+    </w:p>
+    <w:p>
+      <w:pPr>
+        <w:pStyle w:val="FirstParagraph"/>
+      </w:pPr>
+      <w:r>
+        <w:t xml:space="preserve">La fidelidad (</w:t>
+      </w:r>
+      <w:r>
+        <w:t xml:space="preserve">) mide el grado en que un método de explicación</w:t>
+      </w:r>
+      <w:r>
+        <w:t xml:space="preserve"> </w:t>
+      </w:r>
+      <w:r>
+        <w:t xml:space="preserve">logra representar el verdadero proceso deductivo del modelo de caja negra.</w:t>
+      </w:r>
+      <w:r>
+        <w:t xml:space="preserve"> </w:t>
+      </w:r>
+      <w:r>
+        <w:t xml:space="preserve">Siguiendo la definición de</w:t>
+      </w:r>
+      <w:r>
+        <w:t xml:space="preserve"> </w:t>
+      </w:r>
+      <w:r>
+        <w:t xml:space="preserve">Canha et al. (2025)</w:t>
+      </w:r>
+      <w:r>
+        <w:t xml:space="preserve">, esta se operacionaliza a menudo como el</w:t>
+      </w:r>
+      <w:r>
+        <w:t xml:space="preserve"> </w:t>
+      </w:r>
+      <w:r>
+        <w:t xml:space="preserve">“acuerdo del sustituto”</w:t>
+      </w:r>
+      <w:r>
+        <w:t xml:space="preserve"> </w:t>
+      </w:r>
+      <w:r>
+        <w:t xml:space="preserve">(</w:t>
+      </w:r>
+      <w:r>
+        <w:t xml:space="preserve">), formulado como:</w:t>
+      </w:r>
+    </w:p>
+    <w:p>
+      <w:pPr>
+        <w:pStyle w:val="Textoindependiente"/>
+      </w:pPr>
+      <m:oMathPara>
+        <m:oMathParaPr>
+          <m:jc m:val="center"/>
+        </m:oMathParaPr>
+        <m:oMath>
+          <m:sSub>
+            <m:e>
+              <m:r>
+                <m:t>m</m:t>
+              </m:r>
+            </m:e>
+            <m:sub>
+              <m:r>
+                <m:t>f</m:t>
+              </m:r>
+              <m:r>
+                <m:t>i</m:t>
+              </m:r>
+              <m:r>
+                <m:t>d</m:t>
+              </m:r>
+            </m:sub>
+          </m:sSub>
+          <m:r>
+            <m:rPr>
+              <m:sty m:val="p"/>
+            </m:rPr>
+            <m:t>=</m:t>
+          </m:r>
+          <m:r>
+            <m:t>1</m:t>
+          </m:r>
+          <m:r>
+            <m:rPr>
+              <m:sty m:val="p"/>
+            </m:rPr>
+            <m:t>−</m:t>
+          </m:r>
+          <m:f>
+            <m:fPr>
+              <m:type m:val="bar"/>
+            </m:fPr>
+            <m:num>
+              <m:nary>
+                <m:naryPr>
+                  <m:chr m:val="∑"/>
+                  <m:limLoc m:val="undOvr"/>
+                  <m:subHide m:val="off"/>
+                  <m:supHide m:val="off"/>
+                </m:naryPr>
+                <m:sub>
+                  <m:r>
+                    <m:t>i</m:t>
+                  </m:r>
+                  <m:r>
+                    <m:rPr>
+                      <m:sty m:val="p"/>
+                    </m:rPr>
+                    <m:t>=</m:t>
+                  </m:r>
+                  <m:r>
+                    <m:t>1</m:t>
+                  </m:r>
+                </m:sub>
+                <m:sup>
+                  <m:r>
+                    <m:t>N</m:t>
+                  </m:r>
+                </m:sup>
+                <m:e>
+                  <m:r>
+                    <m:rPr>
+                      <m:sty m:val="p"/>
+                    </m:rPr>
+                    <m:t>|</m:t>
+                  </m:r>
+                </m:e>
+              </m:nary>
+              <m:r>
+                <m:t>b</m:t>
+              </m:r>
+              <m:r>
+                <m:rPr>
+                  <m:sty m:val="p"/>
+                </m:rPr>
+                <m:t>(</m:t>
+              </m:r>
+              <m:sSub>
+                <m:e>
+                  <m:r>
+                    <m:t>x</m:t>
+                  </m:r>
+                </m:e>
+                <m:sub>
+                  <m:r>
+                    <m:t>i</m:t>
+                  </m:r>
+                </m:sub>
+              </m:sSub>
+              <m:r>
+                <m:rPr>
+                  <m:sty m:val="p"/>
+                </m:rPr>
+                <m:t>)</m:t>
+              </m:r>
+              <m:r>
+                <m:rPr>
+                  <m:sty m:val="p"/>
+                </m:rPr>
+                <m:t>−</m:t>
+              </m:r>
+              <m:r>
+                <m:t>s</m:t>
+              </m:r>
+              <m:r>
+                <m:rPr>
+                  <m:sty m:val="p"/>
+                </m:rPr>
+                <m:t>(</m:t>
+              </m:r>
+              <m:sSub>
+                <m:e>
+                  <m:r>
+                    <m:t>x</m:t>
+                  </m:r>
+                </m:e>
+                <m:sub>
+                  <m:r>
+                    <m:t>i</m:t>
+                  </m:r>
+                </m:sub>
+              </m:sSub>
+              <m:r>
+                <m:rPr>
+                  <m:sty m:val="p"/>
+                </m:rPr>
+                <m:t>)</m:t>
+              </m:r>
+              <m:r>
+                <m:rPr>
+                  <m:sty m:val="p"/>
+                </m:rPr>
+                <m:t>|</m:t>
+              </m:r>
+            </m:num>
+            <m:den>
+              <m:r>
+                <m:t>N</m:t>
+              </m:r>
+              <m:r>
+                <m:rPr>
+                  <m:sty m:val="p"/>
+                </m:rPr>
+                <m:t>⋅</m:t>
+              </m:r>
+              <m:r>
+                <m:rPr>
+                  <m:sty m:val="p"/>
+                </m:rPr>
+                <m:t>max</m:t>
+              </m:r>
+              <m:r>
+                <m:rPr>
+                  <m:sty m:val="p"/>
+                </m:rPr>
+                <m:t>(</m:t>
+              </m:r>
+              <m:r>
+                <m:t>b</m:t>
+              </m:r>
+              <m:r>
+                <m:rPr>
+                  <m:sty m:val="p"/>
+                </m:rPr>
+                <m:t>(</m:t>
+              </m:r>
+              <m:r>
+                <m:t>x</m:t>
+              </m:r>
+              <m:r>
+                <m:rPr>
+                  <m:sty m:val="p"/>
+                </m:rPr>
+                <m:t>)</m:t>
+              </m:r>
+              <m:r>
+                <m:rPr>
+                  <m:sty m:val="p"/>
+                </m:rPr>
+                <m:t>)</m:t>
+              </m:r>
+            </m:den>
+          </m:f>
+        </m:oMath>
+      </m:oMathPara>
+    </w:p>
+    <w:p>
+      <w:pPr>
+        <w:pStyle w:val="FirstParagraph"/>
+      </w:pPr>
+      <w:r>
+        <w:t xml:space="preserve">Donde</w:t>
+      </w:r>
+      <w:r>
+        <w:t xml:space="preserve"> </w:t>
+      </w:r>
+      <m:oMath>
+        <m:r>
+          <m:t>b</m:t>
+        </m:r>
+        <m:r>
+          <m:rPr>
+            <m:sty m:val="p"/>
+          </m:rPr>
+          <m:t>(</m:t>
+        </m:r>
+        <m:r>
+          <m:t>x</m:t>
+        </m:r>
+        <m:r>
+          <m:rPr>
+            <m:sty m:val="p"/>
+          </m:rPr>
+          <m:t>)</m:t>
+        </m:r>
+      </m:oMath>
+      <w:r>
+        <w:t xml:space="preserve"> </w:t>
+      </w:r>
+      <w:r>
+        <w:t xml:space="preserve">representa la salida del modelo de caja negra y</w:t>
+      </w:r>
+      <w:r>
+        <w:t xml:space="preserve"> </w:t>
+      </w:r>
+      <m:oMath>
+        <m:r>
+          <m:t>s</m:t>
+        </m:r>
+        <m:r>
+          <m:rPr>
+            <m:sty m:val="p"/>
+          </m:rPr>
+          <m:t>(</m:t>
+        </m:r>
+        <m:r>
+          <m:t>x</m:t>
+        </m:r>
+        <m:r>
+          <m:rPr>
+            <m:sty m:val="p"/>
+          </m:rPr>
+          <m:t>)</m:t>
+        </m:r>
+      </m:oMath>
+      <w:r>
+        <w:t xml:space="preserve"> </w:t>
+      </w:r>
+      <w:r>
+        <w:t xml:space="preserve">la del modelo</w:t>
+      </w:r>
+      <w:r>
+        <w:t xml:space="preserve"> </w:t>
+      </w:r>
+      <w:r>
+        <w:t xml:space="preserve">sustituto o aproximación local. Es vital distinguir la fidelidad de la</w:t>
+      </w:r>
+      <w:r>
+        <w:t xml:space="preserve"> </w:t>
+      </w:r>
+      <w:r>
+        <w:t xml:space="preserve">fehaciencia (</w:t>
+      </w:r>
+      <w:r>
+        <w:t xml:space="preserve">), ya que un modelo puede ser fiel en su</w:t>
+      </w:r>
+      <w:r>
+        <w:t xml:space="preserve"> </w:t>
+      </w:r>
+      <w:r>
+        <w:t xml:space="preserve">mimetismo predictivo pero no necesariamente fehaciente en capturar la lógica</w:t>
+      </w:r>
+      <w:r>
+        <w:t xml:space="preserve"> </w:t>
+      </w:r>
+      <w:r>
+        <w:t xml:space="preserve">causal subyacente</w:t>
+      </w:r>
+      <w:r>
+        <w:t xml:space="preserve"> </w:t>
+      </w:r>
+      <w:r>
+        <w:t xml:space="preserve">(Zheng et al. 2025)</w:t>
+      </w:r>
+      <w:r>
+        <w:t xml:space="preserve">.</w:t>
       </w:r>
     </w:p>
     <w:bookmarkEnd w:id="47"/>
-    <w:bookmarkStart w:id="48" w:name="shap"/>
+    <w:bookmarkStart w:id="48" w:name="estabilidad"/>
     <w:p>
       <w:pPr>
         <w:pStyle w:val="Ttulo3"/>
       </w:pPr>
       <w:r>
-        <w:t xml:space="preserve">3.3.2 SHAP</w:t>
+        <w:t xml:space="preserve">3.4.2 Estabilidad</w:t>
+      </w:r>
+    </w:p>
+    <w:p>
+      <w:pPr>
+        <w:pStyle w:val="FirstParagraph"/>
+      </w:pPr>
+      <w:r>
+        <w:t xml:space="preserve">La estabilidad evalúa la consistencia de las explicaciones ante variaciones</w:t>
+      </w:r>
+      <w:r>
+        <w:t xml:space="preserve"> </w:t>
+      </w:r>
+      <w:r>
+        <w:t xml:space="preserve">mínimas en los datos de entrada que no alteran la predicción del modelo. Se</w:t>
+      </w:r>
+      <w:r>
+        <w:t xml:space="preserve"> </w:t>
+      </w:r>
+      <w:r>
+        <w:t xml:space="preserve">formaliza comúnmente mediante la Estabilidad de Entrada Relativa (</w:t>
+      </w:r>
+      <m:oMath>
+        <m:r>
+          <m:t>R</m:t>
+        </m:r>
+        <m:r>
+          <m:t>I</m:t>
+        </m:r>
+        <m:r>
+          <m:t>S</m:t>
+        </m:r>
+      </m:oMath>
+      <w:r>
+        <w:t xml:space="preserve">), que</w:t>
+      </w:r>
+      <w:r>
+        <w:t xml:space="preserve"> </w:t>
+      </w:r>
+      <w:r>
+        <w:t xml:space="preserve">estima la sensibilidad del explicador ante perturbaciones en el vecindario de</w:t>
+      </w:r>
+      <w:r>
+        <w:t xml:space="preserve"> </w:t>
+      </w:r>
+      <m:oMath>
+        <m:r>
+          <m:t>x</m:t>
+        </m:r>
+      </m:oMath>
+      <w:r>
+        <w:t xml:space="preserve"> </w:t>
+      </w:r>
+      <w:r>
+        <w:t xml:space="preserve">(Agarwal et al. 2022)</w:t>
+      </w:r>
+      <w:r>
+        <w:t xml:space="preserve">:</w:t>
+      </w:r>
+    </w:p>
+    <w:p>
+      <w:pPr>
+        <w:pStyle w:val="Textoindependiente"/>
+      </w:pPr>
+      <m:oMathPara>
+        <m:oMathParaPr>
+          <m:jc m:val="center"/>
+        </m:oMathParaPr>
+        <m:oMath>
+          <m:r>
+            <m:t>R</m:t>
+          </m:r>
+          <m:r>
+            <m:t>I</m:t>
+          </m:r>
+          <m:r>
+            <m:t>S</m:t>
+          </m:r>
+          <m:r>
+            <m:rPr>
+              <m:sty m:val="p"/>
+            </m:rPr>
+            <m:t>=</m:t>
+          </m:r>
+          <m:limLow>
+            <m:e>
+              <m:r>
+                <m:rPr>
+                  <m:sty m:val="p"/>
+                </m:rPr>
+                <m:t>max</m:t>
+              </m:r>
+            </m:e>
+            <m:lim>
+              <m:sSup>
+                <m:e>
+                  <m:r>
+                    <m:t>x</m:t>
+                  </m:r>
+                </m:e>
+                <m:sup>
+                  <m:r>
+                    <m:rPr>
+                      <m:sty m:val="p"/>
+                    </m:rPr>
+                    <m:t>′</m:t>
+                  </m:r>
+                </m:sup>
+              </m:sSup>
+            </m:lim>
+          </m:limLow>
+          <m:f>
+            <m:fPr>
+              <m:type m:val="bar"/>
+            </m:fPr>
+            <m:num>
+              <m:r>
+                <m:rPr>
+                  <m:sty m:val="p"/>
+                </m:rPr>
+                <m:t>|</m:t>
+              </m:r>
+              <m:r>
+                <m:rPr>
+                  <m:sty m:val="p"/>
+                </m:rPr>
+                <m:t>|</m:t>
+              </m:r>
+              <m:r>
+                <m:t>e</m:t>
+              </m:r>
+              <m:r>
+                <m:t>x</m:t>
+              </m:r>
+              <m:r>
+                <m:rPr>
+                  <m:sty m:val="p"/>
+                </m:rPr>
+                <m:t>(</m:t>
+              </m:r>
+              <m:r>
+                <m:t>x</m:t>
+              </m:r>
+              <m:r>
+                <m:rPr>
+                  <m:sty m:val="p"/>
+                </m:rPr>
+                <m:t>)</m:t>
+              </m:r>
+              <m:r>
+                <m:rPr>
+                  <m:sty m:val="p"/>
+                </m:rPr>
+                <m:t>−</m:t>
+              </m:r>
+              <m:r>
+                <m:t>e</m:t>
+              </m:r>
+              <m:r>
+                <m:t>x</m:t>
+              </m:r>
+              <m:r>
+                <m:rPr>
+                  <m:sty m:val="p"/>
+                </m:rPr>
+                <m:t>(</m:t>
+              </m:r>
+              <m:sSup>
+                <m:e>
+                  <m:r>
+                    <m:t>x</m:t>
+                  </m:r>
+                </m:e>
+                <m:sup>
+                  <m:r>
+                    <m:rPr>
+                      <m:sty m:val="p"/>
+                    </m:rPr>
+                    <m:t>′</m:t>
+                  </m:r>
+                </m:sup>
+              </m:sSup>
+              <m:r>
+                <m:rPr>
+                  <m:sty m:val="p"/>
+                </m:rPr>
+                <m:t>)</m:t>
+              </m:r>
+              <m:r>
+                <m:rPr>
+                  <m:sty m:val="p"/>
+                </m:rPr>
+                <m:t>|</m:t>
+              </m:r>
+              <m:r>
+                <m:rPr>
+                  <m:sty m:val="p"/>
+                </m:rPr>
+                <m:t>|</m:t>
+              </m:r>
+            </m:num>
+            <m:den>
+              <m:r>
+                <m:rPr>
+                  <m:sty m:val="p"/>
+                </m:rPr>
+                <m:t>|</m:t>
+              </m:r>
+              <m:r>
+                <m:rPr>
+                  <m:sty m:val="p"/>
+                </m:rPr>
+                <m:t>|</m:t>
+              </m:r>
+              <m:r>
+                <m:t>x</m:t>
+              </m:r>
+              <m:r>
+                <m:rPr>
+                  <m:sty m:val="p"/>
+                </m:rPr>
+                <m:t>−</m:t>
+              </m:r>
+              <m:sSup>
+                <m:e>
+                  <m:r>
+                    <m:t>x</m:t>
+                  </m:r>
+                </m:e>
+                <m:sup>
+                  <m:r>
+                    <m:rPr>
+                      <m:sty m:val="p"/>
+                    </m:rPr>
+                    <m:t>′</m:t>
+                  </m:r>
+                </m:sup>
+              </m:sSup>
+              <m:r>
+                <m:rPr>
+                  <m:sty m:val="p"/>
+                </m:rPr>
+                <m:t>|</m:t>
+              </m:r>
+              <m:r>
+                <m:rPr>
+                  <m:sty m:val="p"/>
+                </m:rPr>
+                <m:t>|</m:t>
+              </m:r>
+            </m:den>
+          </m:f>
+        </m:oMath>
+      </m:oMathPara>
+    </w:p>
+    <w:p>
+      <w:pPr>
+        <w:pStyle w:val="FirstParagraph"/>
+      </w:pPr>
+      <w:r>
+        <w:t xml:space="preserve">Donde</w:t>
+      </w:r>
+      <w:r>
+        <w:t xml:space="preserve"> </w:t>
+      </w:r>
+      <m:oMath>
+        <m:r>
+          <m:t>e</m:t>
+        </m:r>
+        <m:r>
+          <m:t>x</m:t>
+        </m:r>
+        <m:r>
+          <m:rPr>
+            <m:sty m:val="p"/>
+          </m:rPr>
+          <m:t>(</m:t>
+        </m:r>
+        <m:r>
+          <m:t>x</m:t>
+        </m:r>
+        <m:r>
+          <m:rPr>
+            <m:sty m:val="p"/>
+          </m:rPr>
+          <m:t>)</m:t>
+        </m:r>
+      </m:oMath>
+      <w:r>
+        <w:t xml:space="preserve"> </w:t>
+      </w:r>
+      <w:r>
+        <w:t xml:space="preserve">es la importancia de características generada para la instancia</w:t>
+      </w:r>
+      <w:r>
+        <w:t xml:space="preserve"> </w:t>
+      </w:r>
+      <m:oMath>
+        <m:r>
+          <m:t>x</m:t>
+        </m:r>
+      </m:oMath>
+      <w:r>
+        <w:t xml:space="preserve">. Una</w:t>
+      </w:r>
+      <w:r>
+        <w:t xml:space="preserve"> </w:t>
+      </w:r>
+      <m:oMath>
+        <m:r>
+          <m:t>R</m:t>
+        </m:r>
+        <m:r>
+          <m:t>I</m:t>
+        </m:r>
+        <m:r>
+          <m:t>S</m:t>
+        </m:r>
+      </m:oMath>
+      <w:r>
+        <w:t xml:space="preserve"> </w:t>
+      </w:r>
+      <w:r>
+        <w:t xml:space="preserve">elevada señala una fragilidad técnica, indicando que cambios</w:t>
+      </w:r>
+      <w:r>
+        <w:t xml:space="preserve"> </w:t>
+      </w:r>
+      <w:r>
+        <w:t xml:space="preserve">imperceptibles en los datos pueden generar interpretaciones contradictorias.</w:t>
       </w:r>
     </w:p>
     <w:bookmarkEnd w:id="48"/>
-    <w:bookmarkStart w:id="49" w:name="anchors"/>
+    <w:bookmarkStart w:id="49" w:name="robustez"/>
     <w:p>
       <w:pPr>
         <w:pStyle w:val="Ttulo3"/>
       </w:pPr>
       <w:r>
-        <w:t xml:space="preserve">3.3.3 Anchors</w:t>
+        <w:t xml:space="preserve">3.4.3 Robustez</w:t>
+      </w:r>
+    </w:p>
+    <w:p>
+      <w:pPr>
+        <w:pStyle w:val="FirstParagraph"/>
+      </w:pPr>
+      <w:r>
+        <w:t xml:space="preserve">A diferencia de la estabilidad, la robustez se enfoca en la resistencia del</w:t>
+      </w:r>
+      <w:r>
+        <w:t xml:space="preserve"> </w:t>
+      </w:r>
+      <w:r>
+        <w:t xml:space="preserve">explicador ante ataques adversarios o cambios significativos en la distribución.</w:t>
+      </w:r>
+      <w:r>
+        <w:t xml:space="preserve"> </w:t>
+      </w:r>
+      <w:r>
+        <w:t xml:space="preserve">Como identifica</w:t>
+      </w:r>
+      <w:r>
+        <w:t xml:space="preserve"> </w:t>
+      </w:r>
+      <w:r>
+        <w:t xml:space="preserve">Zheng et al. (2025)</w:t>
+      </w:r>
+      <w:r>
+        <w:t xml:space="preserve">, muchas métricas tradicionales fallan al operar con</w:t>
+      </w:r>
+      <w:r>
+        <w:t xml:space="preserve"> </w:t>
+      </w:r>
+      <w:r>
+        <w:t xml:space="preserve">datos</w:t>
+      </w:r>
+      <w:r>
+        <w:t xml:space="preserve"> </w:t>
+      </w:r>
+      <w:r>
+        <w:t xml:space="preserve">“fuera de la distribución”</w:t>
+      </w:r>
+      <w:r>
+        <w:t xml:space="preserve"> </w:t>
+      </w:r>
+      <w:r>
+        <w:t xml:space="preserve">(OOD), por lo que la robustez técnica implica</w:t>
+      </w:r>
+      <w:r>
+        <w:t xml:space="preserve"> </w:t>
+      </w:r>
+      <w:r>
+        <w:t xml:space="preserve">garantizar que el explicador mantenga su validez incluso cuando el modelo</w:t>
+      </w:r>
+      <w:r>
+        <w:t xml:space="preserve"> </w:t>
+      </w:r>
+      <w:r>
+        <w:t xml:space="preserve">enfrenta instancias atípicas.</w:t>
       </w:r>
     </w:p>
     <w:bookmarkEnd w:id="49"/>
-    <w:bookmarkStart w:id="50" w:name="pdp-ice-y-variantes"/>
+    <w:bookmarkStart w:id="50" w:name="sparsity-complejidad"/>
     <w:p>
       <w:pPr>
         <w:pStyle w:val="Ttulo3"/>
       </w:pPr>
       <w:r>
-        <w:t xml:space="preserve">3.3.4 PDP, ICE y variantes</w:t>
+        <w:t xml:space="preserve">3.4.4 Sparsity / complejidad</w:t>
+      </w:r>
+    </w:p>
+    <w:p>
+      <w:pPr>
+        <w:pStyle w:val="FirstParagraph"/>
+      </w:pPr>
+      <w:r>
+        <w:t xml:space="preserve">La complejidad de una explicación debe estar alineada con las capacidades</w:t>
+      </w:r>
+      <w:r>
+        <w:t xml:space="preserve"> </w:t>
+      </w:r>
+      <w:r>
+        <w:t xml:space="preserve">cognitivas humanas.</w:t>
+      </w:r>
+      <w:r>
+        <w:t xml:space="preserve"> </w:t>
+      </w:r>
+      <w:r>
+        <w:t xml:space="preserve">Canha et al. (2025)</w:t>
+      </w:r>
+      <w:r>
+        <w:t xml:space="preserve"> </w:t>
+      </w:r>
+      <w:r>
+        <w:t xml:space="preserve">recurre a la</w:t>
+      </w:r>
+      <w:r>
+        <w:t xml:space="preserve"> </w:t>
+      </w:r>
+      <w:r>
+        <w:t xml:space="preserve">“Ley de Miller”</w:t>
+      </w:r>
+      <w:r>
+        <w:t xml:space="preserve"> </w:t>
+      </w:r>
+      <w:r>
+        <w:t xml:space="preserve">para fundamentar este</w:t>
+      </w:r>
+      <w:r>
+        <w:t xml:space="preserve"> </w:t>
+      </w:r>
+      <w:r>
+        <w:t xml:space="preserve">criterio, sugiriendo que el tamaño óptimo de una explicación informativa debe</w:t>
+      </w:r>
+      <w:r>
+        <w:t xml:space="preserve"> </w:t>
+      </w:r>
+      <w:r>
+        <w:t xml:space="preserve">mantenerse en un rango de</w:t>
+      </w:r>
+      <w:r>
+        <w:t xml:space="preserve"> </w:t>
+      </w:r>
+      <m:oMath>
+        <m:r>
+          <m:t>7</m:t>
+        </m:r>
+        <m:r>
+          <m:rPr>
+            <m:sty m:val="p"/>
+          </m:rPr>
+          <m:t>±</m:t>
+        </m:r>
+        <m:r>
+          <m:t>2</m:t>
+        </m:r>
+      </m:oMath>
+      <w:r>
+        <w:t xml:space="preserve"> </w:t>
+      </w:r>
+      <w:r>
+        <w:t xml:space="preserve">elementos resaltados. Una explicación con</w:t>
+      </w:r>
+      <w:r>
+        <w:t xml:space="preserve"> </w:t>
+      </w:r>
+      <w:r>
+        <w:t xml:space="preserve">baja cardinalidad (alta</w:t>
+      </w:r>
+      <w:r>
+        <w:t xml:space="preserve"> </w:t>
+      </w:r>
+      <w:r>
+        <w:t xml:space="preserve">) es preferible para reducir la carga</w:t>
+      </w:r>
+      <w:r>
+        <w:t xml:space="preserve"> </w:t>
+      </w:r>
+      <w:r>
+        <w:t xml:space="preserve">cognitiva sin sacrificar la información crítica.</w:t>
       </w:r>
     </w:p>
     <w:bookmarkEnd w:id="50"/>
+    <w:bookmarkStart w:id="51" w:name="coste-computacional"/>
+    <w:p>
+      <w:pPr>
+        <w:pStyle w:val="Ttulo3"/>
+      </w:pPr>
+      <w:r>
+        <w:t xml:space="preserve">3.4.5 Coste computacional</w:t>
+      </w:r>
+    </w:p>
+    <w:p>
+      <w:pPr>
+        <w:pStyle w:val="FirstParagraph"/>
+      </w:pPr>
+      <w:r>
+        <w:t xml:space="preserve">La eficiencia computacional es un criterio pragmático indispensable. Existe una</w:t>
+      </w:r>
+      <w:r>
+        <w:t xml:space="preserve"> </w:t>
+      </w:r>
+      <w:r>
+        <w:t xml:space="preserve">compensación (</w:t>
+      </w:r>
+      <w:r>
+        <w:t xml:space="preserve">) intrínseca entre la fidelidad de métodos como</w:t>
+      </w:r>
+      <w:r>
+        <w:t xml:space="preserve"> </w:t>
+      </w:r>
+      <w:r>
+        <w:t xml:space="preserve">KernelSHAP —que requieren miles de evaluaciones del modelo— y la rapidez de</w:t>
+      </w:r>
+      <w:r>
+        <w:t xml:space="preserve"> </w:t>
+      </w:r>
+      <w:r>
+        <w:t xml:space="preserve">aproximaciones lineales como LIME. Este estudio adopta métricas de latencia de</w:t>
+      </w:r>
+      <w:r>
+        <w:t xml:space="preserve"> </w:t>
+      </w:r>
+      <w:r>
+        <w:t xml:space="preserve">inferencia para valorar la viabilidad del despliegue bajo demanda.</w:t>
+      </w:r>
+    </w:p>
     <w:bookmarkEnd w:id="51"/>
-    <w:bookmarkStart w:id="58" w:name="criterios-de-evaluación-de-explicaciones"/>
+    <w:bookmarkStart w:id="52" w:name="Xe00b4760c98b12ecb7c034848753f29957e3d9e"/>
+    <w:p>
+      <w:pPr>
+        <w:pStyle w:val="Ttulo3"/>
+      </w:pPr>
+      <w:r>
+        <w:t xml:space="preserve">3.4.6 Alineación causal y sensibilidad contrafactual</w:t>
+      </w:r>
+    </w:p>
+    <w:p>
+      <w:pPr>
+        <w:pStyle w:val="FirstParagraph"/>
+      </w:pPr>
+      <w:r>
+        <w:t xml:space="preserve">Finalmente, se introduce la alineación causal, que evalúa si las características</w:t>
+      </w:r>
+      <w:r>
+        <w:t xml:space="preserve"> </w:t>
+      </w:r>
+      <w:r>
+        <w:t xml:space="preserve">identificadas corresponden a relaciones lógicas reales en el dominio de</w:t>
+      </w:r>
+      <w:r>
+        <w:t xml:space="preserve"> </w:t>
+      </w:r>
+      <w:r>
+        <w:t xml:space="preserve">aplicación. Este criterio se complementa con la sensibilidad contrafactual, que</w:t>
+      </w:r>
+      <w:r>
+        <w:t xml:space="preserve"> </w:t>
+      </w:r>
+      <w:r>
+        <w:t xml:space="preserve">responde a cambios mínimos necesarios para invertir la decisión del modelo,</w:t>
+      </w:r>
+      <w:r>
+        <w:t xml:space="preserve"> </w:t>
+      </w:r>
+      <w:r>
+        <w:t xml:space="preserve">proporcionando una validación semántica que trasciende la métrica puramente</w:t>
+      </w:r>
+      <w:r>
+        <w:t xml:space="preserve"> </w:t>
+      </w:r>
+      <w:r>
+        <w:t xml:space="preserve">matemática</w:t>
+      </w:r>
+      <w:r>
+        <w:t xml:space="preserve"> </w:t>
+      </w:r>
+      <w:r>
+        <w:t xml:space="preserve">(Bhattacharya and Verbert 2024;</w:t>
+      </w:r>
+      <w:r>
+        <w:t xml:space="preserve"> </w:t>
+      </w:r>
+      <w:r>
+        <w:t xml:space="preserve">Reif et al.</w:t>
+      </w:r>
+      <w:r>
+        <w:t xml:space="preserve"> </w:t>
+      </w:r>
+      <w:r>
+        <w:t xml:space="preserve">2024)</w:t>
+      </w:r>
+      <w:r>
+        <w:t xml:space="preserve">.</w:t>
+      </w:r>
+    </w:p>
+    <w:bookmarkEnd w:id="52"/>
+    <w:bookmarkEnd w:id="53"/>
+    <w:bookmarkEnd w:id="54"/>
+    <w:bookmarkStart w:id="64" w:name="marco-empírico-diseño-experimental"/>
+    <w:p>
+      <w:pPr>
+        <w:pStyle w:val="Ttulo1"/>
+      </w:pPr>
+      <w:r>
+        <w:t xml:space="preserve">4. Marco empírico / Diseño experimental</w:t>
+      </w:r>
+    </w:p>
+    <w:bookmarkStart w:id="55" w:name="objetivo-del-capítulo-experimental"/>
     <w:p>
       <w:pPr>
         <w:pStyle w:val="Ttulo2"/>
       </w:pPr>
       <w:r>
-        <w:t xml:space="preserve">3.4 Criterios de evaluación de explicaciones</w:t>
-      </w:r>
-    </w:p>
-    <w:bookmarkStart w:id="52" w:name="fidelidad"/>
-    <w:p>
-      <w:pPr>
-        <w:pStyle w:val="Ttulo3"/>
-      </w:pPr>
-      <w:r>
-        <w:t xml:space="preserve">3.4.1 Fidelidad</w:t>
-      </w:r>
-    </w:p>
-    <w:bookmarkEnd w:id="52"/>
-    <w:bookmarkStart w:id="53" w:name="estabilidad"/>
-    <w:p>
-      <w:pPr>
-        <w:pStyle w:val="Ttulo3"/>
-      </w:pPr>
-      <w:r>
-        <w:t xml:space="preserve">3.4.2 Estabilidad</w:t>
-      </w:r>
-    </w:p>
-    <w:bookmarkEnd w:id="53"/>
-    <w:bookmarkStart w:id="54" w:name="robustez"/>
-    <w:p>
-      <w:pPr>
-        <w:pStyle w:val="Ttulo3"/>
-      </w:pPr>
-      <w:r>
-        <w:t xml:space="preserve">3.4.3 Robustez</w:t>
-      </w:r>
-    </w:p>
-    <w:bookmarkEnd w:id="54"/>
-    <w:bookmarkStart w:id="55" w:name="sparsity-complejidad"/>
-    <w:p>
-      <w:pPr>
-        <w:pStyle w:val="Ttulo3"/>
-      </w:pPr>
-      <w:r>
-        <w:t xml:space="preserve">3.4.4 Sparsity / complejidad</w:t>
+        <w:t xml:space="preserve">4.1 Objetivo del capítulo experimental</w:t>
       </w:r>
     </w:p>
     <w:bookmarkEnd w:id="55"/>
-    <w:bookmarkStart w:id="56" w:name="coste-computacional"/>
-    <w:p>
-      <w:pPr>
-        <w:pStyle w:val="Ttulo3"/>
-      </w:pPr>
-      <w:r>
-        <w:t xml:space="preserve">3.4.5 Coste computacional</w:t>
+    <w:bookmarkStart w:id="56" w:name="hipótesis-experimentales"/>
+    <w:p>
+      <w:pPr>
+        <w:pStyle w:val="Ttulo2"/>
+      </w:pPr>
+      <w:r>
+        <w:t xml:space="preserve">4.2 Hipótesis experimentales</w:t>
       </w:r>
     </w:p>
     <w:bookmarkEnd w:id="56"/>
-    <w:bookmarkStart w:id="57" w:name="Xe00b4760c98b12ecb7c034848753f29957e3d9e"/>
-    <w:p>
-      <w:pPr>
-        <w:pStyle w:val="Ttulo3"/>
-      </w:pPr>
-      <w:r>
-        <w:t xml:space="preserve">3.4.6 Alineación causal y sensibilidad contrafactual</w:t>
+    <w:bookmarkStart w:id="57" w:name="diseño-experimental-general"/>
+    <w:p>
+      <w:pPr>
+        <w:pStyle w:val="Ttulo2"/>
+      </w:pPr>
+      <w:r>
+        <w:t xml:space="preserve">4.3 Diseño experimental general</w:t>
       </w:r>
     </w:p>
     <w:bookmarkEnd w:id="57"/>
+    <w:bookmarkStart w:id="58" w:name="X8edbf47208baff98da63be58a181e5d7f410698"/>
+    <w:p>
+      <w:pPr>
+        <w:pStyle w:val="Ttulo2"/>
+      </w:pPr>
+      <w:r>
+        <w:t xml:space="preserve">4.4 Experimento 1: Benchmark de métodos existentes</w:t>
+      </w:r>
+    </w:p>
     <w:bookmarkEnd w:id="58"/>
-    <w:bookmarkStart w:id="59" w:name="X9fc5fae168faea1b2f8df51871a78d05754a5e0"/>
+    <w:bookmarkStart w:id="59" w:name="Xbf0bda34eabb7f2d088db8ffb41b08cd1fc7f75"/>
     <w:p>
       <w:pPr>
         <w:pStyle w:val="Ttulo2"/>
       </w:pPr>
       <w:r>
-        <w:t xml:space="preserve">3.5 XAI en visión, texto, tabular y series temporales</w:t>
+        <w:t xml:space="preserve">4.5 Experimento 2: Framework híbrido propuesto</w:t>
       </w:r>
     </w:p>
     <w:bookmarkEnd w:id="59"/>
-    <w:bookmarkStart w:id="60" w:name="Xb1cf452f9e61f43b37c07a01df8958c8b40c6de"/>
+    <w:bookmarkStart w:id="60" w:name="experimento-3-escalabilidad-y-robustez"/>
     <w:p>
       <w:pPr>
         <w:pStyle w:val="Ttulo2"/>
       </w:pPr>
       <w:r>
-        <w:t xml:space="preserve">3.6 Confianza, utilidad y evaluación centrada en el usuario</w:t>
+        <w:t xml:space="preserve">4.6 Experimento 3: Escalabilidad y robustez</w:t>
       </w:r>
     </w:p>
     <w:bookmarkEnd w:id="60"/>
-    <w:bookmarkStart w:id="61" w:name="X38e1e5a4f4497c96b51494d2bf5c789e0d8d04e"/>
+    <w:bookmarkStart w:id="61" w:name="Xaa5d2c7a92c8fbc5443e28c5396c68c73b7d17a"/>
     <w:p>
       <w:pPr>
         <w:pStyle w:val="Ttulo2"/>
       </w:pPr>
       <w:r>
-        <w:t xml:space="preserve">3.7 Bases conceptuales del framework híbrido propuesto</w:t>
+        <w:t xml:space="preserve">4.7 Experimento 4: Evaluación centrada en el usuario</w:t>
       </w:r>
     </w:p>
     <w:bookmarkEnd w:id="61"/>
+    <w:bookmarkStart w:id="62" w:name="procedimientos-de-análisis-estadístico"/>
+    <w:p>
+      <w:pPr>
+        <w:pStyle w:val="Ttulo2"/>
+      </w:pPr>
+      <w:r>
+        <w:t xml:space="preserve">4.8 Procedimientos de análisis estadístico</w:t>
+      </w:r>
+    </w:p>
     <w:bookmarkEnd w:id="62"/>
-    <w:bookmarkStart w:id="72" w:name="marco-empírico-diseño-experimental"/>
+    <w:bookmarkStart w:id="63" w:name="X9deb2518c603589de74d1eefed962ee0d6b1c76"/>
+    <w:p>
+      <w:pPr>
+        <w:pStyle w:val="Ttulo2"/>
+      </w:pPr>
+      <w:r>
+        <w:t xml:space="preserve">4.9 Consideraciones de validez, reproducibilidad y amenazas</w:t>
+      </w:r>
+    </w:p>
+    <w:bookmarkEnd w:id="63"/>
+    <w:bookmarkEnd w:id="64"/>
+    <w:bookmarkStart w:id="70" w:name="resultados-y-discusión"/>
     <w:p>
       <w:pPr>
         <w:pStyle w:val="Ttulo1"/>
       </w:pPr>
       <w:r>
-        <w:t xml:space="preserve">4. Marco empírico / Diseño experimental</w:t>
-      </w:r>
-    </w:p>
-    <w:bookmarkStart w:id="63" w:name="objetivo-del-capítulo-experimental"/>
+        <w:t xml:space="preserve">5. Resultados y discusión</w:t>
+      </w:r>
+    </w:p>
+    <w:bookmarkStart w:id="65" w:name="resultados-del-benchmark"/>
     <w:p>
       <w:pPr>
         <w:pStyle w:val="Ttulo2"/>
       </w:pPr>
       <w:r>
-        <w:t xml:space="preserve">4.1 Objetivo del capítulo experimental</w:t>
-      </w:r>
-    </w:p>
-    <w:bookmarkEnd w:id="63"/>
-    <w:bookmarkStart w:id="64" w:name="hipótesis-experimentales"/>
+        <w:t xml:space="preserve">5.1 Resultados del benchmark</w:t>
+      </w:r>
+    </w:p>
+    <w:bookmarkEnd w:id="65"/>
+    <w:bookmarkStart w:id="66" w:name="resultados-del-framework-híbrido"/>
     <w:p>
       <w:pPr>
         <w:pStyle w:val="Ttulo2"/>
       </w:pPr>
       <w:r>
-        <w:t xml:space="preserve">4.2 Hipótesis experimentales</w:t>
-      </w:r>
-    </w:p>
-    <w:bookmarkEnd w:id="64"/>
-    <w:bookmarkStart w:id="65" w:name="diseño-experimental-general"/>
+        <w:t xml:space="preserve">5.2 Resultados del framework híbrido</w:t>
+      </w:r>
+    </w:p>
+    <w:bookmarkEnd w:id="66"/>
+    <w:bookmarkStart w:id="67" w:name="resultados-de-escalabilidad-y-robustez"/>
     <w:p>
       <w:pPr>
         <w:pStyle w:val="Ttulo2"/>
       </w:pPr>
       <w:r>
-        <w:t xml:space="preserve">4.3 Diseño experimental general</w:t>
-      </w:r>
-    </w:p>
-    <w:bookmarkEnd w:id="65"/>
-    <w:bookmarkStart w:id="66" w:name="X8edbf47208baff98da63be58a181e5d7f410698"/>
+        <w:t xml:space="preserve">5.3 Resultados de escalabilidad y robustez</w:t>
+      </w:r>
+    </w:p>
+    <w:bookmarkEnd w:id="67"/>
+    <w:bookmarkStart w:id="68" w:name="resultados-del-estudio-con-usuarios"/>
     <w:p>
       <w:pPr>
         <w:pStyle w:val="Ttulo2"/>
       </w:pPr>
       <w:r>
-        <w:t xml:space="preserve">4.4 Experimento 1: Benchmark de métodos existentes</w:t>
-      </w:r>
-    </w:p>
-    <w:bookmarkEnd w:id="66"/>
-    <w:bookmarkStart w:id="67" w:name="Xbf0bda34eabb7f2d088db8ffb41b08cd1fc7f75"/>
+        <w:t xml:space="preserve">5.4 Resultados del estudio con usuarios</w:t>
+      </w:r>
+    </w:p>
+    <w:bookmarkEnd w:id="68"/>
+    <w:bookmarkStart w:id="69" w:name="discusión-integrada"/>
     <w:p>
       <w:pPr>
         <w:pStyle w:val="Ttulo2"/>
       </w:pPr>
       <w:r>
-        <w:t xml:space="preserve">4.5 Experimento 2: Framework híbrido propuesto</w:t>
-      </w:r>
-    </w:p>
-    <w:bookmarkEnd w:id="67"/>
-    <w:bookmarkStart w:id="68" w:name="experimento-3-escalabilidad-y-robustez"/>
+        <w:t xml:space="preserve">5.5 Discusión integrada</w:t>
+      </w:r>
+    </w:p>
+    <w:bookmarkEnd w:id="69"/>
+    <w:bookmarkEnd w:id="70"/>
+    <w:bookmarkStart w:id="77" w:name="conclusiones"/>
+    <w:p>
+      <w:pPr>
+        <w:pStyle w:val="Ttulo1"/>
+      </w:pPr>
+      <w:r>
+        <w:t xml:space="preserve">6. Conclusiones</w:t>
+      </w:r>
+    </w:p>
+    <w:bookmarkStart w:id="71" w:name="hallazgos-principales"/>
     <w:p>
       <w:pPr>
         <w:pStyle w:val="Ttulo2"/>
       </w:pPr>
       <w:r>
-        <w:t xml:space="preserve">4.6 Experimento 3: Escalabilidad y robustez</w:t>
-      </w:r>
-    </w:p>
-    <w:bookmarkEnd w:id="68"/>
-    <w:bookmarkStart w:id="69" w:name="Xaa5d2c7a92c8fbc5443e28c5396c68c73b7d17a"/>
+        <w:t xml:space="preserve">6.1 Hallazgos principales</w:t>
+      </w:r>
+    </w:p>
+    <w:bookmarkEnd w:id="71"/>
+    <w:bookmarkStart w:id="72" w:name="contribuciones-teóricas"/>
     <w:p>
       <w:pPr>
         <w:pStyle w:val="Ttulo2"/>
       </w:pPr>
       <w:r>
-        <w:t xml:space="preserve">4.7 Experimento 4: Evaluación centrada en el usuario</w:t>
-      </w:r>
-    </w:p>
-    <w:bookmarkEnd w:id="69"/>
-    <w:bookmarkStart w:id="70" w:name="procedimientos-de-análisis-estadístico"/>
+        <w:t xml:space="preserve">6.2 Contribuciones teóricas</w:t>
+      </w:r>
+    </w:p>
+    <w:bookmarkEnd w:id="72"/>
+    <w:bookmarkStart w:id="73" w:name="contribuciones-metodológicas"/>
     <w:p>
       <w:pPr>
         <w:pStyle w:val="Ttulo2"/>
       </w:pPr>
       <w:r>
-        <w:t xml:space="preserve">4.8 Procedimientos de análisis estadístico</w:t>
-      </w:r>
-    </w:p>
-    <w:bookmarkEnd w:id="70"/>
-    <w:bookmarkStart w:id="71" w:name="X9deb2518c603589de74d1eefed962ee0d6b1c76"/>
+        <w:t xml:space="preserve">6.3 Contribuciones metodológicas</w:t>
+      </w:r>
+    </w:p>
+    <w:bookmarkEnd w:id="73"/>
+    <w:bookmarkStart w:id="74" w:name="contribuciones-aplicadas"/>
     <w:p>
       <w:pPr>
         <w:pStyle w:val="Ttulo2"/>
       </w:pPr>
       <w:r>
-        <w:t xml:space="preserve">4.9 Consideraciones de validez, reproducibilidad y amenazas</w:t>
-      </w:r>
-    </w:p>
-    <w:bookmarkEnd w:id="71"/>
-    <w:bookmarkEnd w:id="72"/>
-    <w:bookmarkStart w:id="78" w:name="resultados-y-discusión"/>
+        <w:t xml:space="preserve">6.4 Contribuciones aplicadas</w:t>
+      </w:r>
+    </w:p>
+    <w:bookmarkEnd w:id="74"/>
+    <w:bookmarkStart w:id="75" w:name="limitaciones-del-estudio"/>
+    <w:p>
+      <w:pPr>
+        <w:pStyle w:val="Ttulo2"/>
+      </w:pPr>
+      <w:r>
+        <w:t xml:space="preserve">6.5 Limitaciones del estudio</w:t>
+      </w:r>
+    </w:p>
+    <w:bookmarkEnd w:id="75"/>
+    <w:bookmarkStart w:id="76" w:name="prospectiva-líneas-futuras"/>
+    <w:p>
+      <w:pPr>
+        <w:pStyle w:val="Ttulo2"/>
+      </w:pPr>
+      <w:r>
+        <w:t xml:space="preserve">6.6 Prospectiva / líneas futuras</w:t>
+      </w:r>
+    </w:p>
+    <w:bookmarkEnd w:id="76"/>
+    <w:bookmarkEnd w:id="77"/>
+    <w:bookmarkStart w:id="99" w:name="referencias"/>
     <w:p>
       <w:pPr>
         <w:pStyle w:val="Ttulo1"/>
       </w:pPr>
       <w:r>
-        <w:t xml:space="preserve">5. Resultados y discusión</w:t>
-      </w:r>
-    </w:p>
-    <w:bookmarkStart w:id="73" w:name="resultados-del-benchmark"/>
-    <w:p>
-      <w:pPr>
-        <w:pStyle w:val="Ttulo2"/>
-      </w:pPr>
-      <w:r>
-        <w:t xml:space="preserve">5.1 Resultados del benchmark</w:t>
-      </w:r>
-    </w:p>
-    <w:bookmarkEnd w:id="73"/>
-    <w:bookmarkStart w:id="74" w:name="resultados-del-framework-híbrido"/>
-    <w:p>
-      <w:pPr>
-        <w:pStyle w:val="Ttulo2"/>
-      </w:pPr>
-      <w:r>
-        <w:t xml:space="preserve">5.2 Resultados del framework híbrido</w:t>
-      </w:r>
-    </w:p>
-    <w:bookmarkEnd w:id="74"/>
-    <w:bookmarkStart w:id="75" w:name="resultados-de-escalabilidad-y-robustez"/>
-    <w:p>
-      <w:pPr>
-        <w:pStyle w:val="Ttulo2"/>
-      </w:pPr>
-      <w:r>
-        <w:t xml:space="preserve">5.3 Resultados de escalabilidad y robustez</w:t>
-      </w:r>
-    </w:p>
-    <w:bookmarkEnd w:id="75"/>
-    <w:bookmarkStart w:id="76" w:name="resultados-del-estudio-con-usuarios"/>
-    <w:p>
-      <w:pPr>
-        <w:pStyle w:val="Ttulo2"/>
-      </w:pPr>
-      <w:r>
-        <w:t xml:space="preserve">5.4 Resultados del estudio con usuarios</w:t>
-      </w:r>
-    </w:p>
-    <w:bookmarkEnd w:id="76"/>
-    <w:bookmarkStart w:id="77" w:name="discusión-integrada"/>
-    <w:p>
-      <w:pPr>
-        <w:pStyle w:val="Ttulo2"/>
-      </w:pPr>
-      <w:r>
-        <w:t xml:space="preserve">5.5 Discusión integrada</w:t>
-      </w:r>
-    </w:p>
-    <w:bookmarkEnd w:id="77"/>
-    <w:bookmarkEnd w:id="78"/>
-    <w:bookmarkStart w:id="85" w:name="conclusiones"/>
-    <w:p>
-      <w:pPr>
-        <w:pStyle w:val="Ttulo1"/>
-      </w:pPr>
-      <w:r>
-        <w:t xml:space="preserve">6. Conclusiones</w:t>
-      </w:r>
-    </w:p>
-    <w:bookmarkStart w:id="79" w:name="hallazgos-principales"/>
-    <w:p>
-      <w:pPr>
-        <w:pStyle w:val="Ttulo2"/>
-      </w:pPr>
-      <w:r>
-        <w:t xml:space="preserve">6.1 Hallazgos principales</w:t>
-      </w:r>
-    </w:p>
-    <w:bookmarkEnd w:id="79"/>
-    <w:bookmarkStart w:id="80" w:name="contribuciones-teóricas"/>
-    <w:p>
-      <w:pPr>
-        <w:pStyle w:val="Ttulo2"/>
-      </w:pPr>
-      <w:r>
-        <w:t xml:space="preserve">6.2 Contribuciones teóricas</w:t>
-      </w:r>
-    </w:p>
-    <w:bookmarkEnd w:id="80"/>
-    <w:bookmarkStart w:id="81" w:name="contribuciones-metodológicas"/>
-    <w:p>
-      <w:pPr>
-        <w:pStyle w:val="Ttulo2"/>
-      </w:pPr>
-      <w:r>
-        <w:t xml:space="preserve">6.3 Contribuciones metodológicas</w:t>
-      </w:r>
-    </w:p>
-    <w:bookmarkEnd w:id="81"/>
-    <w:bookmarkStart w:id="82" w:name="contribuciones-aplicadas"/>
-    <w:p>
-      <w:pPr>
-        <w:pStyle w:val="Ttulo2"/>
-      </w:pPr>
-      <w:r>
-        <w:t xml:space="preserve">6.4 Contribuciones aplicadas</w:t>
-      </w:r>
-    </w:p>
-    <w:bookmarkEnd w:id="82"/>
-    <w:bookmarkStart w:id="83" w:name="limitaciones-del-estudio"/>
-    <w:p>
-      <w:pPr>
-        <w:pStyle w:val="Ttulo2"/>
-      </w:pPr>
-      <w:r>
-        <w:t xml:space="preserve">6.5 Limitaciones del estudio</w:t>
-      </w:r>
-    </w:p>
-    <w:bookmarkEnd w:id="83"/>
-    <w:bookmarkStart w:id="84" w:name="prospectiva-líneas-futuras"/>
-    <w:p>
-      <w:pPr>
-        <w:pStyle w:val="Ttulo2"/>
-      </w:pPr>
-      <w:r>
-        <w:t xml:space="preserve">6.6 Prospectiva / líneas futuras</w:t>
-      </w:r>
-    </w:p>
-    <w:bookmarkEnd w:id="84"/>
-    <w:bookmarkEnd w:id="85"/>
-    <w:bookmarkStart w:id="106" w:name="referencias"/>
-    <w:p>
-      <w:pPr>
-        <w:pStyle w:val="Ttulo1"/>
-      </w:pPr>
-      <w:r>
         <w:t xml:space="preserve">Referencias</w:t>
       </w:r>
     </w:p>
-    <w:bookmarkStart w:id="105" w:name="refs"/>
-    <w:bookmarkStart w:id="87" w:name="ref-abdulkadir2023"/>
+    <w:bookmarkStart w:id="98" w:name="refs"/>
+    <w:bookmarkStart w:id="79" w:name="ref-abdulkadir2023"/>
     <w:p>
       <w:pPr>
         <w:pStyle w:val="Bibliography"/>
@@ -1375,7 +2931,7 @@
       <w:r>
         <w:t xml:space="preserve"> </w:t>
       </w:r>
-      <w:hyperlink r:id="rId86">
+      <w:hyperlink r:id="rId78">
         <w:r>
           <w:rPr>
             <w:rStyle w:val="Hipervnculo"/>
@@ -1387,8 +2943,8 @@
         <w:t xml:space="preserve">.</w:t>
       </w:r>
     </w:p>
-    <w:bookmarkEnd w:id="87"/>
-    <w:bookmarkStart w:id="88" w:name="ref-agarwal2022"/>
+    <w:bookmarkEnd w:id="79"/>
+    <w:bookmarkStart w:id="80" w:name="ref-agarwal2022"/>
     <w:p>
       <w:pPr>
         <w:pStyle w:val="Bibliography"/>
@@ -1416,8 +2972,8 @@
         <w:t xml:space="preserve">.</w:t>
       </w:r>
     </w:p>
-    <w:bookmarkEnd w:id="88"/>
-    <w:bookmarkStart w:id="90" w:name="ref-bhattacharya2024"/>
+    <w:bookmarkEnd w:id="80"/>
+    <w:bookmarkStart w:id="82" w:name="ref-bhattacharya2024"/>
     <w:p>
       <w:pPr>
         <w:pStyle w:val="Bibliography"/>
@@ -1447,7 +3003,7 @@
       <w:r>
         <w:t xml:space="preserve"> </w:t>
       </w:r>
-      <w:hyperlink r:id="rId89">
+      <w:hyperlink r:id="rId81">
         <w:r>
           <w:rPr>
             <w:rStyle w:val="Hipervnculo"/>
@@ -1459,8 +3015,8 @@
         <w:t xml:space="preserve">.</w:t>
       </w:r>
     </w:p>
-    <w:bookmarkEnd w:id="90"/>
-    <w:bookmarkStart w:id="92" w:name="ref-canha2025"/>
+    <w:bookmarkEnd w:id="82"/>
+    <w:bookmarkStart w:id="84" w:name="ref-canha2025"/>
     <w:p>
       <w:pPr>
         <w:pStyle w:val="Bibliography"/>
@@ -1493,7 +3049,7 @@
       <w:r>
         <w:t xml:space="preserve"> </w:t>
       </w:r>
-      <w:hyperlink r:id="rId91">
+      <w:hyperlink r:id="rId83">
         <w:r>
           <w:rPr>
             <w:rStyle w:val="Hipervnculo"/>
@@ -1505,8 +3061,8 @@
         <w:t xml:space="preserve">.</w:t>
       </w:r>
     </w:p>
-    <w:bookmarkEnd w:id="92"/>
-    <w:bookmarkStart w:id="93" w:name="ref-hedstrom2023"/>
+    <w:bookmarkEnd w:id="84"/>
+    <w:bookmarkStart w:id="85" w:name="ref-hedstrom2023"/>
     <w:p>
       <w:pPr>
         <w:pStyle w:val="Bibliography"/>
@@ -1537,8 +3093,8 @@
         <w:t xml:space="preserve">24 (34): 1–11.</w:t>
       </w:r>
     </w:p>
-    <w:bookmarkEnd w:id="93"/>
-    <w:bookmarkStart w:id="95" w:name="ref-lundberg2017"/>
+    <w:bookmarkEnd w:id="85"/>
+    <w:bookmarkStart w:id="87" w:name="ref-lundberg2017"/>
     <w:p>
       <w:pPr>
         <w:pStyle w:val="Bibliography"/>
@@ -1568,7 +3124,7 @@
       <w:r>
         <w:t xml:space="preserve"> </w:t>
       </w:r>
-      <w:hyperlink r:id="rId94">
+      <w:hyperlink r:id="rId86">
         <w:r>
           <w:rPr>
             <w:rStyle w:val="Hipervnculo"/>
@@ -1580,8 +3136,8 @@
         <w:t xml:space="preserve">.</w:t>
       </w:r>
     </w:p>
-    <w:bookmarkEnd w:id="95"/>
-    <w:bookmarkStart w:id="96" w:name="ref-nizam2023"/>
+    <w:bookmarkEnd w:id="87"/>
+    <w:bookmarkStart w:id="88" w:name="ref-nizam2023"/>
     <w:p>
       <w:pPr>
         <w:pStyle w:val="Bibliography"/>
@@ -1609,8 +3165,8 @@
         <w:t xml:space="preserve">.</w:t>
       </w:r>
     </w:p>
-    <w:bookmarkEnd w:id="96"/>
-    <w:bookmarkStart w:id="98" w:name="ref-pawlicki2024"/>
+    <w:bookmarkEnd w:id="88"/>
+    <w:bookmarkStart w:id="90" w:name="ref-pawlicki2024"/>
     <w:p>
       <w:pPr>
         <w:pStyle w:val="Bibliography"/>
@@ -1643,7 +3199,7 @@
       <w:r>
         <w:t xml:space="preserve"> </w:t>
       </w:r>
-      <w:hyperlink r:id="rId97">
+      <w:hyperlink r:id="rId89">
         <w:r>
           <w:rPr>
             <w:rStyle w:val="Hipervnculo"/>
@@ -1655,8 +3211,40 @@
         <w:t xml:space="preserve">.</w:t>
       </w:r>
     </w:p>
-    <w:bookmarkEnd w:id="98"/>
-    <w:bookmarkStart w:id="100" w:name="ref-ribeiro2016"/>
+    <w:bookmarkEnd w:id="90"/>
+    <w:bookmarkStart w:id="91" w:name="ref-reif2024"/>
+    <w:p>
+      <w:pPr>
+        <w:pStyle w:val="Bibliography"/>
+      </w:pPr>
+      <w:r>
+        <w:t xml:space="preserve">Reif, E. et al.</w:t>
+      </w:r>
+      <w:r>
+        <w:t xml:space="preserve"> 2024.</w:t>
+      </w:r>
+      <w:r>
+        <w:t xml:space="preserve"> </w:t>
+      </w:r>
+      <w:r>
+        <w:t xml:space="preserve">“Evidence of a Social Evaluation Penalty for Using AI.”</w:t>
+      </w:r>
+      <w:r>
+        <w:t xml:space="preserve"> </w:t>
+      </w:r>
+      <w:r>
+        <w:rPr>
+          <w:i/>
+          <w:iCs/>
+        </w:rPr>
+        <w:t xml:space="preserve">Research Note</w:t>
+      </w:r>
+      <w:r>
+        <w:t xml:space="preserve">.</w:t>
+      </w:r>
+    </w:p>
+    <w:bookmarkEnd w:id="91"/>
+    <w:bookmarkStart w:id="93" w:name="ref-ribeiro2016"/>
     <w:p>
       <w:pPr>
         <w:pStyle w:val="Bibliography"/>
@@ -1686,7 +3274,7 @@
       <w:r>
         <w:t xml:space="preserve"> </w:t>
       </w:r>
-      <w:hyperlink r:id="rId99">
+      <w:hyperlink r:id="rId92">
         <w:r>
           <w:rPr>
             <w:rStyle w:val="Hipervnculo"/>
@@ -1698,8 +3286,8 @@
         <w:t xml:space="preserve">.</w:t>
       </w:r>
     </w:p>
-    <w:bookmarkEnd w:id="100"/>
-    <w:bookmarkStart w:id="102" w:name="ref-ribeiro2018"/>
+    <w:bookmarkEnd w:id="93"/>
+    <w:bookmarkStart w:id="95" w:name="ref-ribeiro2018"/>
     <w:p>
       <w:pPr>
         <w:pStyle w:val="Bibliography"/>
@@ -1729,7 +3317,7 @@
       <w:r>
         <w:t xml:space="preserve"> </w:t>
       </w:r>
-      <w:hyperlink r:id="rId101">
+      <w:hyperlink r:id="rId94">
         <w:r>
           <w:rPr>
             <w:rStyle w:val="Hipervnculo"/>
@@ -1741,8 +3329,8 @@
         <w:t xml:space="preserve">.</w:t>
       </w:r>
     </w:p>
-    <w:bookmarkEnd w:id="102"/>
-    <w:bookmarkStart w:id="104" w:name="ref-zheng2025"/>
+    <w:bookmarkEnd w:id="95"/>
+    <w:bookmarkStart w:id="97" w:name="ref-zheng2025"/>
     <w:p>
       <w:pPr>
         <w:pStyle w:val="Bibliography"/>
@@ -1772,7 +3360,7 @@
       <w:r>
         <w:t xml:space="preserve"> </w:t>
       </w:r>
-      <w:hyperlink r:id="rId103">
+      <w:hyperlink r:id="rId96">
         <w:r>
           <w:rPr>
             <w:rStyle w:val="Hipervnculo"/>
@@ -1784,10 +3372,10 @@
         <w:t xml:space="preserve">.</w:t>
       </w:r>
     </w:p>
-    <w:bookmarkEnd w:id="104"/>
-    <w:bookmarkEnd w:id="105"/>
-    <w:bookmarkEnd w:id="106"/>
-    <w:bookmarkStart w:id="110" w:name="apéndices"/>
+    <w:bookmarkEnd w:id="97"/>
+    <w:bookmarkEnd w:id="98"/>
+    <w:bookmarkEnd w:id="99"/>
+    <w:bookmarkStart w:id="103" w:name="apéndices"/>
     <w:p>
       <w:pPr>
         <w:pStyle w:val="Ttulo1"/>
@@ -1796,7 +3384,7 @@
         <w:t xml:space="preserve">Apéndices</w:t>
       </w:r>
     </w:p>
-    <w:bookmarkStart w:id="107" w:name="apéndice-a-detalles-del-corpus-de-datos"/>
+    <w:bookmarkStart w:id="100" w:name="apéndice-a-detalles-del-corpus-de-datos"/>
     <w:p>
       <w:pPr>
         <w:pStyle w:val="Ttulo2"/>
@@ -1805,8 +3393,8 @@
         <w:t xml:space="preserve">Apéndice A: Detalles del corpus de datos</w:t>
       </w:r>
     </w:p>
-    <w:bookmarkEnd w:id="107"/>
-    <w:bookmarkStart w:id="108" w:name="X099ba691e46175a7ccd6698c94b9cfe7ba4975a"/>
+    <w:bookmarkEnd w:id="100"/>
+    <w:bookmarkStart w:id="101" w:name="X099ba691e46175a7ccd6698c94b9cfe7ba4975a"/>
     <w:p>
       <w:pPr>
         <w:pStyle w:val="Ttulo2"/>
@@ -1815,8 +3403,8 @@
         <w:t xml:space="preserve">Apéndice B: Configuración de los modelos de caja negra</w:t>
       </w:r>
     </w:p>
-    <w:bookmarkEnd w:id="108"/>
-    <w:bookmarkStart w:id="109" w:name="X52f0a5c074bf6018d9e252527b969f7db490891"/>
+    <w:bookmarkEnd w:id="101"/>
+    <w:bookmarkStart w:id="102" w:name="X52f0a5c074bf6018d9e252527b969f7db490891"/>
     <w:p>
       <w:pPr>
         <w:pStyle w:val="Ttulo2"/>
@@ -1825,8 +3413,8 @@
         <w:t xml:space="preserve">Apéndice C: Prompts utilizados para la evaluación con LLMs</w:t>
       </w:r>
     </w:p>
-    <w:bookmarkEnd w:id="109"/>
-    <w:bookmarkEnd w:id="110"/>
+    <w:bookmarkEnd w:id="102"/>
+    <w:bookmarkEnd w:id="103"/>
     <w:sectPr>
       <w:headerReference r:id="rId9" w:type="even"/>
       <w:headerReference r:id="rId10" w:type="default"/>

</xml_diff>

<commit_message>
docs(exp3): update abstracts and regenerated drafts
</commit_message>
<xml_diff>
--- a/thesis/_output/JHerrera_XAI_Tesis_Doctorado.docx
+++ b/thesis/_output/JHerrera_XAI_Tesis_Doctorado.docx
@@ -114,7 +114,7 @@
         <w:pStyle w:val="Textoindependiente"/>
       </w:pPr>
       <w:r>
-        <w:t xml:space="preserve">El estudio empírico se realiza sobre el conjunto Adult (UCI Adult Income) y operacionaliza cinco métricas primarias: fidelidad, estabilidad, parsimonia, brecha de fidelidad (</w:t>
+        <w:t xml:space="preserve">El estudio empírico integra tres fases. EXP1 calibra la reproducibilidad del protocolo; EXP2 ejecuta el benchmark confirmativo sobre UCI Adult Income y operacionaliza cinco métricas primarias: fidelidad, estabilidad, parsimonia, brecha de fidelidad (</w:t>
       </w:r>
       <w:r>
         <w:rPr>
@@ -124,7 +124,7 @@
         <w:t xml:space="preserve">faithfulness gap</w:t>
       </w:r>
       <w:r>
-        <w:t xml:space="preserve">) y coste computacional. La inferencia confirmativa se apoya en comparaciones no paramétricas con control de multiplicidad y en un análisis pareado SHAP–LIME para cuantificar el trade-off calidad–coste. Los resultados muestran diferencias grandes y consistentes entre métodos: SHAP domina en fidelidad y estabilidad en los contextos evaluados, mientras que LIME resulta competitivo cuando la latencia es crítica, a costa de explicaciones estructuralmente inestables. Anchors y DiCE se posicionan como enfoques con objetivos explicativos cualitativamente distintos a la atribución de características. En conjunto, la tesis aporta un protocolo portable y un marco conceptual que permiten seleccionar métodos XAI en función de objetivos operativos y acumular evidencia de forma reproducible.</w:t>
+        <w:t xml:space="preserve">) y coste computacional; y EXP3 añade una validación externa compacta sobre Breast Cancer y German Credit. La inferencia confirmativa de EXP2 se apoya en comparaciones no paramétricas con control de multiplicidad y en un análisis pareado SHAP–LIME para cuantificar el trade-off calidad–coste, mientras que EXP3 se reporta como evidencia descriptiva de portabilidad. Los resultados muestran diferencias grandes y consistentes entre métodos: SHAP domina en fidelidad y estabilidad en Adult y conserva esa ventaja en EXP3 (fidelidad media 0.702 y estabilidad 0.873 frente a 0.319 y 0.533 para Anchors). LIME resulta competitivo cuando la latencia es crítica, a costa de explicaciones estructuralmente inestables, y Anchors y DiCE se posicionan como enfoques con objetivos explicativos cualitativamente distintos a la atribución de características. En conjunto, la tesis aporta un protocolo portable y un marco conceptual que permiten seleccionar métodos XAI en función de objetivos operativos y acumular evidencia de forma reproducible.</w:t>
       </w:r>
     </w:p>
     <w:p>
@@ -168,7 +168,7 @@
         <w:pStyle w:val="Textoindependiente"/>
       </w:pPr>
       <w:r>
-        <w:t xml:space="preserve">The empirical study uses the Adult (UCI Adult Income) dataset and operationalizes five primary metrics: faithfulness, stability, parsimony, faithfulness gap, and computational cost. Confirmatory inference relies on nonparametric comparisons with multiplicity control and on a paired SHAP–LIME analysis to quantify the quality–cost trade-off. Results show large and consistent differences across methods: SHAP dominates in faithfulness and stability in the evaluated settings, whereas LIME becomes attractive when latency constraints dominate, at the cost of structurally unstable explanations. Anchors and DiCE address qualitatively different explanatory objectives than feature attribution. Overall, the thesis contributes a portable protocol and a conceptual framework to support operationally grounded XAI method selection and reproducible evidence accumulation.</w:t>
+        <w:t xml:space="preserve">The empirical study integrates three phases. EXP1 calibrates protocol reproducibility; EXP2 conducts the confirmatory benchmark on UCI Adult Income and operationalizes five primary metrics: faithfulness, stability, parsimony, faithfulness gap, and computational cost; and EXP3 adds compact external validation on Breast Cancer and German Credit. Confirmatory inference for EXP2 relies on nonparametric comparisons with multiplicity control and on a paired SHAP–LIME analysis to quantify the quality–cost trade-off, whereas EXP3 is reported as descriptive portability evidence. Results show large and consistent differences across methods: SHAP dominates in faithfulness and stability on Adult and preserves that advantage in EXP3 (mean faithfulness 0.702 and stability 0.873 versus 0.319 and 0.533 for Anchors). LIME becomes attractive when latency constraints dominate, at the cost of structurally unstable explanations, and Anchors and DiCE address qualitatively different explanatory objectives than feature attribution. Overall, the thesis contributes a portable protocol and a conceptual framework to support operationally grounded XAI method selection and reproducible evidence accumulation.</w:t>
       </w:r>
     </w:p>
     <w:p>

</xml_diff>

<commit_message>
docs(exp4): add LLM evaluation experiment design
</commit_message>
<xml_diff>
--- a/thesis/_output/JHerrera_XAI_Tesis_Doctorado.docx
+++ b/thesis/_output/JHerrera_XAI_Tesis_Doctorado.docx
@@ -680,6 +680,44 @@
       </w:r>
       <w:r>
         <w:t xml:space="preserve">profundamente confiables y plenamente comprendidos por sus usuarios.</w:t>
+      </w:r>
+    </w:p>
+    <w:p>
+      <w:pPr>
+        <w:pStyle w:val="Textoindependiente"/>
+      </w:pPr>
+      <w:r>
+        <w:t xml:space="preserve">Una vez establecida la capa técnica y de validez externa del marco, la extensión</w:t>
+      </w:r>
+      <w:r>
+        <w:t xml:space="preserve"> </w:t>
+      </w:r>
+      <w:r>
+        <w:t xml:space="preserve">natural de esta línea de trabajo es la evaluación semántica asistida por modelos</w:t>
+      </w:r>
+      <w:r>
+        <w:t xml:space="preserve"> </w:t>
+      </w:r>
+      <w:r>
+        <w:t xml:space="preserve">de lenguaje de gran escala (LLMs). En esta tesis, dicha extensión se plantea</w:t>
+      </w:r>
+      <w:r>
+        <w:t xml:space="preserve"> </w:t>
+      </w:r>
+      <w:r>
+        <w:t xml:space="preserve">como una capa proxy reproducible para valorar dimensiones como claridad,</w:t>
+      </w:r>
+      <w:r>
+        <w:t xml:space="preserve"> </w:t>
+      </w:r>
+      <w:r>
+        <w:t xml:space="preserve">coherencia, utilidad auditora y plausibilidad semántica de las explicaciones,</w:t>
+      </w:r>
+      <w:r>
+        <w:t xml:space="preserve"> </w:t>
+      </w:r>
+      <w:r>
+        <w:t xml:space="preserve">sin equipararla todavía con una validación directa de interpretabilidad humana.</w:t>
       </w:r>
     </w:p>
     <w:p>
@@ -5289,55 +5327,55 @@
         <w:t xml:space="preserve"> </w:t>
       </w:r>
       <w:r>
-        <w:t xml:space="preserve">(Estudio A, Paper A), la comparación pareada enfocada entre LIME y SHAP</w:t>
-      </w:r>
-      <w:r>
-        <w:t xml:space="preserve"> </w:t>
-      </w:r>
-      <w:r>
-        <w:t xml:space="preserve">(Estudio B, Paper B) y la validación externa compacta EXP3. Los dos primeros</w:t>
-      </w:r>
-      <w:r>
-        <w:t xml:space="preserve"> </w:t>
-      </w:r>
-      <w:r>
-        <w:t xml:space="preserve">estudios comparten el mismo pipeline experimental, el mismo conjunto de datos</w:t>
-      </w:r>
-      <w:r>
-        <w:t xml:space="preserve"> </w:t>
-      </w:r>
-      <w:r>
-        <w:t xml:space="preserve">Adult y los mismos artefactos de modelo, y se distinguen por el alcance del</w:t>
-      </w:r>
-      <w:r>
-        <w:t xml:space="preserve"> </w:t>
-      </w:r>
-      <w:r>
-        <w:t xml:space="preserve">análisis inferencial: Estudio A evalúa los cuatro métodos sobre el diseño</w:t>
-      </w:r>
-      <w:r>
-        <w:t xml:space="preserve"> </w:t>
-      </w:r>
-      <w:r>
-        <w:t xml:space="preserve">factorial completo; Estudio B restringe la inferencia confirmativa al</w:t>
-      </w:r>
-      <w:r>
-        <w:t xml:space="preserve"> </w:t>
-      </w:r>
-      <w:r>
-        <w:t xml:space="preserve">subconjunto pareado LIME-SHAP. EXP3 reutiliza el contrato operativo y el paquete</w:t>
-      </w:r>
-      <w:r>
-        <w:t xml:space="preserve"> </w:t>
-      </w:r>
-      <w:r>
-        <w:t xml:space="preserve">de métricas para evaluar portabilidad en Breast Cancer y German Credit, sin</w:t>
-      </w:r>
-      <w:r>
-        <w:t xml:space="preserve"> </w:t>
-      </w:r>
-      <w:r>
-        <w:t xml:space="preserve">incorporarse al contraste confirmativo de EXP2. El capítulo se organiza en ocho</w:t>
+        <w:t xml:space="preserve">(Estudio A), la comparación pareada enfocada entre LIME y SHAP (Estudio B) y la</w:t>
+      </w:r>
+      <w:r>
+        <w:t xml:space="preserve"> </w:t>
+      </w:r>
+      <w:r>
+        <w:t xml:space="preserve">validación externa compacta EXP3. Los dos primeros estudios comparten el mismo</w:t>
+      </w:r>
+      <w:r>
+        <w:t xml:space="preserve"> </w:t>
+      </w:r>
+      <w:r>
+        <w:t xml:space="preserve">protocolo experimental, el mismo conjunto de datos Adult y los mismos artefactos</w:t>
+      </w:r>
+      <w:r>
+        <w:t xml:space="preserve"> </w:t>
+      </w:r>
+      <w:r>
+        <w:t xml:space="preserve">de modelo, y se distinguen por el alcance del análisis inferencial: el Estudio A</w:t>
+      </w:r>
+      <w:r>
+        <w:t xml:space="preserve"> </w:t>
+      </w:r>
+      <w:r>
+        <w:t xml:space="preserve">evalúa los cuatro métodos sobre el diseño factorial completo; el Estudio B</w:t>
+      </w:r>
+      <w:r>
+        <w:t xml:space="preserve"> </w:t>
+      </w:r>
+      <w:r>
+        <w:t xml:space="preserve">restringe la inferencia confirmativa al subconjunto pareado LIME-SHAP. EXP3</w:t>
+      </w:r>
+      <w:r>
+        <w:t xml:space="preserve"> </w:t>
+      </w:r>
+      <w:r>
+        <w:t xml:space="preserve">reutiliza el contrato operativo y el paquete de métricas para evaluar</w:t>
+      </w:r>
+      <w:r>
+        <w:t xml:space="preserve"> </w:t>
+      </w:r>
+      <w:r>
+        <w:t xml:space="preserve">portabilidad en Breast Cancer y German Credit, sin incorporarse al contraste</w:t>
+      </w:r>
+      <w:r>
+        <w:t xml:space="preserve"> </w:t>
+      </w:r>
+      <w:r>
+        <w:t xml:space="preserve">confirmativo de EXP2. El capítulo se organiza en ocho</w:t>
       </w:r>
       <w:r>
         <w:t xml:space="preserve"> </w:t>
@@ -7001,52 +7039,7 @@
         <w:t xml:space="preserve"> </w:t>
       </w:r>
       <w:r>
-        <w:t xml:space="preserve">compacto y evitar convertirlo en un segundo EXP2. Los resultados completos se</w:t>
-      </w:r>
-      <w:r>
-        <w:t xml:space="preserve"> </w:t>
-      </w:r>
-      <w:r>
-        <w:t xml:space="preserve">integran mediante</w:t>
-      </w:r>
-      <w:r>
-        <w:t xml:space="preserve"> </w:t>
-      </w:r>
-      <w:r>
-        <w:rPr>
-          <w:rStyle w:val="VerbatimChar"/>
-        </w:rPr>
-        <w:t xml:space="preserve">scripts/integrate_experiment_evidence.py</w:t>
-      </w:r>
-      <w:r>
-        <w:t xml:space="preserve">, que genera el</w:t>
-      </w:r>
-      <w:r>
-        <w:t xml:space="preserve"> </w:t>
-      </w:r>
-      <w:r>
-        <w:t xml:space="preserve">paquete</w:t>
-      </w:r>
-      <w:r>
-        <w:t xml:space="preserve"> </w:t>
-      </w:r>
-      <w:r>
-        <w:rPr>
-          <w:rStyle w:val="VerbatimChar"/>
-        </w:rPr>
-        <w:t xml:space="preserve">outputs/analysis/integrated_evidence/</w:t>
-      </w:r>
-      <w:r>
-        <w:t xml:space="preserve"> </w:t>
-      </w:r>
-      <w:r>
-        <w:t xml:space="preserve">con tablas normalizadas,</w:t>
-      </w:r>
-      <w:r>
-        <w:t xml:space="preserve"> </w:t>
-      </w:r>
-      <w:r>
-        <w:t xml:space="preserve">fragmentos de tesis y notas de integración para Paper A/B/C.</w:t>
+        <w:t xml:space="preserve">compacto y evitar convertirlo en un segundo EXP2.</w:t>
       </w:r>
     </w:p>
     <w:p>
@@ -7054,40 +7047,37 @@
         <w:pStyle w:val="Textoindependiente"/>
       </w:pPr>
       <w:r>
-        <w:t xml:space="preserve">EXP3 completó</w:t>
-      </w:r>
-      <w:r>
-        <w:t xml:space="preserve"> </w:t>
-      </w:r>
-      <w:r>
-        <w:rPr>
-          <w:rStyle w:val="VerbatimChar"/>
-        </w:rPr>
-        <w:t xml:space="preserve">24 / 24</w:t>
-      </w:r>
-      <w:r>
-        <w:t xml:space="preserve"> </w:t>
-      </w:r>
-      <w:r>
-        <w:t xml:space="preserve">ejecuciones planificadas. En el análisis estadístico,</w:t>
-      </w:r>
-      <w:r>
-        <w:t xml:space="preserve"> </w:t>
-      </w:r>
-      <w:r>
-        <w:t xml:space="preserve">sus métricas se reportan como resumen descriptivo y evidencia de validez</w:t>
-      </w:r>
-      <w:r>
-        <w:t xml:space="preserve"> </w:t>
-      </w:r>
-      <w:r>
-        <w:t xml:space="preserve">externa. No se agregan a los bloques Friedman de EXP2 ni a la prueba pareada</w:t>
-      </w:r>
-      <w:r>
-        <w:t xml:space="preserve"> </w:t>
-      </w:r>
-      <w:r>
-        <w:t xml:space="preserve">SHAP-LIME de Paper B.</w:t>
+        <w:t xml:space="preserve">En la lógica de la tesis, EXP3 cumple una función de validación externa</w:t>
+      </w:r>
+      <w:r>
+        <w:t xml:space="preserve"> </w:t>
+      </w:r>
+      <w:r>
+        <w:t xml:space="preserve">acotada: verifica que el protocolo, las métricas y los criterios de</w:t>
+      </w:r>
+      <w:r>
+        <w:t xml:space="preserve"> </w:t>
+      </w:r>
+      <w:r>
+        <w:t xml:space="preserve">calificación puedan trasladarse a dominios tabulares distintos sin redefinir</w:t>
+      </w:r>
+      <w:r>
+        <w:t xml:space="preserve"> </w:t>
+      </w:r>
+      <w:r>
+        <w:t xml:space="preserve">las hipótesis confirmativas del estudio principal. Por ello, sus resultados se</w:t>
+      </w:r>
+      <w:r>
+        <w:t xml:space="preserve"> </w:t>
+      </w:r>
+      <w:r>
+        <w:t xml:space="preserve">interpretan como evidencia descriptiva de portabilidad metodológica y no se</w:t>
+      </w:r>
+      <w:r>
+        <w:t xml:space="preserve"> </w:t>
+      </w:r>
+      <w:r>
+        <w:t xml:space="preserve">agregan a las pruebas inferenciales de EXP2 ni al análisis pareado SHAP-LIME.</w:t>
       </w:r>
     </w:p>
     <w:bookmarkEnd w:id="58"/>
@@ -27660,25 +27650,44 @@
           <w:b/>
           <w:bCs/>
         </w:rPr>
-        <w:t xml:space="preserve">Ausencia de evaluación human-centered.</w:t>
-      </w:r>
-      <w:r>
-        <w:t xml:space="preserve"> </w:t>
-      </w:r>
-      <w:r>
-        <w:t xml:space="preserve">El benchmark es exclusivamente</w:t>
-      </w:r>
-      <w:r>
-        <w:t xml:space="preserve"> </w:t>
-      </w:r>
-      <w:r>
-        <w:t xml:space="preserve">funcionally-grounded. La dimensión de comprehensibilidad percibida, utilidad</w:t>
-      </w:r>
-      <w:r>
-        <w:t xml:space="preserve"> </w:t>
-      </w:r>
-      <w:r>
-        <w:t xml:space="preserve">para la toma de decisiones y confianza del usuario</w:t>
+        <w:t xml:space="preserve">Ausencia de evaluación semántica y human-centered.</w:t>
+      </w:r>
+      <w:r>
+        <w:t xml:space="preserve"> </w:t>
+      </w:r>
+      <w:r>
+        <w:t xml:space="preserve">El benchmark es</w:t>
+      </w:r>
+      <w:r>
+        <w:t xml:space="preserve"> </w:t>
+      </w:r>
+      <w:r>
+        <w:t xml:space="preserve">exclusivamente</w:t>
+      </w:r>
+      <w:r>
+        <w:t xml:space="preserve"> </w:t>
+      </w:r>
+      <w:r>
+        <w:rPr>
+          <w:i/>
+          <w:iCs/>
+        </w:rPr>
+        <w:t xml:space="preserve">functionally-grounded</w:t>
+      </w:r>
+      <w:r>
+        <w:t xml:space="preserve">. La dimensión de comprehensibilidad</w:t>
+      </w:r>
+      <w:r>
+        <w:t xml:space="preserve"> </w:t>
+      </w:r>
+      <w:r>
+        <w:t xml:space="preserve">percibida, utilidad para la toma de decisiones, confianza del usuario y</w:t>
+      </w:r>
+      <w:r>
+        <w:t xml:space="preserve"> </w:t>
+      </w:r>
+      <w:r>
+        <w:t xml:space="preserve">coherencia semántica de la explicación</w:t>
       </w:r>
       <w:r>
         <w:t xml:space="preserve"> </w:t>
@@ -27690,25 +27699,31 @@
         <w:t xml:space="preserve"> </w:t>
       </w:r>
       <w:r>
-        <w:t xml:space="preserve">no está</w:t>
-      </w:r>
-      <w:r>
-        <w:t xml:space="preserve"> </w:t>
-      </w:r>
-      <w:r>
-        <w:t xml:space="preserve">cubierta. La taxonomía del Estudio C hace explícita esta limitación y la</w:t>
-      </w:r>
-      <w:r>
-        <w:t xml:space="preserve"> </w:t>
-      </w:r>
-      <w:r>
-        <w:t xml:space="preserve">localiza en los Ejes 2 y 4, pero los criterios de selección prescriptivos</w:t>
-      </w:r>
-      <w:r>
-        <w:t xml:space="preserve"> </w:t>
-      </w:r>
-      <w:r>
-        <w:t xml:space="preserve">derivados no incorporan preferencias de usuarios finales.</w:t>
+        <w:t xml:space="preserve">no está cubierta por</w:t>
+      </w:r>
+      <w:r>
+        <w:t xml:space="preserve"> </w:t>
+      </w:r>
+      <w:r>
+        <w:t xml:space="preserve">los resultados confirmativos. La taxonomía del Estudio C hace explícita esta</w:t>
+      </w:r>
+      <w:r>
+        <w:t xml:space="preserve"> </w:t>
+      </w:r>
+      <w:r>
+        <w:t xml:space="preserve">limitación y la localiza en los Ejes 2 y 4, pero los criterios de selección</w:t>
+      </w:r>
+      <w:r>
+        <w:t xml:space="preserve"> </w:t>
+      </w:r>
+      <w:r>
+        <w:t xml:space="preserve">prescriptivos derivados no incorporan todavía una capa de evaluación semántica</w:t>
+      </w:r>
+      <w:r>
+        <w:t xml:space="preserve"> </w:t>
+      </w:r>
+      <w:r>
+        <w:t xml:space="preserve">proxy ni preferencias de usuarios finales.</w:t>
       </w:r>
     </w:p>
     <w:p>
@@ -27774,7 +27789,7 @@
         <w:t xml:space="preserve"> </w:t>
       </w:r>
       <w:r>
-        <w:t xml:space="preserve">señalar cinco extensiones de investigación con fundamento empírico:</w:t>
+        <w:t xml:space="preserve">señalar seis extensiones de investigación con fundamento empírico:</w:t>
       </w:r>
     </w:p>
     <w:p>
@@ -27840,49 +27855,67 @@
           <w:b/>
           <w:bCs/>
         </w:rPr>
-        <w:t xml:space="preserve">2. Incorporación de evaluación human-centered.</w:t>
-      </w:r>
-      <w:r>
-        <w:t xml:space="preserve"> </w:t>
-      </w:r>
-      <w:r>
-        <w:t xml:space="preserve">La brecha identificada en</w:t>
-      </w:r>
-      <w:r>
-        <w:t xml:space="preserve"> </w:t>
-      </w:r>
-      <w:r>
-        <w:t xml:space="preserve">el Eje 2 (fuente de evidencia) de la taxonomía apunta directamente a la</w:t>
-      </w:r>
-      <w:r>
-        <w:t xml:space="preserve"> </w:t>
-      </w:r>
-      <w:r>
-        <w:t xml:space="preserve">necesidad de integrar estudios de usuario en el protocolo. Un estudio con</w:t>
-      </w:r>
-      <w:r>
-        <w:t xml:space="preserve"> </w:t>
-      </w:r>
-      <w:r>
-        <w:t xml:space="preserve">usuarios expertos (médicos, analistas de crédito) que evalúen la comprensión</w:t>
-      </w:r>
-      <w:r>
-        <w:t xml:space="preserve"> </w:t>
-      </w:r>
-      <w:r>
-        <w:t xml:space="preserve">de las explicaciones de SHAP y LIME complementaría los hallazgos funcionales</w:t>
-      </w:r>
-      <w:r>
-        <w:t xml:space="preserve"> </w:t>
-      </w:r>
-      <w:r>
-        <w:t xml:space="preserve">con evidencia de utilidad práctica, completando el espacio de evaluación</w:t>
-      </w:r>
-      <w:r>
-        <w:t xml:space="preserve"> </w:t>
-      </w:r>
-      <w:r>
-        <w:t xml:space="preserve">multi-eje.</w:t>
+        <w:t xml:space="preserve">2. Evaluación semántica proxy mediante LLMs (EXP4).</w:t>
+      </w:r>
+      <w:r>
+        <w:t xml:space="preserve"> </w:t>
+      </w:r>
+      <w:r>
+        <w:t xml:space="preserve">La siguiente extensión</w:t>
+      </w:r>
+      <w:r>
+        <w:t xml:space="preserve"> </w:t>
+      </w:r>
+      <w:r>
+        <w:t xml:space="preserve">experimental debe introducir una capa de evaluación semántica reproducible</w:t>
+      </w:r>
+      <w:r>
+        <w:t xml:space="preserve"> </w:t>
+      </w:r>
+      <w:r>
+        <w:t xml:space="preserve">basada en LLMs como jueces rubricados. Su objetivo no es sustituir la validación</w:t>
+      </w:r>
+      <w:r>
+        <w:t xml:space="preserve"> </w:t>
+      </w:r>
+      <w:r>
+        <w:t xml:space="preserve">humana, sino estimar de forma controlada dimensiones que las métricas</w:t>
+      </w:r>
+      <w:r>
+        <w:t xml:space="preserve"> </w:t>
+      </w:r>
+      <w:r>
+        <w:t xml:space="preserve">funcionales no capturan directamente: claridad, completitud, concisión, utilidad</w:t>
+      </w:r>
+      <w:r>
+        <w:t xml:space="preserve"> </w:t>
+      </w:r>
+      <w:r>
+        <w:t xml:space="preserve">auditora, plausibilidad semántica y capacidad de apoyar la interpretación de una</w:t>
+      </w:r>
+      <w:r>
+        <w:t xml:space="preserve"> </w:t>
+      </w:r>
+      <w:r>
+        <w:t xml:space="preserve">decisión. Esta fase permitiría estudiar si las ventajas técnicas observadas en</w:t>
+      </w:r>
+      <w:r>
+        <w:t xml:space="preserve"> </w:t>
+      </w:r>
+      <w:r>
+        <w:t xml:space="preserve">fidelidad y estabilidad se corresponden con perfiles semánticos favorables, y</w:t>
+      </w:r>
+      <w:r>
+        <w:t xml:space="preserve"> </w:t>
+      </w:r>
+      <w:r>
+        <w:t xml:space="preserve">si explicadores como Anchors obtienen ventajas en claridad o forma discursiva a</w:t>
+      </w:r>
+      <w:r>
+        <w:t xml:space="preserve"> </w:t>
+      </w:r>
+      <w:r>
+        <w:t xml:space="preserve">pesar de resultados funcionales más débiles.</w:t>
       </w:r>
     </w:p>
     <w:p>
@@ -27894,43 +27927,49 @@
           <w:b/>
           <w:bCs/>
         </w:rPr>
-        <w:t xml:space="preserve">3. Análisis de la sensibilidad a la configuración de hiperparámetros.</w:t>
-      </w:r>
-      <w:r>
-        <w:t xml:space="preserve"> </w:t>
-      </w:r>
-      <w:r>
-        <w:t xml:space="preserve">El</w:t>
-      </w:r>
-      <w:r>
-        <w:t xml:space="preserve"> </w:t>
-      </w:r>
-      <w:r>
-        <w:t xml:space="preserve">benchmark primario opera con configuraciones de referencia. Un diseño factorial</w:t>
-      </w:r>
-      <w:r>
-        <w:t xml:space="preserve"> </w:t>
-      </w:r>
-      <w:r>
-        <w:t xml:space="preserve">extendido que varíe sistemáticamente los hiperparámetros clave —número de</w:t>
-      </w:r>
-      <w:r>
-        <w:t xml:space="preserve"> </w:t>
-      </w:r>
-      <w:r>
-        <w:t xml:space="preserve">muestras de LIME, estrategia de referencia de SHAP, parámetros de umbral de</w:t>
-      </w:r>
-      <w:r>
-        <w:t xml:space="preserve"> </w:t>
-      </w:r>
-      <w:r>
-        <w:t xml:space="preserve">Anchors— permitiría determinar en qué medida los perfiles de calidad obtenidos</w:t>
-      </w:r>
-      <w:r>
-        <w:t xml:space="preserve"> </w:t>
-      </w:r>
-      <w:r>
-        <w:t xml:space="preserve">son robustos a la sintonización de cada método.</w:t>
+        <w:t xml:space="preserve">3. Incorporación de evaluación human-centered.</w:t>
+      </w:r>
+      <w:r>
+        <w:t xml:space="preserve"> </w:t>
+      </w:r>
+      <w:r>
+        <w:t xml:space="preserve">La brecha identificada en</w:t>
+      </w:r>
+      <w:r>
+        <w:t xml:space="preserve"> </w:t>
+      </w:r>
+      <w:r>
+        <w:t xml:space="preserve">el Eje 2 (fuente de evidencia) de la taxonomía apunta directamente a la</w:t>
+      </w:r>
+      <w:r>
+        <w:t xml:space="preserve"> </w:t>
+      </w:r>
+      <w:r>
+        <w:t xml:space="preserve">necesidad de integrar estudios de usuario en el protocolo. Un estudio con</w:t>
+      </w:r>
+      <w:r>
+        <w:t xml:space="preserve"> </w:t>
+      </w:r>
+      <w:r>
+        <w:t xml:space="preserve">usuarios expertos (médicos, analistas de crédito) que evalúen la comprensión</w:t>
+      </w:r>
+      <w:r>
+        <w:t xml:space="preserve"> </w:t>
+      </w:r>
+      <w:r>
+        <w:t xml:space="preserve">de las explicaciones de SHAP y LIME complementaría los hallazgos funcionales y</w:t>
+      </w:r>
+      <w:r>
+        <w:t xml:space="preserve"> </w:t>
+      </w:r>
+      <w:r>
+        <w:t xml:space="preserve">la evaluación semántica proxy con evidencia de utilidad práctica, completando</w:t>
+      </w:r>
+      <w:r>
+        <w:t xml:space="preserve"> </w:t>
+      </w:r>
+      <w:r>
+        <w:t xml:space="preserve">el espacio de evaluación multi-eje.</w:t>
       </w:r>
     </w:p>
     <w:p>
@@ -27942,37 +27981,43 @@
           <w:b/>
           <w:bCs/>
         </w:rPr>
-        <w:t xml:space="preserve">4. Replicación en dominios de alto riesgo.</w:t>
-      </w:r>
-      <w:r>
-        <w:t xml:space="preserve"> </w:t>
-      </w:r>
-      <w:r>
-        <w:t xml:space="preserve">Los criterios prescriptivos</w:t>
-      </w:r>
-      <w:r>
-        <w:t xml:space="preserve"> </w:t>
-      </w:r>
-      <w:r>
-        <w:t xml:space="preserve">derivados de este benchmark son válidos bajo el contexto experimental de UCI</w:t>
-      </w:r>
-      <w:r>
-        <w:t xml:space="preserve"> </w:t>
-      </w:r>
-      <w:r>
-        <w:t xml:space="preserve">Adult Income. Su validación en dominios regulados (crédito, salud, justicia)</w:t>
-      </w:r>
-      <w:r>
-        <w:t xml:space="preserve"> </w:t>
-      </w:r>
-      <w:r>
-        <w:t xml:space="preserve">con restricciones normativas explícitas (EU AI Act, GDPR) constituye la</w:t>
-      </w:r>
-      <w:r>
-        <w:t xml:space="preserve"> </w:t>
-      </w:r>
-      <w:r>
-        <w:t xml:space="preserve">extensión de mayor impacto práctico de esta línea de investigación.</w:t>
+        <w:t xml:space="preserve">4. Análisis de la sensibilidad a la configuración de hiperparámetros.</w:t>
+      </w:r>
+      <w:r>
+        <w:t xml:space="preserve"> </w:t>
+      </w:r>
+      <w:r>
+        <w:t xml:space="preserve">El</w:t>
+      </w:r>
+      <w:r>
+        <w:t xml:space="preserve"> </w:t>
+      </w:r>
+      <w:r>
+        <w:t xml:space="preserve">benchmark primario opera con configuraciones de referencia. Un diseño factorial</w:t>
+      </w:r>
+      <w:r>
+        <w:t xml:space="preserve"> </w:t>
+      </w:r>
+      <w:r>
+        <w:t xml:space="preserve">extendido que varíe sistemáticamente los hiperparámetros clave —número de</w:t>
+      </w:r>
+      <w:r>
+        <w:t xml:space="preserve"> </w:t>
+      </w:r>
+      <w:r>
+        <w:t xml:space="preserve">muestras de LIME, estrategia de referencia de SHAP, parámetros de umbral de</w:t>
+      </w:r>
+      <w:r>
+        <w:t xml:space="preserve"> </w:t>
+      </w:r>
+      <w:r>
+        <w:t xml:space="preserve">Anchors— permitiría determinar en qué medida los perfiles de calidad obtenidos</w:t>
+      </w:r>
+      <w:r>
+        <w:t xml:space="preserve"> </w:t>
+      </w:r>
+      <w:r>
+        <w:t xml:space="preserve">son robustos a la sintonización de cada método.</w:t>
       </w:r>
     </w:p>
     <w:p>
@@ -27984,7 +28029,49 @@
           <w:b/>
           <w:bCs/>
         </w:rPr>
-        <w:t xml:space="preserve">5. Formalización del eje de comprehensibilidad en la taxonomía.</w:t>
+        <w:t xml:space="preserve">5. Replicación en dominios de alto riesgo.</w:t>
+      </w:r>
+      <w:r>
+        <w:t xml:space="preserve"> </w:t>
+      </w:r>
+      <w:r>
+        <w:t xml:space="preserve">Los criterios prescriptivos</w:t>
+      </w:r>
+      <w:r>
+        <w:t xml:space="preserve"> </w:t>
+      </w:r>
+      <w:r>
+        <w:t xml:space="preserve">derivados de este benchmark son válidos bajo el contexto experimental de UCI</w:t>
+      </w:r>
+      <w:r>
+        <w:t xml:space="preserve"> </w:t>
+      </w:r>
+      <w:r>
+        <w:t xml:space="preserve">Adult Income. Su validación en dominios regulados (crédito, salud, justicia)</w:t>
+      </w:r>
+      <w:r>
+        <w:t xml:space="preserve"> </w:t>
+      </w:r>
+      <w:r>
+        <w:t xml:space="preserve">con restricciones normativas explícitas (EU AI Act, GDPR) constituye la</w:t>
+      </w:r>
+      <w:r>
+        <w:t xml:space="preserve"> </w:t>
+      </w:r>
+      <w:r>
+        <w:t xml:space="preserve">extensión de mayor impacto práctico de esta línea de investigación.</w:t>
+      </w:r>
+    </w:p>
+    <w:p>
+      <w:pPr>
+        <w:pStyle w:val="Textoindependiente"/>
+      </w:pPr>
+      <w:r>
+        <w:rPr>
+          <w:b/>
+          <w:bCs/>
+        </w:rPr>
+        <w:t xml:space="preserve">6. Formalización del eje de comprehensibilidad en la taxonomía.</w:t>
       </w:r>
       <w:r>
         <w:t xml:space="preserve"> </w:t>
@@ -29850,6 +29937,38 @@
       </w:pPr>
       <w:r>
         <w:t xml:space="preserve">Apéndice C: Prompts utilizados para la evaluación con LLMs</w:t>
+      </w:r>
+    </w:p>
+    <w:p>
+      <w:pPr>
+        <w:pStyle w:val="FirstParagraph"/>
+      </w:pPr>
+      <w:r>
+        <w:t xml:space="preserve">Este apéndice queda reservado para la fase EXP4, orientada a la evaluación</w:t>
+      </w:r>
+      <w:r>
+        <w:t xml:space="preserve"> </w:t>
+      </w:r>
+      <w:r>
+        <w:t xml:space="preserve">semántica proxy de explicaciones mediante LLMs. Los prompts definitivos se</w:t>
+      </w:r>
+      <w:r>
+        <w:t xml:space="preserve"> </w:t>
+      </w:r>
+      <w:r>
+        <w:t xml:space="preserve">documentarán junto con el diseño experimental, la rúbrica de puntuación, los</w:t>
+      </w:r>
+      <w:r>
+        <w:t xml:space="preserve"> </w:t>
+      </w:r>
+      <w:r>
+        <w:t xml:space="preserve">controles de sesgo del evaluador y las reglas de almacenamiento de respuestas</w:t>
+      </w:r>
+      <w:r>
+        <w:t xml:space="preserve"> </w:t>
+      </w:r>
+      <w:r>
+        <w:t xml:space="preserve">crudas y puntuaciones parseadas.</w:t>
       </w:r>
     </w:p>
     <w:bookmarkEnd w:id="214"/>

</xml_diff>

<commit_message>
Enforce thesis DOCX formatting
Adds a permanent DOCX formatting enforcement step for justified body text and double spacing, updates the thesis reference template/output, and ignores the local exp3 virtual environment.
</commit_message>
<xml_diff>
--- a/thesis/_output/JHerrera_XAI_Tesis_Doctorado.docx
+++ b/thesis/_output/JHerrera_XAI_Tesis_Doctorado.docx
@@ -1,6 +1,6 @@
 
 <file path=word/document.xml><?xml version="1.0" encoding="utf-8"?>
-<w:document xmlns:w="http://schemas.openxmlformats.org/wordprocessingml/2006/main" xmlns:m="http://schemas.openxmlformats.org/officeDocument/2006/math" xmlns:r="http://schemas.openxmlformats.org/officeDocument/2006/relationships" xmlns:o="urn:schemas-microsoft-com:office:office" xmlns:v="urn:schemas-microsoft-com:vml" xmlns:w10="urn:schemas-microsoft-com:office:word" xmlns:a="http://schemas.openxmlformats.org/drawingml/2006/main" xmlns:pic="http://schemas.openxmlformats.org/drawingml/2006/picture" xmlns:wp="http://schemas.openxmlformats.org/drawingml/2006/wordprocessingDrawing">
+<w:document xmlns:m="http://schemas.openxmlformats.org/officeDocument/2006/math" xmlns:r="http://schemas.openxmlformats.org/officeDocument/2006/relationships" xmlns:w="http://schemas.openxmlformats.org/wordprocessingml/2006/main">
   <w:body>
     <w:p>
       <w:pPr>
@@ -51,6 +51,10 @@
           </w:r>
         </w:p>
         <w:p>
+          <w:pPr>
+            <w:jc w:val="both"/>
+            <w:spacing w:line="480" w:lineRule="auto"/>
+          </w:pPr>
           <w:r>
             <w:fldChar w:fldCharType="begin" w:dirty="true"/>
             <w:instrText xml:space="preserve">TOC \o "1-3" \h \z \u</w:instrText>
@@ -72,6 +76,8 @@
     <w:p>
       <w:pPr>
         <w:pStyle w:val="FirstParagraph"/>
+        <w:jc w:val="both"/>
+        <w:spacing w:line="480" w:lineRule="auto"/>
       </w:pPr>
       <w:r>
         <w:t xml:space="preserve">Integración de Benchmarking Técnico, Protocolo Reproducible (FOM-7) y</w:t>
@@ -86,6 +92,8 @@
     <w:p>
       <w:pPr>
         <w:pStyle w:val="Textoindependiente"/>
+        <w:jc w:val="both"/>
+        <w:spacing w:line="480" w:lineRule="auto"/>
       </w:pPr>
       <w:r>
         <w:br/>
@@ -104,6 +112,8 @@
     <w:p>
       <w:pPr>
         <w:pStyle w:val="FirstParagraph"/>
+        <w:jc w:val="both"/>
+        <w:spacing w:line="480" w:lineRule="auto"/>
       </w:pPr>
       <w:r>
         <w:t xml:space="preserve">Esta tesis propone un marco de evaluación multinivel para la Inteligencia Artificial Explicable (XAI) orientado a comparar métodos agnósticos al modelo bajo condiciones de benchmarking controladas y reproducibles. El trabajo responde a la “crisis de evaluación” en XAI articulando tres componentes complementarios: (i) un protocolo de operación reproducible de siete puertas (FOM-7) que conecta diseño experimental, calificación de artefactos e inferencia estadística admisible; (ii) un benchmark cuantitativo multi-métrico sobre datos tabulares reales que evalúa SHAP, LIME, Anchors y DiCE en cinco familias de modelos; y (iii) una taxonomía estructurada del espacio de métricas de evaluación XAI organizada en cuatro ejes (objetivo de evaluación, fuente de evidencia, propiedad de calidad y contexto de tarea).</w:t>
@@ -112,6 +122,8 @@
     <w:p>
       <w:pPr>
         <w:pStyle w:val="Textoindependiente"/>
+        <w:jc w:val="both"/>
+        <w:spacing w:line="480" w:lineRule="auto"/>
       </w:pPr>
       <w:r>
         <w:t xml:space="preserve">El estudio empírico se realiza sobre el conjunto Adult (UCI Adult Income) y operacionaliza cinco métricas primarias: fidelidad, estabilidad, parsimonia, brecha de fidelidad (</w:t>
@@ -130,6 +142,8 @@
     <w:p>
       <w:pPr>
         <w:pStyle w:val="Textoindependiente"/>
+        <w:jc w:val="both"/>
+        <w:spacing w:line="480" w:lineRule="auto"/>
       </w:pPr>
       <w:r>
         <w:rPr>
@@ -158,6 +172,8 @@
     <w:p>
       <w:pPr>
         <w:pStyle w:val="FirstParagraph"/>
+        <w:jc w:val="both"/>
+        <w:spacing w:line="480" w:lineRule="auto"/>
       </w:pPr>
       <w:r>
         <w:t xml:space="preserve">This thesis proposes a multilevel evaluation framework for Explainable Artificial Intelligence (XAI) aimed at comparing model-agnostic explainers under controlled and reproducible benchmarking conditions. To address the evaluation fragmentation in XAI, the framework integrates three complementary components: (i) a seven-gate operational protocol (FOM-7) that links experimental design, artifact qualification, and statistically admissible inference; (ii) a multi-metric quantitative benchmark on real-world tabular data evaluating SHAP, LIME, Anchors, and DiCE across five model families; and (iii) a structured taxonomy of XAI evaluation metrics organized along four axes (evaluation target, evidence source, quality property, and task context).</w:t>
@@ -166,6 +182,8 @@
     <w:p>
       <w:pPr>
         <w:pStyle w:val="Textoindependiente"/>
+        <w:jc w:val="both"/>
+        <w:spacing w:line="480" w:lineRule="auto"/>
       </w:pPr>
       <w:r>
         <w:t xml:space="preserve">The empirical study uses the Adult (UCI Adult Income) dataset and operationalizes five primary metrics: faithfulness, stability, parsimony, faithfulness gap, and computational cost. Confirmatory inference relies on nonparametric comparisons with multiplicity control and on a paired SHAP–LIME analysis to quantify the quality–cost trade-off. Results show large and consistent differences across methods: SHAP dominates in faithfulness and stability in the evaluated settings, whereas LIME becomes attractive when latency constraints dominate, at the cost of structurally unstable explanations. Anchors and DiCE address qualitatively different explanatory objectives than feature attribution. Overall, the thesis contributes a portable protocol and a conceptual framework to support operationally grounded XAI method selection and reproducible evidence accumulation.</w:t>
@@ -174,6 +192,8 @@
     <w:p>
       <w:pPr>
         <w:pStyle w:val="Textoindependiente"/>
+        <w:jc w:val="both"/>
+        <w:spacing w:line="480" w:lineRule="auto"/>
       </w:pPr>
       <w:r>
         <w:rPr>
@@ -202,6 +222,8 @@
     <w:p>
       <w:pPr>
         <w:pStyle w:val="FirstParagraph"/>
+        <w:jc w:val="both"/>
+        <w:spacing w:line="480" w:lineRule="auto"/>
       </w:pPr>
       <w:r>
         <w:t xml:space="preserve">El rápido avance de la inteligencia artificial (IA), particularmente en el</w:t>
@@ -352,6 +374,8 @@
     <w:p>
       <w:pPr>
         <w:pStyle w:val="Textoindependiente"/>
+        <w:jc w:val="both"/>
+        <w:spacing w:line="480" w:lineRule="auto"/>
       </w:pPr>
       <w:r>
         <w:t xml:space="preserve">A pesar de su potencial, los enfoques actuales de explicabilidad</w:t>
@@ -495,6 +519,8 @@
     <w:p>
       <w:pPr>
         <w:pStyle w:val="Textoindependiente"/>
+        <w:jc w:val="both"/>
+        <w:spacing w:line="480" w:lineRule="auto"/>
       </w:pPr>
       <w:r>
         <w:t xml:space="preserve">A los desafíos de estandarización se suman debilidades técnicas críticas en los</w:t>
@@ -605,6 +631,8 @@
     <w:p>
       <w:pPr>
         <w:pStyle w:val="Textoindependiente"/>
+        <w:jc w:val="both"/>
+        <w:spacing w:line="480" w:lineRule="auto"/>
       </w:pPr>
       <w:r>
         <w:t xml:space="preserve">Bajo esta premisa, la presente investigación busca cerrar esta brecha mediante</w:t>
@@ -685,6 +713,8 @@
     <w:p>
       <w:pPr>
         <w:pStyle w:val="Textoindependiente"/>
+        <w:jc w:val="both"/>
+        <w:spacing w:line="480" w:lineRule="auto"/>
       </w:pPr>
       <w:r>
         <w:t xml:space="preserve">Para alcanzar estos objetivos, el documento se estructura de manera lógica a</w:t>
@@ -833,6 +863,8 @@
     <w:p>
       <w:pPr>
         <w:pStyle w:val="FirstParagraph"/>
+        <w:jc w:val="both"/>
+        <w:spacing w:line="480" w:lineRule="auto"/>
       </w:pPr>
       <w:r>
         <w:t xml:space="preserve">Este capítulo establece el posicionamiento investigativo de la tesis. Se</w:t>
@@ -886,6 +918,8 @@
     <w:p>
       <w:pPr>
         <w:pStyle w:val="FirstParagraph"/>
+        <w:jc w:val="both"/>
+        <w:spacing w:line="480" w:lineRule="auto"/>
       </w:pPr>
       <w:r>
         <w:t xml:space="preserve">La Inteligencia Artificial Explicable (XAI) ha consolidado un ecosistema de</w:t>
@@ -1043,6 +1077,8 @@
     <w:p>
       <w:pPr>
         <w:pStyle w:val="Textoindependiente"/>
+        <w:jc w:val="both"/>
+        <w:spacing w:line="480" w:lineRule="auto"/>
       </w:pPr>
       <w:r>
         <w:t xml:space="preserve">La raíz técnica de este problema es doble. Por un lado, las métricas de</w:t>
@@ -1198,6 +1234,8 @@
     <w:p>
       <w:pPr>
         <w:pStyle w:val="Textoindependiente"/>
+        <w:jc w:val="both"/>
+        <w:spacing w:line="480" w:lineRule="auto"/>
       </w:pPr>
       <w:r>
         <w:t xml:space="preserve">El problema de investigación de esta tesis se formula en los siguientes</w:t>
@@ -1274,6 +1312,8 @@
     <w:p>
       <w:pPr>
         <w:pStyle w:val="FirstParagraph"/>
+        <w:jc w:val="both"/>
+        <w:spacing w:line="480" w:lineRule="auto"/>
       </w:pPr>
       <w:r>
         <w:t xml:space="preserve">Desde el punto de vista científico, esta investigación responde a una necesidad</w:t>
@@ -1357,6 +1397,8 @@
     <w:p>
       <w:pPr>
         <w:pStyle w:val="Textoindependiente"/>
+        <w:jc w:val="both"/>
+        <w:spacing w:line="480" w:lineRule="auto"/>
       </w:pPr>
       <w:r>
         <w:t xml:space="preserve">Desde el punto de vista práctico, los sistemas de IA se despliegan de forma</w:t>
@@ -1456,6 +1498,8 @@
     <w:p>
       <w:pPr>
         <w:pStyle w:val="FirstParagraph"/>
+        <w:jc w:val="both"/>
+        <w:spacing w:line="480" w:lineRule="auto"/>
       </w:pPr>
       <w:r>
         <w:t xml:space="preserve">Desarrollar y validar un marco de evaluación multinivel y reproducible para</w:t>
@@ -1501,6 +1545,8 @@
           <w:ilvl w:val="0"/>
           <w:numId w:val="1001"/>
         </w:numPr>
+        <w:jc w:val="both"/>
+        <w:spacing w:line="480" w:lineRule="auto"/>
       </w:pPr>
       <w:r>
         <w:t xml:space="preserve">Diseñar y formalizar un protocolo de benchmarking reproducible (FOM-7) que</w:t>
@@ -1533,6 +1579,8 @@
           <w:ilvl w:val="0"/>
           <w:numId w:val="1001"/>
         </w:numPr>
+        <w:jc w:val="both"/>
+        <w:spacing w:line="480" w:lineRule="auto"/>
       </w:pPr>
       <w:r>
         <w:t xml:space="preserve">Evaluar comparativamente cuatro métodos agnósticos —SHAP, LIME, Anchors y</w:t>
@@ -1568,6 +1616,8 @@
           <w:ilvl w:val="0"/>
           <w:numId w:val="1001"/>
         </w:numPr>
+        <w:jc w:val="both"/>
+        <w:spacing w:line="480" w:lineRule="auto"/>
       </w:pPr>
       <w:r>
         <w:t xml:space="preserve">Cuantificar las diferencias en el trade-off calidad-coste entre LIME y SHAP</w:t>
@@ -1591,6 +1641,8 @@
           <w:ilvl w:val="0"/>
           <w:numId w:val="1001"/>
         </w:numPr>
+        <w:jc w:val="both"/>
+        <w:spacing w:line="480" w:lineRule="auto"/>
       </w:pPr>
       <w:r>
         <w:t xml:space="preserve">Caracterizar el perfil de reproducibilidad del protocolo de benchmarking</w:t>
@@ -1614,6 +1666,8 @@
           <w:ilvl w:val="0"/>
           <w:numId w:val="1001"/>
         </w:numPr>
+        <w:jc w:val="both"/>
+        <w:spacing w:line="480" w:lineRule="auto"/>
       </w:pPr>
       <w:r>
         <w:t xml:space="preserve">Construir una taxonomía estructurada del espacio de métricas de evaluación</w:t>
@@ -1659,6 +1713,8 @@
     <w:p>
       <w:pPr>
         <w:pStyle w:val="FirstParagraph"/>
+        <w:jc w:val="both"/>
+        <w:spacing w:line="480" w:lineRule="auto"/>
       </w:pPr>
       <w:r>
         <w:t xml:space="preserve">Las hipótesis estadísticas formales se estructuran en torno a los tres ejes</w:t>
@@ -1673,6 +1729,8 @@
     <w:p>
       <w:pPr>
         <w:pStyle w:val="Textoindependiente"/>
+        <w:jc w:val="both"/>
+        <w:spacing w:line="480" w:lineRule="auto"/>
       </w:pPr>
       <w:r>
         <w:rPr>
@@ -1685,6 +1743,8 @@
     <w:p>
       <w:pPr>
         <w:pStyle w:val="Textoindependiente"/>
+        <w:jc w:val="both"/>
+        <w:spacing w:line="480" w:lineRule="auto"/>
       </w:pPr>
       <m:oMath>
         <m:sSub>
@@ -1722,6 +1782,8 @@
     <w:p>
       <w:pPr>
         <w:pStyle w:val="Textoindependiente"/>
+        <w:jc w:val="both"/>
+        <w:spacing w:line="480" w:lineRule="auto"/>
       </w:pPr>
       <m:oMath>
         <m:sSub>
@@ -1753,6 +1815,8 @@
     <w:p>
       <w:pPr>
         <w:pStyle w:val="Textoindependiente"/>
+        <w:jc w:val="both"/>
+        <w:spacing w:line="480" w:lineRule="auto"/>
       </w:pPr>
       <w:r>
         <w:rPr>
@@ -1765,6 +1829,8 @@
     <w:p>
       <w:pPr>
         <w:pStyle w:val="Textoindependiente"/>
+        <w:jc w:val="both"/>
+        <w:spacing w:line="480" w:lineRule="auto"/>
       </w:pPr>
       <m:oMath>
         <m:sSub>
@@ -1802,6 +1868,8 @@
     <w:p>
       <w:pPr>
         <w:pStyle w:val="Textoindependiente"/>
+        <w:jc w:val="both"/>
+        <w:spacing w:line="480" w:lineRule="auto"/>
       </w:pPr>
       <m:oMath>
         <m:sSub>
@@ -1833,6 +1901,8 @@
     <w:p>
       <w:pPr>
         <w:pStyle w:val="Textoindependiente"/>
+        <w:jc w:val="both"/>
+        <w:spacing w:line="480" w:lineRule="auto"/>
       </w:pPr>
       <w:r>
         <w:rPr>
@@ -1845,6 +1915,8 @@
     <w:p>
       <w:pPr>
         <w:pStyle w:val="Textoindependiente"/>
+        <w:jc w:val="both"/>
+        <w:spacing w:line="480" w:lineRule="auto"/>
       </w:pPr>
       <m:oMath>
         <m:sSub>
@@ -1882,6 +1954,8 @@
     <w:p>
       <w:pPr>
         <w:pStyle w:val="Textoindependiente"/>
+        <w:jc w:val="both"/>
+        <w:spacing w:line="480" w:lineRule="auto"/>
       </w:pPr>
       <m:oMath>
         <m:sSub>
@@ -1919,6 +1993,8 @@
     <w:p>
       <w:pPr>
         <w:pStyle w:val="Textoindependiente"/>
+        <w:jc w:val="both"/>
+        <w:spacing w:line="480" w:lineRule="auto"/>
       </w:pPr>
       <w:r>
         <w:rPr>
@@ -1931,6 +2007,8 @@
     <w:p>
       <w:pPr>
         <w:pStyle w:val="Textoindependiente"/>
+        <w:jc w:val="both"/>
+        <w:spacing w:line="480" w:lineRule="auto"/>
       </w:pPr>
       <w:r>
         <w:t xml:space="preserve">El protocolo FOM-7 produce un coeficiente de variación (CV) inferior al 15% en</w:t>
@@ -1957,6 +2035,8 @@
     <w:p>
       <w:pPr>
         <w:pStyle w:val="Textoindependiente"/>
+        <w:jc w:val="both"/>
+        <w:spacing w:line="480" w:lineRule="auto"/>
       </w:pPr>
       <w:r>
         <w:t xml:space="preserve">Las hipótesis H1 y H2 se contrastan mediante la prueba de Friedman con bloques</w:t>
@@ -2057,6 +2137,8 @@
     <w:p>
       <w:pPr>
         <w:pStyle w:val="FirstParagraph"/>
+        <w:jc w:val="both"/>
+        <w:spacing w:line="480" w:lineRule="auto"/>
       </w:pPr>
       <w:r>
         <w:t xml:space="preserve">Esta investigación adopta un enfoque cuantitativo-empírico con componente</w:t>
@@ -2120,6 +2202,8 @@
     <w:p>
       <w:pPr>
         <w:pStyle w:val="FirstParagraph"/>
+        <w:jc w:val="both"/>
+        <w:spacing w:line="480" w:lineRule="auto"/>
       </w:pPr>
       <w:r>
         <w:t xml:space="preserve">Los Estudios A y B corresponden a investigación comparativa-experimental no</w:t>
@@ -2168,6 +2252,8 @@
     <w:p>
       <w:pPr>
         <w:pStyle w:val="FirstParagraph"/>
+        <w:jc w:val="both"/>
+        <w:spacing w:line="480" w:lineRule="auto"/>
       </w:pPr>
       <w:r>
         <w:t xml:space="preserve">El universo experimental está constituido por el conjunto de problemas de</w:t>
@@ -2262,6 +2348,8 @@
     <w:p>
       <w:pPr>
         <w:pStyle w:val="FirstParagraph"/>
+        <w:jc w:val="both"/>
+        <w:spacing w:line="480" w:lineRule="auto"/>
       </w:pPr>
       <w:r>
         <w:t xml:space="preserve">El diseño experimental adopta una estructura factorial cruzada. Las familias de</w:t>
@@ -2605,6 +2693,8 @@
     <w:p>
       <w:pPr>
         <w:pStyle w:val="FirstParagraph"/>
+        <w:jc w:val="both"/>
+        <w:spacing w:line="480" w:lineRule="auto"/>
       </w:pPr>
       <w:r>
         <w:rPr>
@@ -2621,6 +2711,8 @@
           <w:ilvl w:val="0"/>
           <w:numId w:val="1002"/>
         </w:numPr>
+        <w:jc w:val="both"/>
+        <w:spacing w:line="480" w:lineRule="auto"/>
       </w:pPr>
       <w:r>
         <w:t xml:space="preserve">Artefactos de resultado (</w:t>
@@ -2648,6 +2740,8 @@
           <w:ilvl w:val="0"/>
           <w:numId w:val="1002"/>
         </w:numPr>
+        <w:jc w:val="both"/>
+        <w:spacing w:line="480" w:lineRule="auto"/>
       </w:pPr>
       <w:r>
         <w:t xml:space="preserve">Ejecuciones pertenecientes al benchmark primario de robustez (EXP2), cuya</w:t>
@@ -2672,6 +2766,8 @@
           <w:ilvl w:val="0"/>
           <w:numId w:val="1002"/>
         </w:numPr>
+        <w:jc w:val="both"/>
+        <w:spacing w:line="480" w:lineRule="auto"/>
       </w:pPr>
       <w:r>
         <w:t xml:space="preserve">Celdas para las que existen artefactos en ambos métodos comparados (SHAP y</w:t>
@@ -2686,6 +2782,8 @@
     <w:p>
       <w:pPr>
         <w:pStyle w:val="FirstParagraph"/>
+        <w:jc w:val="both"/>
+        <w:spacing w:line="480" w:lineRule="auto"/>
       </w:pPr>
       <w:r>
         <w:rPr>
@@ -2702,6 +2800,8 @@
           <w:ilvl w:val="0"/>
           <w:numId w:val="1003"/>
         </w:numPr>
+        <w:jc w:val="both"/>
+        <w:spacing w:line="480" w:lineRule="auto"/>
       </w:pPr>
       <w:r>
         <w:t xml:space="preserve">Artefactos vacíos o con esquema incompatible detectados en la auditoría de</w:t>
@@ -2720,6 +2820,8 @@
           <w:ilvl w:val="0"/>
           <w:numId w:val="1003"/>
         </w:numPr>
+        <w:jc w:val="both"/>
+        <w:spacing w:line="480" w:lineRule="auto"/>
       </w:pPr>
       <w:r>
         <w:t xml:space="preserve">Ejecuciones pertenecientes a la fase de calibración (EXP1), que tienen rol de</w:t>
@@ -2738,6 +2840,8 @@
           <w:ilvl w:val="0"/>
           <w:numId w:val="1003"/>
         </w:numPr>
+        <w:jc w:val="both"/>
+        <w:spacing w:line="480" w:lineRule="auto"/>
       </w:pPr>
       <w:r>
         <w:t xml:space="preserve">Reconstrucciones sintéticas de artefactos faltantes; únicamente se acepta como</w:t>
@@ -2783,6 +2887,8 @@
     <w:p>
       <w:pPr>
         <w:pStyle w:val="FirstParagraph"/>
+        <w:jc w:val="both"/>
+        <w:spacing w:line="480" w:lineRule="auto"/>
       </w:pPr>
       <w:r>
         <w:t xml:space="preserve">Las</w:t>
@@ -2871,6 +2977,8 @@
           <w:ilvl w:val="0"/>
           <w:numId w:val="1004"/>
         </w:numPr>
+        <w:jc w:val="both"/>
+        <w:spacing w:line="480" w:lineRule="auto"/>
       </w:pPr>
       <w:r>
         <w:rPr>
@@ -2902,6 +3010,8 @@
           <w:ilvl w:val="0"/>
           <w:numId w:val="1004"/>
         </w:numPr>
+        <w:jc w:val="both"/>
+        <w:spacing w:line="480" w:lineRule="auto"/>
       </w:pPr>
       <w:r>
         <w:rPr>
@@ -2927,6 +3037,8 @@
           <w:ilvl w:val="0"/>
           <w:numId w:val="1004"/>
         </w:numPr>
+        <w:jc w:val="both"/>
+        <w:spacing w:line="480" w:lineRule="auto"/>
       </w:pPr>
       <w:r>
         <w:rPr>
@@ -2965,6 +3077,8 @@
           <w:ilvl w:val="0"/>
           <w:numId w:val="1004"/>
         </w:numPr>
+        <w:jc w:val="both"/>
+        <w:spacing w:line="480" w:lineRule="auto"/>
       </w:pPr>
       <w:r>
         <w:rPr>
@@ -3009,6 +3123,8 @@
           <w:ilvl w:val="0"/>
           <w:numId w:val="1004"/>
         </w:numPr>
+        <w:jc w:val="both"/>
+        <w:spacing w:line="480" w:lineRule="auto"/>
       </w:pPr>
       <w:r>
         <w:rPr>
@@ -3030,6 +3146,8 @@
     <w:p>
       <w:pPr>
         <w:pStyle w:val="FirstParagraph"/>
+        <w:jc w:val="both"/>
+        <w:spacing w:line="480" w:lineRule="auto"/>
       </w:pPr>
       <w:r>
         <w:t xml:space="preserve">La unidad de análisis inferencial es la ejecución agregada a nivel de bloque</w:t>
@@ -3070,6 +3188,8 @@
     <w:p>
       <w:pPr>
         <w:pStyle w:val="Textoindependiente"/>
+        <w:jc w:val="both"/>
+        <w:spacing w:line="480" w:lineRule="auto"/>
       </w:pPr>
       <w:r>
         <w:t xml:space="preserve">La definición operativa de estas dimensiones y sus modos de medición sigue las</w:t>
@@ -3103,6 +3223,8 @@
     <w:p>
       <w:pPr>
         <w:pStyle w:val="FirstParagraph"/>
+        <w:jc w:val="both"/>
+        <w:spacing w:line="480" w:lineRule="auto"/>
       </w:pPr>
       <w:r>
         <w:t xml:space="preserve">La estrategia procedimental se organiza en torno al protocolo FOM-7 (</w:t>
@@ -3159,6 +3281,8 @@
     <w:p>
       <w:pPr>
         <w:pStyle w:val="Textoindependiente"/>
+        <w:jc w:val="both"/>
+        <w:spacing w:line="480" w:lineRule="auto"/>
       </w:pPr>
       <w:r>
         <w:t xml:space="preserve">Las siete puertas secuenciales son:</w:t>
@@ -3171,6 +3295,8 @@
           <w:ilvl w:val="0"/>
           <w:numId w:val="1005"/>
         </w:numPr>
+        <w:jc w:val="both"/>
+        <w:spacing w:line="480" w:lineRule="auto"/>
       </w:pPr>
       <w:r>
         <w:rPr>
@@ -3202,6 +3328,8 @@
           <w:ilvl w:val="0"/>
           <w:numId w:val="1005"/>
         </w:numPr>
+        <w:jc w:val="both"/>
+        <w:spacing w:line="480" w:lineRule="auto"/>
       </w:pPr>
       <w:r>
         <w:rPr>
@@ -3227,6 +3355,8 @@
           <w:ilvl w:val="0"/>
           <w:numId w:val="1005"/>
         </w:numPr>
+        <w:jc w:val="both"/>
+        <w:spacing w:line="480" w:lineRule="auto"/>
       </w:pPr>
       <w:r>
         <w:rPr>
@@ -3252,6 +3382,8 @@
           <w:ilvl w:val="0"/>
           <w:numId w:val="1005"/>
         </w:numPr>
+        <w:jc w:val="both"/>
+        <w:spacing w:line="480" w:lineRule="auto"/>
       </w:pPr>
       <w:r>
         <w:rPr>
@@ -3277,6 +3409,8 @@
           <w:ilvl w:val="0"/>
           <w:numId w:val="1005"/>
         </w:numPr>
+        <w:jc w:val="both"/>
+        <w:spacing w:line="480" w:lineRule="auto"/>
       </w:pPr>
       <w:r>
         <w:rPr>
@@ -3302,6 +3436,8 @@
           <w:ilvl w:val="0"/>
           <w:numId w:val="1005"/>
         </w:numPr>
+        <w:jc w:val="both"/>
+        <w:spacing w:line="480" w:lineRule="auto"/>
       </w:pPr>
       <w:r>
         <w:rPr>
@@ -3333,6 +3469,8 @@
           <w:ilvl w:val="0"/>
           <w:numId w:val="1005"/>
         </w:numPr>
+        <w:jc w:val="both"/>
+        <w:spacing w:line="480" w:lineRule="auto"/>
       </w:pPr>
       <w:r>
         <w:rPr>
@@ -3360,6 +3498,8 @@
     <w:p>
       <w:pPr>
         <w:pStyle w:val="FirstParagraph"/>
+        <w:jc w:val="both"/>
+        <w:spacing w:line="480" w:lineRule="auto"/>
       </w:pPr>
       <w:r>
         <w:t xml:space="preserve">La secuencia experimental distingue dos cohortes de evidencia con roles</w:t>
@@ -3440,6 +3580,8 @@
     <w:p>
       <w:pPr>
         <w:pStyle w:val="FirstParagraph"/>
+        <w:jc w:val="both"/>
+        <w:spacing w:line="480" w:lineRule="auto"/>
       </w:pPr>
       <w:r>
         <w:t xml:space="preserve">El campo de la Inteligencia Artificial Explicable (XAI) ha experimentado una</w:t>
@@ -3562,6 +3704,8 @@
     <w:p>
       <w:pPr>
         <w:pStyle w:val="Textoindependiente"/>
+        <w:jc w:val="both"/>
+        <w:spacing w:line="480" w:lineRule="auto"/>
       </w:pPr>
       <w:r>
         <w:t xml:space="preserve">Esta fragmentación ha dado lugar a lo que</w:t>
@@ -3724,6 +3868,8 @@
     <w:p>
       <w:pPr>
         <w:pStyle w:val="FirstParagraph"/>
+        <w:jc w:val="both"/>
+        <w:spacing w:line="480" w:lineRule="auto"/>
       </w:pPr>
       <w:r>
         <w:t xml:space="preserve">Para comprender el estado actual de la XAI, es imperativo analizar la naturaleza</w:t>
@@ -3863,6 +4009,8 @@
     <w:p>
       <w:pPr>
         <w:pStyle w:val="FirstParagraph"/>
+        <w:jc w:val="both"/>
+        <w:spacing w:line="480" w:lineRule="auto"/>
       </w:pPr>
       <w:r>
         <w:t xml:space="preserve">A pesar de que los términos</w:t>
@@ -3964,6 +4112,8 @@
     <w:p>
       <w:pPr>
         <w:pStyle w:val="Textoindependiente"/>
+        <w:jc w:val="both"/>
+        <w:spacing w:line="480" w:lineRule="auto"/>
       </w:pPr>
       <w:r>
         <w:t xml:space="preserve">Siguiendo la propuesta de</w:t>
@@ -4121,6 +4271,8 @@
     <w:p>
       <w:pPr>
         <w:pStyle w:val="FirstParagraph"/>
+        <w:jc w:val="both"/>
+        <w:spacing w:line="480" w:lineRule="auto"/>
       </w:pPr>
       <w:r>
         <w:t xml:space="preserve">La evaluación de la calidad de una explicación es un proceso multidimensional que</w:t>
@@ -4183,6 +4335,8 @@
     <w:p>
       <w:pPr>
         <w:pStyle w:val="FirstParagraph"/>
+        <w:jc w:val="both"/>
+        <w:spacing w:line="480" w:lineRule="auto"/>
       </w:pPr>
       <w:r>
         <w:t xml:space="preserve">La fidelidad (</w:t>
@@ -4230,6 +4384,8 @@
     <w:p>
       <w:pPr>
         <w:pStyle w:val="Textoindependiente"/>
+        <w:jc w:val="both"/>
+        <w:spacing w:line="480" w:lineRule="auto"/>
       </w:pPr>
       <m:oMathPara>
         <m:oMathParaPr>
@@ -4430,6 +4586,8 @@
     <w:p>
       <w:pPr>
         <w:pStyle w:val="FirstParagraph"/>
+        <w:jc w:val="both"/>
+        <w:spacing w:line="480" w:lineRule="auto"/>
       </w:pPr>
       <w:r>
         <w:t xml:space="preserve">Donde</w:t>
@@ -4542,6 +4700,8 @@
     <w:p>
       <w:pPr>
         <w:pStyle w:val="FirstParagraph"/>
+        <w:jc w:val="both"/>
+        <w:spacing w:line="480" w:lineRule="auto"/>
       </w:pPr>
       <w:r>
         <w:t xml:space="preserve">La estabilidad evalúa la consistencia de las explicaciones ante variaciones</w:t>
@@ -4599,6 +4759,8 @@
     <w:p>
       <w:pPr>
         <w:pStyle w:val="Textoindependiente"/>
+        <w:jc w:val="both"/>
+        <w:spacing w:line="480" w:lineRule="auto"/>
       </w:pPr>
       <m:oMathPara>
         <m:oMathParaPr>
@@ -4794,6 +4956,8 @@
     <w:p>
       <w:pPr>
         <w:pStyle w:val="FirstParagraph"/>
+        <w:jc w:val="both"/>
+        <w:spacing w:line="480" w:lineRule="auto"/>
       </w:pPr>
       <w:r>
         <w:t xml:space="preserve">Donde</w:t>
@@ -4881,6 +5045,8 @@
     <w:p>
       <w:pPr>
         <w:pStyle w:val="FirstParagraph"/>
+        <w:jc w:val="both"/>
+        <w:spacing w:line="480" w:lineRule="auto"/>
       </w:pPr>
       <w:r>
         <w:t xml:space="preserve">A diferencia de la estabilidad, la robustez se enfoca en la resistencia del</w:t>
@@ -4950,6 +5116,8 @@
     <w:p>
       <w:pPr>
         <w:pStyle w:val="FirstParagraph"/>
+        <w:jc w:val="both"/>
+        <w:spacing w:line="480" w:lineRule="auto"/>
       </w:pPr>
       <w:r>
         <w:t xml:space="preserve">La complejidad de una explicación debe estar alineada con las capacidades</w:t>
@@ -5051,6 +5219,8 @@
     <w:p>
       <w:pPr>
         <w:pStyle w:val="FirstParagraph"/>
+        <w:jc w:val="both"/>
+        <w:spacing w:line="480" w:lineRule="auto"/>
       </w:pPr>
       <w:r>
         <w:t xml:space="preserve">La eficiencia computacional es un criterio pragmático indispensable. Existe una</w:t>
@@ -5096,6 +5266,8 @@
     <w:p>
       <w:pPr>
         <w:pStyle w:val="FirstParagraph"/>
+        <w:jc w:val="both"/>
+        <w:spacing w:line="480" w:lineRule="auto"/>
       </w:pPr>
       <w:r>
         <w:t xml:space="preserve">Finalmente, se introduce la alineación causal, que evalúa si las características</w:t>
@@ -5167,6 +5339,8 @@
     <w:p>
       <w:pPr>
         <w:pStyle w:val="FirstParagraph"/>
+        <w:jc w:val="both"/>
+        <w:spacing w:line="480" w:lineRule="auto"/>
       </w:pPr>
       <w:r>
         <w:t xml:space="preserve">Este capítulo describe el diseño empírico de los dos estudios que conforman el</w:t>
@@ -5253,6 +5427,8 @@
     <w:p>
       <w:pPr>
         <w:pStyle w:val="Textoindependiente"/>
+        <w:jc w:val="both"/>
+        <w:spacing w:line="480" w:lineRule="auto"/>
       </w:pPr>
       <w:r>
         <w:t xml:space="preserve">Además de estos dos estudios confirmativos, la tesis incorpora una capa</w:t>
@@ -5312,6 +5488,8 @@
     <w:p>
       <w:pPr>
         <w:pStyle w:val="FirstParagraph"/>
+        <w:jc w:val="both"/>
+        <w:spacing w:line="480" w:lineRule="auto"/>
       </w:pPr>
       <w:r>
         <w:t xml:space="preserve">El diseño experimental distingue dos cohortes de evidencia con roles</w:t>
@@ -5350,6 +5528,8 @@
     <w:p>
       <w:pPr>
         <w:pStyle w:val="FirstParagraph"/>
+        <w:jc w:val="both"/>
+        <w:spacing w:line="480" w:lineRule="auto"/>
       </w:pPr>
       <w:r>
         <w:t xml:space="preserve">La Fase EXP1 tiene por objetivos: verificar la correcta implementación del</w:t>
@@ -5382,6 +5562,8 @@
     <w:p>
       <w:pPr>
         <w:pStyle w:val="Textoindependiente"/>
+        <w:jc w:val="both"/>
+        <w:spacing w:line="480" w:lineRule="auto"/>
       </w:pPr>
       <w:r>
         <w:t xml:space="preserve">EXP1 opera sobre dos familias de modelos —bosque aleatorio (</w:t>
@@ -5465,6 +5647,8 @@
     <w:p>
       <w:pPr>
         <w:pStyle w:val="Textoindependiente"/>
+        <w:jc w:val="both"/>
+        <w:spacing w:line="480" w:lineRule="auto"/>
       </w:pPr>
       <w:r>
         <w:t xml:space="preserve">El rendimiento predictivo de los cinco modelos entrenados en EXP1 y evaluados</w:t>
@@ -6152,6 +6336,8 @@
     <w:p>
       <w:pPr>
         <w:pStyle w:val="Textoindependiente"/>
+        <w:jc w:val="both"/>
+        <w:spacing w:line="480" w:lineRule="auto"/>
       </w:pPr>
       <w:r>
         <w:t xml:space="preserve">Todos los modelos superan los umbrales de inclusión definidos en el protocolo:</w:t>
@@ -6227,6 +6413,8 @@
     <w:p>
       <w:pPr>
         <w:pStyle w:val="Textoindependiente"/>
+        <w:jc w:val="both"/>
+        <w:spacing w:line="480" w:lineRule="auto"/>
       </w:pPr>
       <w:r>
         <w:t xml:space="preserve">El perfilado de reproducibilidad de EXP1 establece que las métricas de calidad</w:t>
@@ -6468,6 +6656,8 @@
     <w:p>
       <w:pPr>
         <w:pStyle w:val="FirstParagraph"/>
+        <w:jc w:val="both"/>
+        <w:spacing w:line="480" w:lineRule="auto"/>
       </w:pPr>
       <w:r>
         <w:t xml:space="preserve">La Fase EXP2 es la cohorte de evidencia confirmativa. Expande EXP1 a los cinco</w:t>
@@ -6520,6 +6710,8 @@
     <w:p>
       <w:pPr>
         <w:pStyle w:val="FirstParagraph"/>
+        <w:jc w:val="both"/>
+        <w:spacing w:line="480" w:lineRule="auto"/>
       </w:pPr>
       <w:r>
         <w:t xml:space="preserve">Ambos estudios utilizan el conjunto de datos UCI Adult Income</w:t>
@@ -6564,6 +6756,8 @@
     <w:p>
       <w:pPr>
         <w:pStyle w:val="Textoindependiente"/>
+        <w:jc w:val="both"/>
+        <w:spacing w:line="480" w:lineRule="auto"/>
       </w:pPr>
       <w:r>
         <w:t xml:space="preserve">El conjunto contiene 48,842 instancias, 14 características originales (6</w:t>
@@ -6647,6 +6841,8 @@
     <w:p>
       <w:pPr>
         <w:pStyle w:val="FirstParagraph"/>
+        <w:jc w:val="both"/>
+        <w:spacing w:line="480" w:lineRule="auto"/>
       </w:pPr>
       <w:r>
         <w:t xml:space="preserve">El conjunto se carga mediante</w:t>
@@ -6784,6 +6980,8 @@
     <w:p>
       <w:pPr>
         <w:pStyle w:val="Textoindependiente"/>
+        <w:jc w:val="both"/>
+        <w:spacing w:line="480" w:lineRule="auto"/>
       </w:pPr>
       <w:r>
         <w:t xml:space="preserve">La partición sigue el esquema estratificado:</w:t>
@@ -6792,6 +6990,8 @@
     <w:p>
       <w:pPr>
         <w:pStyle w:val="Textoindependiente"/>
+        <w:jc w:val="both"/>
+        <w:spacing w:line="480" w:lineRule="auto"/>
       </w:pPr>
       <m:oMathPara>
         <m:oMathParaPr>
@@ -6890,6 +7090,8 @@
     <w:p>
       <w:pPr>
         <w:pStyle w:val="FirstParagraph"/>
+        <w:jc w:val="both"/>
+        <w:spacing w:line="480" w:lineRule="auto"/>
       </w:pPr>
       <w:r>
         <w:t xml:space="preserve">Para la semilla canónica</w:t>
@@ -6934,6 +7136,8 @@
     <w:p>
       <w:pPr>
         <w:pStyle w:val="FirstParagraph"/>
+        <w:jc w:val="both"/>
+        <w:spacing w:line="480" w:lineRule="auto"/>
       </w:pPr>
       <w:r>
         <w:t xml:space="preserve">Los cuatro controles de fuga de datos se aplican de forma uniforme a todos</w:t>
@@ -6952,6 +7156,8 @@
           <w:ilvl w:val="0"/>
           <w:numId w:val="1006"/>
         </w:numPr>
+        <w:jc w:val="both"/>
+        <w:spacing w:line="480" w:lineRule="auto"/>
       </w:pPr>
       <w:r>
         <w:t xml:space="preserve">La partición estratificada se realiza</w:t>
@@ -6986,6 +7192,8 @@
           <w:ilvl w:val="0"/>
           <w:numId w:val="1006"/>
         </w:numPr>
+        <w:jc w:val="both"/>
+        <w:spacing w:line="480" w:lineRule="auto"/>
       </w:pPr>
       <w:r>
         <w:rPr>
@@ -7059,6 +7267,8 @@
           <w:ilvl w:val="0"/>
           <w:numId w:val="1006"/>
         </w:numPr>
+        <w:jc w:val="both"/>
+        <w:spacing w:line="480" w:lineRule="auto"/>
       </w:pPr>
       <w:r>
         <w:t xml:space="preserve">El preprocesador ajustado se persiste como artefacto y es</w:t>
@@ -7093,6 +7303,8 @@
           <w:ilvl w:val="0"/>
           <w:numId w:val="1006"/>
         </w:numPr>
+        <w:jc w:val="both"/>
+        <w:spacing w:line="480" w:lineRule="auto"/>
       </w:pPr>
       <w:r>
         <w:t xml:space="preserve">Las explicaciones se generan sobre el espacio de características</w:t>
@@ -7118,6 +7330,8 @@
     <w:p>
       <w:pPr>
         <w:pStyle w:val="FirstParagraph"/>
+        <w:jc w:val="both"/>
+        <w:spacing w:line="480" w:lineRule="auto"/>
       </w:pPr>
       <w:r>
         <w:t xml:space="preserve">El benchmark primario adopta una estructura factorial cruzada de cuatro</w:t>
@@ -7132,6 +7346,8 @@
     <w:p>
       <w:pPr>
         <w:pStyle w:val="Textoindependiente"/>
+        <w:jc w:val="both"/>
+        <w:spacing w:line="480" w:lineRule="auto"/>
       </w:pPr>
       <m:oMathPara>
         <m:oMathParaPr>
@@ -7187,6 +7403,8 @@
     <w:p>
       <w:pPr>
         <w:pStyle w:val="FirstParagraph"/>
+        <w:jc w:val="both"/>
+        <w:spacing w:line="480" w:lineRule="auto"/>
       </w:pPr>
       <w:r>
         <w:t xml:space="preserve">donde:</w:t>
@@ -7199,6 +7417,8 @@
           <w:ilvl w:val="0"/>
           <w:numId w:val="1007"/>
         </w:numPr>
+        <w:jc w:val="both"/>
+        <w:spacing w:line="480" w:lineRule="auto"/>
       </w:pPr>
       <m:oMath>
         <m:r>
@@ -7308,6 +7528,8 @@
           <w:ilvl w:val="0"/>
           <w:numId w:val="1007"/>
         </w:numPr>
+        <w:jc w:val="both"/>
+        <w:spacing w:line="480" w:lineRule="auto"/>
       </w:pPr>
       <m:oMath>
         <m:r>
@@ -7407,6 +7629,8 @@
           <w:ilvl w:val="0"/>
           <w:numId w:val="1007"/>
         </w:numPr>
+        <w:jc w:val="both"/>
+        <w:spacing w:line="480" w:lineRule="auto"/>
       </w:pPr>
       <m:oMath>
         <m:r>
@@ -7502,6 +7726,8 @@
           <w:ilvl w:val="0"/>
           <w:numId w:val="1007"/>
         </w:numPr>
+        <w:jc w:val="both"/>
+        <w:spacing w:line="480" w:lineRule="auto"/>
       </w:pPr>
       <m:oMath>
         <m:r>
@@ -7563,6 +7789,8 @@
     <w:p>
       <w:pPr>
         <w:pStyle w:val="FirstParagraph"/>
+        <w:jc w:val="both"/>
+        <w:spacing w:line="480" w:lineRule="auto"/>
       </w:pPr>
       <w:r>
         <w:t xml:space="preserve">El tamaño del diseño planificado es:</w:t>
@@ -7571,6 +7799,8 @@
     <w:p>
       <w:pPr>
         <w:pStyle w:val="Textoindependiente"/>
+        <w:jc w:val="both"/>
+        <w:spacing w:line="480" w:lineRule="auto"/>
       </w:pPr>
       <m:oMathPara>
         <m:oMathParaPr>
@@ -7654,6 +7884,8 @@
     <w:p>
       <w:pPr>
         <w:pStyle w:val="FirstParagraph"/>
+        <w:jc w:val="both"/>
+        <w:spacing w:line="480" w:lineRule="auto"/>
       </w:pPr>
       <w:r>
         <w:t xml:space="preserve">Cada celda</w:t>
@@ -7770,6 +8002,8 @@
     <w:p>
       <w:pPr>
         <w:pStyle w:val="FirstParagraph"/>
+        <w:jc w:val="both"/>
+        <w:spacing w:line="480" w:lineRule="auto"/>
       </w:pPr>
       <w:r>
         <w:t xml:space="preserve">Para evitar la pseudo-replicación, el análisis adopta una estructura</w:t>
@@ -7788,6 +8022,8 @@
           <w:ilvl w:val="0"/>
           <w:numId w:val="1008"/>
         </w:numPr>
+        <w:jc w:val="both"/>
+        <w:spacing w:line="480" w:lineRule="auto"/>
       </w:pPr>
       <w:r>
         <w:rPr>
@@ -7816,6 +8052,8 @@
           <w:ilvl w:val="0"/>
           <w:numId w:val="1008"/>
         </w:numPr>
+        <w:jc w:val="both"/>
+        <w:spacing w:line="480" w:lineRule="auto"/>
       </w:pPr>
       <w:r>
         <w:rPr>
@@ -7953,6 +8191,8 @@
           <w:ilvl w:val="0"/>
           <w:numId w:val="1008"/>
         </w:numPr>
+        <w:jc w:val="both"/>
+        <w:spacing w:line="480" w:lineRule="auto"/>
       </w:pPr>
       <w:r>
         <w:rPr>
@@ -8050,6 +8290,8 @@
     <w:p>
       <w:pPr>
         <w:pStyle w:val="FirstParagraph"/>
+        <w:jc w:val="both"/>
+        <w:spacing w:line="480" w:lineRule="auto"/>
       </w:pPr>
       <w:r>
         <w:t xml:space="preserve">La unidad inferencial primaria del Estudio B es la</w:t>
@@ -8135,6 +8377,8 @@
     <w:p>
       <w:pPr>
         <w:pStyle w:val="FirstParagraph"/>
+        <w:jc w:val="both"/>
+        <w:spacing w:line="480" w:lineRule="auto"/>
       </w:pPr>
       <w:r>
         <w:t xml:space="preserve">Las instancias para cada ejecución se seleccionan mediante muestreo</w:t>
@@ -8175,6 +8419,8 @@
     <w:p>
       <w:pPr>
         <w:pStyle w:val="Textoindependiente"/>
+        <w:jc w:val="both"/>
+        <w:spacing w:line="480" w:lineRule="auto"/>
       </w:pPr>
       <m:oMathPara>
         <m:oMathParaPr>
@@ -8342,6 +8588,8 @@
     <w:p>
       <w:pPr>
         <w:pStyle w:val="FirstParagraph"/>
+        <w:jc w:val="both"/>
+        <w:spacing w:line="480" w:lineRule="auto"/>
       </w:pPr>
       <w:r>
         <w:t xml:space="preserve">El tamaño nominal por ejecución es</w:t>
@@ -8398,6 +8646,8 @@
     <w:p>
       <w:pPr>
         <w:pStyle w:val="FirstParagraph"/>
+        <w:jc w:val="both"/>
+        <w:spacing w:line="480" w:lineRule="auto"/>
       </w:pPr>
       <w:r>
         <w:t xml:space="preserve">Todos los métodos se ejecutan a través de</w:t>
@@ -8430,6 +8680,8 @@
     <w:p>
       <w:pPr>
         <w:pStyle w:val="Textoindependiente"/>
+        <w:jc w:val="both"/>
+        <w:spacing w:line="480" w:lineRule="auto"/>
       </w:pPr>
       <w:r>
         <w:rPr>
@@ -8592,6 +8844,8 @@
     <w:p>
       <w:pPr>
         <w:pStyle w:val="Textoindependiente"/>
+        <w:jc w:val="both"/>
+        <w:spacing w:line="480" w:lineRule="auto"/>
       </w:pPr>
       <w:r>
         <w:rPr>
@@ -8664,6 +8918,8 @@
     <w:p>
       <w:pPr>
         <w:pStyle w:val="Textoindependiente"/>
+        <w:jc w:val="both"/>
+        <w:spacing w:line="480" w:lineRule="auto"/>
       </w:pPr>
       <w:r>
         <w:rPr>
@@ -8742,6 +8998,8 @@
     <w:p>
       <w:pPr>
         <w:pStyle w:val="Textoindependiente"/>
+        <w:jc w:val="both"/>
+        <w:spacing w:line="480" w:lineRule="auto"/>
       </w:pPr>
       <w:r>
         <w:rPr>
@@ -8891,6 +9149,8 @@
     <w:p>
       <w:pPr>
         <w:pStyle w:val="FirstParagraph"/>
+        <w:jc w:val="both"/>
+        <w:spacing w:line="480" w:lineRule="auto"/>
       </w:pPr>
       <w:r>
         <w:t xml:space="preserve">Las cinco métricas primarias se computan por instancia y se agregan a nivel de</w:t>
@@ -8920,6 +9180,8 @@
     <w:p>
       <w:pPr>
         <w:pStyle w:val="FirstParagraph"/>
+        <w:jc w:val="both"/>
+        <w:spacing w:line="480" w:lineRule="auto"/>
       </w:pPr>
       <w:r>
         <w:t xml:space="preserve">La fidelidad cuantifica la alineación entre las importancias del explicador y</w:t>
@@ -8934,6 +9196,8 @@
     <w:p>
       <w:pPr>
         <w:pStyle w:val="Textoindependiente"/>
+        <w:jc w:val="both"/>
+        <w:spacing w:line="480" w:lineRule="auto"/>
       </w:pPr>
       <m:oMathPara>
         <m:oMathParaPr>
@@ -9077,6 +9341,8 @@
     <w:p>
       <w:pPr>
         <w:pStyle w:val="FirstParagraph"/>
+        <w:jc w:val="both"/>
+        <w:spacing w:line="480" w:lineRule="auto"/>
       </w:pPr>
       <w:r>
         <w:t xml:space="preserve">donde</w:t>
@@ -9170,6 +9436,8 @@
     <w:p>
       <w:pPr>
         <w:pStyle w:val="FirstParagraph"/>
+        <w:jc w:val="both"/>
+        <w:spacing w:line="480" w:lineRule="auto"/>
       </w:pPr>
       <w:r>
         <w:t xml:space="preserve">La estabilidad mide la consistencia de las explicaciones bajo</w:t>
@@ -9376,6 +9644,8 @@
     <w:p>
       <w:pPr>
         <w:pStyle w:val="Textoindependiente"/>
+        <w:jc w:val="both"/>
+        <w:spacing w:line="480" w:lineRule="auto"/>
       </w:pPr>
       <m:oMathPara>
         <m:oMathParaPr>
@@ -9541,6 +9811,8 @@
     <w:p>
       <w:pPr>
         <w:pStyle w:val="FirstParagraph"/>
+        <w:jc w:val="both"/>
+        <w:spacing w:line="480" w:lineRule="auto"/>
       </w:pPr>
       <w:r>
         <w:t xml:space="preserve">Con</w:t>
@@ -9659,6 +9931,8 @@
     <w:p>
       <w:pPr>
         <w:pStyle w:val="FirstParagraph"/>
+        <w:jc w:val="both"/>
+        <w:spacing w:line="480" w:lineRule="auto"/>
       </w:pPr>
       <w:r>
         <w:t xml:space="preserve">La parsimonia cuantifica la proporción de características activas</w:t>
@@ -9744,6 +10018,8 @@
     <w:p>
       <w:pPr>
         <w:pStyle w:val="Textoindependiente"/>
+        <w:jc w:val="both"/>
+        <w:spacing w:line="480" w:lineRule="auto"/>
       </w:pPr>
       <m:oMathPara>
         <m:oMathParaPr>
@@ -9862,6 +10138,8 @@
     <w:p>
       <w:pPr>
         <w:pStyle w:val="FirstParagraph"/>
+        <w:jc w:val="both"/>
+        <w:spacing w:line="480" w:lineRule="auto"/>
       </w:pPr>
       <w:r>
         <w:t xml:space="preserve">Un valor bajo indica mayor concisión. Dirección:</w:t>
@@ -9912,6 +10190,8 @@
     <w:p>
       <w:pPr>
         <w:pStyle w:val="FirstParagraph"/>
+        <w:jc w:val="both"/>
+        <w:spacing w:line="480" w:lineRule="auto"/>
       </w:pPr>
       <w:r>
         <w:t xml:space="preserve">La brecha de fidelidad cuantifica el cambio en la salida del modelo al</w:t>
@@ -9949,6 +10229,8 @@
     <w:p>
       <w:pPr>
         <w:pStyle w:val="Textoindependiente"/>
+        <w:jc w:val="both"/>
+        <w:spacing w:line="480" w:lineRule="auto"/>
       </w:pPr>
       <m:oMathPara>
         <m:oMathParaPr>
@@ -10051,6 +10333,8 @@
     <w:p>
       <w:pPr>
         <w:pStyle w:val="FirstParagraph"/>
+        <w:jc w:val="both"/>
+        <w:spacing w:line="480" w:lineRule="auto"/>
       </w:pPr>
       <w:r>
         <w:t xml:space="preserve">donde</w:t>
@@ -10133,6 +10417,8 @@
     <w:p>
       <w:pPr>
         <w:pStyle w:val="FirstParagraph"/>
+        <w:jc w:val="both"/>
+        <w:spacing w:line="480" w:lineRule="auto"/>
       </w:pPr>
       <w:r>
         <w:t xml:space="preserve">El coste (</w:t>
@@ -10642,6 +10928,8 @@
     <w:p>
       <w:pPr>
         <w:pStyle w:val="FirstParagraph"/>
+        <w:jc w:val="both"/>
+        <w:spacing w:line="480" w:lineRule="auto"/>
       </w:pPr>
       <w:r>
         <w:t xml:space="preserve">La validación humana se diseñó como una capa posterior al benchmark funcional.</w:t>
@@ -10739,6 +11027,8 @@
     <w:p>
       <w:pPr>
         <w:pStyle w:val="Textoindependiente"/>
+        <w:jc w:val="both"/>
+        <w:spacing w:line="480" w:lineRule="auto"/>
       </w:pPr>
       <w:r>
         <w:t xml:space="preserve">El instrumento de anotación usa cinco ítems Likert de 1 a 5:</w:t>
@@ -11048,6 +11338,8 @@
     <w:p>
       <w:pPr>
         <w:pStyle w:val="Textoindependiente"/>
+        <w:jc w:val="both"/>
+        <w:spacing w:line="480" w:lineRule="auto"/>
       </w:pPr>
       <w:r>
         <w:t xml:space="preserve">El archivo consolidado de respuestas humanas se mantiene en</w:t>
@@ -11126,6 +11418,8 @@
     <w:p>
       <w:pPr>
         <w:pStyle w:val="FirstParagraph"/>
+        <w:jc w:val="both"/>
+        <w:spacing w:line="480" w:lineRule="auto"/>
       </w:pPr>
       <w:r>
         <w:t xml:space="preserve">FOM-7 (</w:t>
@@ -11202,6 +11496,8 @@
     <w:p>
       <w:pPr>
         <w:pStyle w:val="Textoindependiente"/>
+        <w:jc w:val="both"/>
+        <w:spacing w:line="480" w:lineRule="auto"/>
       </w:pPr>
       <w:r>
         <w:rPr>
@@ -11266,6 +11562,8 @@
     <w:p>
       <w:pPr>
         <w:pStyle w:val="Textoindependiente"/>
+        <w:jc w:val="both"/>
+        <w:spacing w:line="480" w:lineRule="auto"/>
       </w:pPr>
       <w:r>
         <w:rPr>
@@ -11296,6 +11594,8 @@
     <w:p>
       <w:pPr>
         <w:pStyle w:val="Textoindependiente"/>
+        <w:jc w:val="both"/>
+        <w:spacing w:line="480" w:lineRule="auto"/>
       </w:pPr>
       <w:r>
         <w:rPr>
@@ -11344,6 +11644,8 @@
     <w:p>
       <w:pPr>
         <w:pStyle w:val="Textoindependiente"/>
+        <w:jc w:val="both"/>
+        <w:spacing w:line="480" w:lineRule="auto"/>
       </w:pPr>
       <w:r>
         <w:rPr>
@@ -11374,6 +11676,8 @@
     <w:p>
       <w:pPr>
         <w:pStyle w:val="Textoindependiente"/>
+        <w:jc w:val="both"/>
+        <w:spacing w:line="480" w:lineRule="auto"/>
       </w:pPr>
       <w:r>
         <w:rPr>
@@ -11443,6 +11747,8 @@
     <w:p>
       <w:pPr>
         <w:pStyle w:val="Textoindependiente"/>
+        <w:jc w:val="both"/>
+        <w:spacing w:line="480" w:lineRule="auto"/>
       </w:pPr>
       <w:r>
         <w:rPr>
@@ -11479,6 +11785,8 @@
     <w:p>
       <w:pPr>
         <w:pStyle w:val="Textoindependiente"/>
+        <w:jc w:val="both"/>
+        <w:spacing w:line="480" w:lineRule="auto"/>
       </w:pPr>
       <w:r>
         <w:rPr>
@@ -11515,6 +11823,8 @@
     <w:p>
       <w:pPr>
         <w:pStyle w:val="Textoindependiente"/>
+        <w:jc w:val="both"/>
+        <w:spacing w:line="480" w:lineRule="auto"/>
       </w:pPr>
       <w:r>
         <w:t xml:space="preserve">El flujo compacto del protocolo es:</w:t>
@@ -11523,6 +11833,8 @@
     <w:p>
       <w:pPr>
         <w:pStyle w:val="Textoindependiente"/>
+        <w:jc w:val="both"/>
+        <w:spacing w:line="480" w:lineRule="auto"/>
       </w:pPr>
       <m:oMathPara>
         <m:oMathParaPr>
@@ -11639,6 +11951,8 @@
     <w:p>
       <w:pPr>
         <w:pStyle w:val="FirstParagraph"/>
+        <w:jc w:val="both"/>
+        <w:spacing w:line="480" w:lineRule="auto"/>
       </w:pPr>
       <w:r>
         <w:t xml:space="preserve">El análisis de cobertura se realizó directamente sobre el árbol de resultados</w:t>
@@ -11963,6 +12277,8 @@
     <w:p>
       <w:pPr>
         <w:pStyle w:val="Textoindependiente"/>
+        <w:jc w:val="both"/>
+        <w:spacing w:line="480" w:lineRule="auto"/>
       </w:pPr>
       <w:r>
         <w:t xml:space="preserve">La</w:t>
@@ -12360,6 +12676,8 @@
     <w:p>
       <w:pPr>
         <w:pStyle w:val="FirstParagraph"/>
+        <w:jc w:val="both"/>
+        <w:spacing w:line="480" w:lineRule="auto"/>
       </w:pPr>
       <w:r>
         <w:t xml:space="preserve">El impacto de las 25 celdas ausentes se evalúa en tres dimensiones:</w:t>
@@ -12380,6 +12698,8 @@
     <w:p>
       <w:pPr>
         <w:pStyle w:val="Textoindependiente"/>
+        <w:jc w:val="both"/>
+        <w:spacing w:line="480" w:lineRule="auto"/>
       </w:pPr>
       <w:r>
         <w:rPr>
@@ -12483,6 +12803,8 @@
     <w:p>
       <w:pPr>
         <w:pStyle w:val="Textoindependiente"/>
+        <w:jc w:val="both"/>
+        <w:spacing w:line="480" w:lineRule="auto"/>
       </w:pPr>
       <w:r>
         <w:rPr>
@@ -12621,6 +12943,8 @@
     <w:p>
       <w:pPr>
         <w:pStyle w:val="Textoindependiente"/>
+        <w:jc w:val="both"/>
+        <w:spacing w:line="480" w:lineRule="auto"/>
       </w:pPr>
       <m:oMathPara>
         <m:oMathParaPr>
@@ -12743,6 +13067,8 @@
     <w:p>
       <w:pPr>
         <w:pStyle w:val="FirstParagraph"/>
+        <w:jc w:val="both"/>
+        <w:spacing w:line="480" w:lineRule="auto"/>
       </w:pPr>
       <w:r>
         <w:t xml:space="preserve">Con</w:t>
@@ -12960,6 +13286,8 @@
     <w:p>
       <w:pPr>
         <w:pStyle w:val="Textoindependiente"/>
+        <w:jc w:val="both"/>
+        <w:spacing w:line="480" w:lineRule="auto"/>
       </w:pPr>
       <m:oMathPara>
         <m:oMathParaPr>
@@ -13039,6 +13367,8 @@
     <w:p>
       <w:pPr>
         <w:pStyle w:val="FirstParagraph"/>
+        <w:jc w:val="both"/>
+        <w:spacing w:line="480" w:lineRule="auto"/>
       </w:pPr>
       <w:r>
         <w:t xml:space="preserve">Incluso asumiendo una reducción del poder del 50% —hipótesis conservadora que</w:t>
@@ -13122,6 +13452,8 @@
     <w:p>
       <w:pPr>
         <w:pStyle w:val="Textoindependiente"/>
+        <w:jc w:val="both"/>
+        <w:spacing w:line="480" w:lineRule="auto"/>
       </w:pPr>
       <w:r>
         <w:rPr>
@@ -13168,6 +13500,8 @@
     <w:p>
       <w:pPr>
         <w:pStyle w:val="Textoindependiente"/>
+        <w:jc w:val="both"/>
+        <w:spacing w:line="480" w:lineRule="auto"/>
       </w:pPr>
       <w:r>
         <w:rPr>
@@ -13286,6 +13620,8 @@
     <w:p>
       <w:pPr>
         <w:pStyle w:val="FirstParagraph"/>
+        <w:jc w:val="both"/>
+        <w:spacing w:line="480" w:lineRule="auto"/>
       </w:pPr>
       <w:r>
         <w:t xml:space="preserve">Para contrastar H1 y H2, se aplica el test de Friedman</w:t>
@@ -13415,6 +13751,8 @@
     <w:p>
       <w:pPr>
         <w:pStyle w:val="Textoindependiente"/>
+        <w:jc w:val="both"/>
+        <w:spacing w:line="480" w:lineRule="auto"/>
       </w:pPr>
       <m:oMathPara>
         <m:oMathParaPr>
@@ -13589,6 +13927,8 @@
     <w:p>
       <w:pPr>
         <w:pStyle w:val="FirstParagraph"/>
+        <w:jc w:val="both"/>
+        <w:spacing w:line="480" w:lineRule="auto"/>
       </w:pPr>
       <w:r>
         <w:t xml:space="preserve">donde</w:t>
@@ -13809,6 +14149,8 @@
     <w:p>
       <w:pPr>
         <w:pStyle w:val="Textoindependiente"/>
+        <w:jc w:val="both"/>
+        <w:spacing w:line="480" w:lineRule="auto"/>
       </w:pPr>
       <m:oMathPara>
         <m:oMathParaPr>
@@ -13883,6 +14225,8 @@
     <w:p>
       <w:pPr>
         <w:pStyle w:val="FirstParagraph"/>
+        <w:jc w:val="both"/>
+        <w:spacing w:line="480" w:lineRule="auto"/>
       </w:pPr>
       <w:r>
         <w:t xml:space="preserve">donde</w:t>
@@ -13924,6 +14268,8 @@
     <w:p>
       <w:pPr>
         <w:pStyle w:val="FirstParagraph"/>
+        <w:jc w:val="both"/>
+        <w:spacing w:line="480" w:lineRule="auto"/>
       </w:pPr>
       <w:r>
         <w:t xml:space="preserve">Cuando Friedman rechaza</w:t>
@@ -14030,6 +14376,8 @@
     <w:p>
       <w:pPr>
         <w:pStyle w:val="Textoindependiente"/>
+        <w:jc w:val="both"/>
+        <w:spacing w:line="480" w:lineRule="auto"/>
       </w:pPr>
       <m:oMathPara>
         <m:oMathParaPr>
@@ -14189,6 +14537,8 @@
     <w:p>
       <w:pPr>
         <w:pStyle w:val="FirstParagraph"/>
+        <w:jc w:val="both"/>
+        <w:spacing w:line="480" w:lineRule="auto"/>
       </w:pPr>
       <w:r>
         <w:t xml:space="preserve">Dos métodos se consideran significativamente distintos si</w:t>
@@ -14284,6 +14634,8 @@
     <w:p>
       <w:pPr>
         <w:pStyle w:val="FirstParagraph"/>
+        <w:jc w:val="both"/>
+        <w:spacing w:line="480" w:lineRule="auto"/>
       </w:pPr>
       <w:r>
         <w:t xml:space="preserve">Para contrastar H3 se aplica el test de Wilcoxon con rangos con signo</w:t>
@@ -14399,6 +14751,8 @@
           <w:ilvl w:val="0"/>
           <w:numId w:val="1009"/>
         </w:numPr>
+        <w:jc w:val="both"/>
+        <w:spacing w:line="480" w:lineRule="auto"/>
       </w:pPr>
       <w:r>
         <w:rPr>
@@ -14461,6 +14815,8 @@
           <w:ilvl w:val="0"/>
           <w:numId w:val="1009"/>
         </w:numPr>
+        <w:jc w:val="both"/>
+        <w:spacing w:line="480" w:lineRule="auto"/>
       </w:pPr>
       <w:r>
         <w:rPr>
@@ -14482,6 +14838,8 @@
     <w:p>
       <w:pPr>
         <w:pStyle w:val="FirstParagraph"/>
+        <w:jc w:val="both"/>
+        <w:spacing w:line="480" w:lineRule="auto"/>
       </w:pPr>
       <w:r>
         <w:t xml:space="preserve">El tamaño del efecto se reporta como</w:t>
@@ -14522,6 +14880,8 @@
     <w:p>
       <w:pPr>
         <w:pStyle w:val="Textoindependiente"/>
+        <w:jc w:val="both"/>
+        <w:spacing w:line="480" w:lineRule="auto"/>
       </w:pPr>
       <m:oMathPara>
         <m:oMathParaPr>
@@ -14583,6 +14943,8 @@
     <w:p>
       <w:pPr>
         <w:pStyle w:val="FirstParagraph"/>
+        <w:jc w:val="both"/>
+        <w:spacing w:line="480" w:lineRule="auto"/>
       </w:pPr>
       <w:r>
         <w:t xml:space="preserve">con interpretación convencional: pequeño (</w:t>
@@ -14703,6 +15065,8 @@
     <w:p>
       <w:pPr>
         <w:pStyle w:val="FirstParagraph"/>
+        <w:jc w:val="both"/>
+        <w:spacing w:line="480" w:lineRule="auto"/>
       </w:pPr>
       <w:r>
         <w:t xml:space="preserve">Las pruebas se organizan en tres familias inferenciales independientes, con</w:t>
@@ -15385,6 +15749,8 @@
     <w:p>
       <w:pPr>
         <w:pStyle w:val="FirstParagraph"/>
+        <w:jc w:val="both"/>
+        <w:spacing w:line="480" w:lineRule="auto"/>
       </w:pPr>
       <w:r>
         <w:t xml:space="preserve">Todos los análisis del Capítulo 4 son reproducibles desde el repositorio</w:t>
@@ -15436,6 +15802,8 @@
           <w:ilvl w:val="0"/>
           <w:numId w:val="1010"/>
         </w:numPr>
+        <w:jc w:val="both"/>
+        <w:spacing w:line="480" w:lineRule="auto"/>
       </w:pPr>
       <w:r>
         <w:rPr>
@@ -15463,6 +15831,8 @@
           <w:ilvl w:val="0"/>
           <w:numId w:val="1010"/>
         </w:numPr>
+        <w:jc w:val="both"/>
+        <w:spacing w:line="480" w:lineRule="auto"/>
       </w:pPr>
       <w:r>
         <w:rPr>
@@ -15505,6 +15875,8 @@
           <w:ilvl w:val="0"/>
           <w:numId w:val="1010"/>
         </w:numPr>
+        <w:jc w:val="both"/>
+        <w:spacing w:line="480" w:lineRule="auto"/>
       </w:pPr>
       <w:r>
         <w:rPr>
@@ -15526,6 +15898,8 @@
           <w:ilvl w:val="0"/>
           <w:numId w:val="1010"/>
         </w:numPr>
+        <w:jc w:val="both"/>
+        <w:spacing w:line="480" w:lineRule="auto"/>
       </w:pPr>
       <w:r>
         <w:rPr>
@@ -15553,6 +15927,8 @@
           <w:ilvl w:val="0"/>
           <w:numId w:val="1010"/>
         </w:numPr>
+        <w:jc w:val="both"/>
+        <w:spacing w:line="480" w:lineRule="auto"/>
       </w:pPr>
       <w:r>
         <w:rPr>
@@ -15576,6 +15952,8 @@
     <w:p>
       <w:pPr>
         <w:pStyle w:val="FirstParagraph"/>
+        <w:jc w:val="both"/>
+        <w:spacing w:line="480" w:lineRule="auto"/>
       </w:pPr>
       <w:r>
         <w:t xml:space="preserve">Las especificaciones completas del entorno de ejecución, los parámetros de</w:t>
@@ -15607,6 +15985,8 @@
     <w:p>
       <w:pPr>
         <w:pStyle w:val="FirstParagraph"/>
+        <w:jc w:val="both"/>
+        <w:spacing w:line="480" w:lineRule="auto"/>
       </w:pPr>
       <w:r>
         <w:t xml:space="preserve">Este capítulo presenta los resultados empíricos de los Estudios A y B del</w:t>
@@ -15675,6 +16055,8 @@
     <w:p>
       <w:pPr>
         <w:pStyle w:val="Textoindependiente"/>
+        <w:jc w:val="both"/>
+        <w:spacing w:line="480" w:lineRule="auto"/>
       </w:pPr>
       <w:r>
         <w:t xml:space="preserve">Los resultados confirmativos de H1–H3 y P1 se calcularon a partir de los</w:t>
@@ -15800,6 +16182,8 @@
     <w:p>
       <w:pPr>
         <w:pStyle w:val="FirstParagraph"/>
+        <w:jc w:val="both"/>
+        <w:spacing w:line="480" w:lineRule="auto"/>
       </w:pPr>
       <w:r>
         <w:t xml:space="preserve">Antes de presentar las pruebas confirmativas, conviene establecer la</w:t>
@@ -15909,6 +16293,8 @@
           <w:ilvl w:val="0"/>
           <w:numId w:val="1011"/>
         </w:numPr>
+        <w:jc w:val="both"/>
+        <w:spacing w:line="480" w:lineRule="auto"/>
       </w:pPr>
       <w:r>
         <w:rPr>
@@ -16002,6 +16388,8 @@
           <w:ilvl w:val="0"/>
           <w:numId w:val="1011"/>
         </w:numPr>
+        <w:jc w:val="both"/>
+        <w:spacing w:line="480" w:lineRule="auto"/>
       </w:pPr>
       <w:r>
         <w:rPr>
@@ -16020,6 +16408,8 @@
           <w:ilvl w:val="0"/>
           <w:numId w:val="1011"/>
         </w:numPr>
+        <w:jc w:val="both"/>
+        <w:spacing w:line="480" w:lineRule="auto"/>
       </w:pPr>
       <w:r>
         <w:rPr>
@@ -16095,6 +16485,8 @@
           <w:ilvl w:val="0"/>
           <w:numId w:val="1011"/>
         </w:numPr>
+        <w:jc w:val="both"/>
+        <w:spacing w:line="480" w:lineRule="auto"/>
       </w:pPr>
       <w:r>
         <w:rPr>
@@ -16164,6 +16556,8 @@
     <w:p>
       <w:pPr>
         <w:pStyle w:val="FirstParagraph"/>
+        <w:jc w:val="both"/>
+        <w:spacing w:line="480" w:lineRule="auto"/>
       </w:pPr>
       <w:r>
         <w:t xml:space="preserve">Para el análisis Friedman (H1 y H2), se utilizan los 15 bloques completos</w:t>
@@ -16298,6 +16692,8 @@
     <w:p>
       <w:pPr>
         <w:pStyle w:val="FirstParagraph"/>
+        <w:jc w:val="both"/>
+        <w:spacing w:line="480" w:lineRule="auto"/>
       </w:pPr>
       <w:r>
         <w:t xml:space="preserve">La prueba de Friedman para bloques</w:t>
@@ -16526,6 +16922,8 @@
     <w:p>
       <w:pPr>
         <w:pStyle w:val="Textoindependiente"/>
+        <w:jc w:val="both"/>
+        <w:spacing w:line="480" w:lineRule="auto"/>
       </w:pPr>
       <m:oMathPara>
         <m:oMathParaPr>
@@ -16698,6 +17096,8 @@
     <w:p>
       <w:pPr>
         <w:pStyle w:val="FirstParagraph"/>
+        <w:jc w:val="both"/>
+        <w:spacing w:line="480" w:lineRule="auto"/>
       </w:pPr>
       <w:r>
         <w:t xml:space="preserve">Este resultado rechaza</w:t>
@@ -17080,6 +17480,8 @@
     <w:p>
       <w:pPr>
         <w:pStyle w:val="Textoindependiente"/>
+        <w:jc w:val="both"/>
+        <w:spacing w:line="480" w:lineRule="auto"/>
       </w:pPr>
       <w:r>
         <w:t xml:space="preserve">El hecho de que SHAP obtenga rango 1 en la totalidad de los 15 bloques</w:t>
@@ -17214,6 +17616,8 @@
     <w:p>
       <w:pPr>
         <w:pStyle w:val="Textoindependiente"/>
+        <w:jc w:val="both"/>
+        <w:spacing w:line="480" w:lineRule="auto"/>
       </w:pPr>
       <w:r>
         <w:t xml:space="preserve">La escala de fidelidad es acotada en</w:t>
@@ -17311,6 +17715,8 @@
     <w:p>
       <w:pPr>
         <w:pStyle w:val="Textoindependiente"/>
+        <w:jc w:val="both"/>
+        <w:spacing w:line="480" w:lineRule="auto"/>
       </w:pPr>
       <w:r>
         <w:rPr>
@@ -17401,6 +17807,8 @@
     <w:p>
       <w:pPr>
         <w:pStyle w:val="Textoindependiente"/>
+        <w:jc w:val="both"/>
+        <w:spacing w:line="480" w:lineRule="auto"/>
       </w:pPr>
       <m:oMathPara>
         <m:oMathParaPr>
@@ -17570,6 +17978,8 @@
     <w:p>
       <w:pPr>
         <w:pStyle w:val="FirstParagraph"/>
+        <w:jc w:val="both"/>
+        <w:spacing w:line="480" w:lineRule="auto"/>
       </w:pPr>
       <w:r>
         <w:t xml:space="preserve">Donde</w:t>
@@ -18104,6 +18514,8 @@
     <w:p>
       <w:pPr>
         <w:pStyle w:val="Textoindependiente"/>
+        <w:jc w:val="both"/>
+        <w:spacing w:line="480" w:lineRule="auto"/>
       </w:pPr>
       <w:r>
         <w:t xml:space="preserve">La localización Nemenyi es conservadora cuando</w:t>
@@ -18166,6 +18578,8 @@
     <w:p>
       <w:pPr>
         <w:pStyle w:val="FirstParagraph"/>
+        <w:jc w:val="both"/>
+        <w:spacing w:line="480" w:lineRule="auto"/>
       </w:pPr>
       <w:r>
         <w:t xml:space="preserve">La prueba de Friedman para estabilidad arrojó</w:t>
@@ -18234,6 +18648,8 @@
     <w:p>
       <w:pPr>
         <w:pStyle w:val="Textoindependiente"/>
+        <w:jc w:val="both"/>
+        <w:spacing w:line="480" w:lineRule="auto"/>
       </w:pPr>
       <m:oMathPara>
         <m:oMathParaPr>
@@ -18307,6 +18723,8 @@
     <w:p>
       <w:pPr>
         <w:pStyle w:val="FirstParagraph"/>
+        <w:jc w:val="both"/>
+        <w:spacing w:line="480" w:lineRule="auto"/>
       </w:pPr>
       <m:oMath>
         <m:sSub>
@@ -18706,6 +19124,8 @@
     <w:p>
       <w:pPr>
         <w:pStyle w:val="Textoindependiente"/>
+        <w:jc w:val="both"/>
+        <w:spacing w:line="480" w:lineRule="auto"/>
       </w:pPr>
       <w:r>
         <w:t xml:space="preserve">SHAP mantiene la primera posición en estabilidad (rango medio = 1.000), lo</w:t>
@@ -18821,6 +19241,8 @@
     <w:p>
       <w:pPr>
         <w:pStyle w:val="Textoindependiente"/>
+        <w:jc w:val="both"/>
+        <w:spacing w:line="480" w:lineRule="auto"/>
       </w:pPr>
       <w:r>
         <w:t xml:space="preserve">La diferencia crítica Nemenyi para estabilidad es idéntica a la calculada para</w:t>
@@ -18890,6 +19312,8 @@
           <w:ilvl w:val="0"/>
           <w:numId w:val="1012"/>
         </w:numPr>
+        <w:jc w:val="both"/>
+        <w:spacing w:line="480" w:lineRule="auto"/>
       </w:pPr>
       <w:r>
         <w:t xml:space="preserve">SHAP vs. LIME:</w:t>
@@ -18955,6 +19379,8 @@
           <w:ilvl w:val="0"/>
           <w:numId w:val="1012"/>
         </w:numPr>
+        <w:jc w:val="both"/>
+        <w:spacing w:line="480" w:lineRule="auto"/>
       </w:pPr>
       <w:r>
         <w:t xml:space="preserve">SHAP vs. Anchors:</w:t>
@@ -19020,6 +19446,8 @@
           <w:ilvl w:val="0"/>
           <w:numId w:val="1012"/>
         </w:numPr>
+        <w:jc w:val="both"/>
+        <w:spacing w:line="480" w:lineRule="auto"/>
       </w:pPr>
       <w:r>
         <w:t xml:space="preserve">DiCE vs. LIME:</w:t>
@@ -19085,6 +19513,8 @@
           <w:ilvl w:val="0"/>
           <w:numId w:val="1012"/>
         </w:numPr>
+        <w:jc w:val="both"/>
+        <w:spacing w:line="480" w:lineRule="auto"/>
       </w:pPr>
       <w:r>
         <w:t xml:space="preserve">DiCE vs. Anchors:</w:t>
@@ -19150,6 +19580,8 @@
           <w:ilvl w:val="0"/>
           <w:numId w:val="1012"/>
         </w:numPr>
+        <w:jc w:val="both"/>
+        <w:spacing w:line="480" w:lineRule="auto"/>
       </w:pPr>
       <w:r>
         <w:t xml:space="preserve">LIME vs. Anchors:</w:t>
@@ -19215,6 +19647,8 @@
           <w:ilvl w:val="0"/>
           <w:numId w:val="1012"/>
         </w:numPr>
+        <w:jc w:val="both"/>
+        <w:spacing w:line="480" w:lineRule="auto"/>
       </w:pPr>
       <w:r>
         <w:t xml:space="preserve">SHAP vs. DiCE:</w:t>
@@ -19276,6 +19710,8 @@
     <w:p>
       <w:pPr>
         <w:pStyle w:val="FirstParagraph"/>
+        <w:jc w:val="both"/>
+        <w:spacing w:line="480" w:lineRule="auto"/>
       </w:pPr>
       <w:r>
         <w:t xml:space="preserve">LIME y Anchors forman un grupo indistinguible en estabilidad (ambos con valores</w:t>
@@ -19325,6 +19761,8 @@
     <w:p>
       <w:pPr>
         <w:pStyle w:val="FirstParagraph"/>
+        <w:jc w:val="both"/>
+        <w:spacing w:line="480" w:lineRule="auto"/>
       </w:pPr>
       <w:r>
         <w:t xml:space="preserve">El análisis pareado opera sobre las 75 celdas</w:t>
@@ -19404,6 +19842,8 @@
     <w:p>
       <w:pPr>
         <w:pStyle w:val="FirstParagraph"/>
+        <w:jc w:val="both"/>
+        <w:spacing w:line="480" w:lineRule="auto"/>
       </w:pPr>
       <w:r>
         <w:t xml:space="preserve">Para cada métrica se calcula la diferencia pareada</w:t>
@@ -20303,6 +20743,8 @@
     <w:p>
       <w:pPr>
         <w:pStyle w:val="Textoindependiente"/>
+        <w:jc w:val="both"/>
+        <w:spacing w:line="480" w:lineRule="auto"/>
       </w:pPr>
       <w:r>
         <w:t xml:space="preserve">Los resultados confirman</w:t>
@@ -20343,6 +20785,8 @@
     <w:p>
       <w:pPr>
         <w:pStyle w:val="Textoindependiente"/>
+        <w:jc w:val="both"/>
+        <w:spacing w:line="480" w:lineRule="auto"/>
       </w:pPr>
       <w:r>
         <w:rPr>
@@ -20496,6 +20940,8 @@
     <w:p>
       <w:pPr>
         <w:pStyle w:val="Textoindependiente"/>
+        <w:jc w:val="both"/>
+        <w:spacing w:line="480" w:lineRule="auto"/>
       </w:pPr>
       <w:r>
         <w:rPr>
@@ -20576,6 +21022,8 @@
     <w:p>
       <w:pPr>
         <w:pStyle w:val="Textoindependiente"/>
+        <w:jc w:val="both"/>
+        <w:spacing w:line="480" w:lineRule="auto"/>
       </w:pPr>
       <w:r>
         <w:rPr>
@@ -20706,6 +21154,8 @@
     <w:p>
       <w:pPr>
         <w:pStyle w:val="Textoindependiente"/>
+        <w:jc w:val="both"/>
+        <w:spacing w:line="480" w:lineRule="auto"/>
       </w:pPr>
       <w:r>
         <w:rPr>
@@ -20840,6 +21290,8 @@
     <w:p>
       <w:pPr>
         <w:pStyle w:val="FirstParagraph"/>
+        <w:jc w:val="both"/>
+        <w:spacing w:line="480" w:lineRule="auto"/>
       </w:pPr>
       <w:r>
         <w:t xml:space="preserve">La hipótesis H3 involucra cinco comparaciones pareadas simultáneas. Aplicando</w:t>
@@ -21327,6 +21779,8 @@
     <w:p>
       <w:pPr>
         <w:pStyle w:val="FirstParagraph"/>
+        <w:jc w:val="both"/>
+        <w:spacing w:line="480" w:lineRule="auto"/>
       </w:pPr>
       <w:r>
         <w:t xml:space="preserve">La proposición P1 establece que el protocolo FOM-7 debe producir un coeficiente</w:t>
@@ -21347,6 +21801,8 @@
     <w:p>
       <w:pPr>
         <w:pStyle w:val="Textoindependiente"/>
+        <w:jc w:val="both"/>
+        <w:spacing w:line="480" w:lineRule="auto"/>
       </w:pPr>
       <w:r>
         <w:t xml:space="preserve">Para su evaluación se calculó el CV de cada métrica primaria para SHAP y LIME</w:t>
@@ -21908,6 +22364,8 @@
     <w:p>
       <w:pPr>
         <w:pStyle w:val="Textoindependiente"/>
+        <w:jc w:val="both"/>
+        <w:spacing w:line="480" w:lineRule="auto"/>
       </w:pPr>
       <w:r>
         <w:t xml:space="preserve">Los resultados confirman P1 parcialmente. Para las métricas en las que el</w:t>
@@ -21940,6 +22398,8 @@
     <w:p>
       <w:pPr>
         <w:pStyle w:val="Textoindependiente"/>
+        <w:jc w:val="both"/>
+        <w:spacing w:line="480" w:lineRule="auto"/>
       </w:pPr>
       <w:r>
         <w:t xml:space="preserve">Sin embargo, este incumplimiento es interpretable como un hallazgo sustantivo</w:t>
@@ -22013,6 +22473,8 @@
     <w:p>
       <w:pPr>
         <w:pStyle w:val="Textoindependiente"/>
+        <w:jc w:val="both"/>
+        <w:spacing w:line="480" w:lineRule="auto"/>
       </w:pPr>
       <w:r>
         <w:t xml:space="preserve">Para la generalización global, el CV en fidelidad para todos los métodos y</w:t>
@@ -22061,6 +22523,8 @@
     <w:p>
       <w:pPr>
         <w:pStyle w:val="FirstParagraph"/>
+        <w:jc w:val="both"/>
+        <w:spacing w:line="480" w:lineRule="auto"/>
       </w:pPr>
       <w:r>
         <w:t xml:space="preserve">Las métricas funcionales anteriores evalúan propiedades observables del</w:t>
@@ -22130,6 +22594,8 @@
     <w:p>
       <w:pPr>
         <w:pStyle w:val="Textoindependiente"/>
+        <w:jc w:val="both"/>
+        <w:spacing w:line="480" w:lineRule="auto"/>
       </w:pPr>
       <w:r>
         <w:t xml:space="preserve">La muestra incluye 12 anotadores, cada uno con 10 evaluaciones:</w:t>
@@ -22222,6 +22688,8 @@
     <w:p>
       <w:pPr>
         <w:pStyle w:val="Textoindependiente"/>
+        <w:jc w:val="both"/>
+        <w:spacing w:line="480" w:lineRule="auto"/>
       </w:pPr>
       <w:r>
         <w:t xml:space="preserve">Cada anotación utiliza una escala Likert de 1 a 5 en cinco dimensiones:</w:t>
@@ -22234,6 +22702,8 @@
           <w:ilvl w:val="0"/>
           <w:numId w:val="1013"/>
         </w:numPr>
+        <w:jc w:val="both"/>
+        <w:spacing w:line="480" w:lineRule="auto"/>
       </w:pPr>
       <w:r>
         <w:rPr>
@@ -22256,6 +22726,8 @@
           <w:ilvl w:val="0"/>
           <w:numId w:val="1013"/>
         </w:numPr>
+        <w:jc w:val="both"/>
+        <w:spacing w:line="480" w:lineRule="auto"/>
       </w:pPr>
       <w:r>
         <w:rPr>
@@ -22284,6 +22756,8 @@
           <w:ilvl w:val="0"/>
           <w:numId w:val="1013"/>
         </w:numPr>
+        <w:jc w:val="both"/>
+        <w:spacing w:line="480" w:lineRule="auto"/>
       </w:pPr>
       <w:r>
         <w:rPr>
@@ -22306,6 +22780,8 @@
           <w:ilvl w:val="0"/>
           <w:numId w:val="1013"/>
         </w:numPr>
+        <w:jc w:val="both"/>
+        <w:spacing w:line="480" w:lineRule="auto"/>
       </w:pPr>
       <w:r>
         <w:rPr>
@@ -22328,6 +22804,8 @@
           <w:ilvl w:val="0"/>
           <w:numId w:val="1013"/>
         </w:numPr>
+        <w:jc w:val="both"/>
+        <w:spacing w:line="480" w:lineRule="auto"/>
       </w:pPr>
       <w:r>
         <w:rPr>
@@ -22352,6 +22830,8 @@
     <w:p>
       <w:pPr>
         <w:pStyle w:val="FirstParagraph"/>
+        <w:jc w:val="both"/>
+        <w:spacing w:line="480" w:lineRule="auto"/>
       </w:pPr>
       <w:r>
         <w:t xml:space="preserve">La Tabla</w:t>
@@ -23126,6 +23606,8 @@
     <w:p>
       <w:pPr>
         <w:pStyle w:val="Textoindependiente"/>
+        <w:jc w:val="both"/>
+        <w:spacing w:line="480" w:lineRule="auto"/>
       </w:pPr>
       <w:r>
         <w:t xml:space="preserve">El hallazgo más importante es la disociación entre adecuación semántica y</w:t>
@@ -23225,6 +23707,8 @@
     <w:p>
       <w:pPr>
         <w:pStyle w:val="Textoindependiente"/>
+        <w:jc w:val="both"/>
+        <w:spacing w:line="480" w:lineRule="auto"/>
       </w:pPr>
       <w:r>
         <w:t xml:space="preserve">La completitud merece una lectura específica. Una inspección inicial del</w:t>
@@ -23299,6 +23783,8 @@
     <w:p>
       <w:pPr>
         <w:pStyle w:val="Textoindependiente"/>
+        <w:jc w:val="both"/>
+        <w:spacing w:line="480" w:lineRule="auto"/>
       </w:pPr>
       <w:r>
         <w:t xml:space="preserve">La Tabla</w:t>
@@ -23809,6 +24295,8 @@
     <w:p>
       <w:pPr>
         <w:pStyle w:val="Textoindependiente"/>
+        <w:jc w:val="both"/>
+        <w:spacing w:line="480" w:lineRule="auto"/>
       </w:pPr>
       <w:r>
         <w:t xml:space="preserve">Este patrón tiene implicaciones metodológicas. Claridad y plausibilidad</w:t>
@@ -23880,6 +24368,8 @@
     <w:p>
       <w:pPr>
         <w:pStyle w:val="FirstParagraph"/>
+        <w:jc w:val="both"/>
+        <w:spacing w:line="480" w:lineRule="auto"/>
       </w:pPr>
       <w:r>
         <w:t xml:space="preserve">La Tabla</w:t>
@@ -24458,6 +24948,8 @@
     <w:p>
       <w:pPr>
         <w:pStyle w:val="Textoindependiente"/>
+        <w:jc w:val="both"/>
+        <w:spacing w:line="480" w:lineRule="auto"/>
       </w:pPr>
       <w:r>
         <w:t xml:space="preserve">El perfil por método matiza los resultados funcionales de EXP2. Anchors obtiene</w:t>
@@ -24520,6 +25012,8 @@
     <w:p>
       <w:pPr>
         <w:pStyle w:val="Textoindependiente"/>
+        <w:jc w:val="both"/>
+        <w:spacing w:line="480" w:lineRule="auto"/>
       </w:pPr>
       <w:r>
         <w:t xml:space="preserve">La lectura integrada con los resultados funcionales es importante. En EXP2,</w:t>
@@ -24589,6 +25083,8 @@
     <w:p>
       <w:pPr>
         <w:pStyle w:val="FirstParagraph"/>
+        <w:jc w:val="both"/>
+        <w:spacing w:line="480" w:lineRule="auto"/>
       </w:pPr>
       <w:r>
         <w:t xml:space="preserve">La Tabla</w:t>
@@ -25086,6 +25582,8 @@
     <w:p>
       <w:pPr>
         <w:pStyle w:val="Textoindependiente"/>
+        <w:jc w:val="both"/>
+        <w:spacing w:line="480" w:lineRule="auto"/>
       </w:pPr>
       <w:r>
         <w:t xml:space="preserve">La diferencia Adult–German Credit sugiere que el contexto semántico del</w:t>
@@ -25140,6 +25638,8 @@
     <w:p>
       <w:pPr>
         <w:pStyle w:val="FirstParagraph"/>
+        <w:jc w:val="both"/>
+        <w:spacing w:line="480" w:lineRule="auto"/>
       </w:pPr>
       <w:r>
         <w:t xml:space="preserve">La validación humana modifica el alcance empírico de la tesis en tres formas.</w:t>
@@ -25212,6 +25712,8 @@
     <w:p>
       <w:pPr>
         <w:pStyle w:val="Textoindependiente"/>
+        <w:jc w:val="both"/>
+        <w:spacing w:line="480" w:lineRule="auto"/>
       </w:pPr>
       <w:r>
         <w:t xml:space="preserve">Estas observaciones no sustituyen los contrastes confirmativos de H1–H3. Su</w:t>
@@ -25249,6 +25751,8 @@
     <w:p>
       <w:pPr>
         <w:pStyle w:val="FirstParagraph"/>
+        <w:jc w:val="both"/>
+        <w:spacing w:line="480" w:lineRule="auto"/>
       </w:pPr>
       <w:r>
         <w:t xml:space="preserve">El análisis omnibus y pareado establece las diferencias confirmativas; esta</w:t>
@@ -25278,6 +25782,8 @@
     <w:p>
       <w:pPr>
         <w:pStyle w:val="FirstParagraph"/>
+        <w:jc w:val="both"/>
+        <w:spacing w:line="480" w:lineRule="auto"/>
       </w:pPr>
       <w:r>
         <w:t xml:space="preserve">SHAP presenta el perfil más equilibrado y favorable de los cuatro métodos.</w:t>
@@ -25322,6 +25828,8 @@
     <w:p>
       <w:pPr>
         <w:pStyle w:val="Textoindependiente"/>
+        <w:jc w:val="both"/>
+        <w:spacing w:line="480" w:lineRule="auto"/>
       </w:pPr>
       <w:r>
         <w:t xml:space="preserve">El coste es la dimensión adversa de SHAP. El promedio de 24,804 ms esconde una</w:t>
@@ -25360,6 +25868,8 @@
     <w:p>
       <w:pPr>
         <w:pStyle w:val="Textoindependiente"/>
+        <w:jc w:val="both"/>
+        <w:spacing w:line="480" w:lineRule="auto"/>
       </w:pPr>
       <w:r>
         <w:t xml:space="preserve">Por modelo, los picos de fidelidad se observan en logreg (0.946) y SVM (0.928),</w:t>
@@ -25402,6 +25912,8 @@
     <w:p>
       <w:pPr>
         <w:pStyle w:val="FirstParagraph"/>
+        <w:jc w:val="both"/>
+        <w:spacing w:line="480" w:lineRule="auto"/>
       </w:pPr>
       <w:r>
         <w:t xml:space="preserve">LIME es el método más económico en coste (media 226 ms, rango 3–1,088 ms por</w:t>
@@ -25434,6 +25946,8 @@
     <w:p>
       <w:pPr>
         <w:pStyle w:val="Textoindependiente"/>
+        <w:jc w:val="both"/>
+        <w:spacing w:line="480" w:lineRule="auto"/>
       </w:pPr>
       <w:r>
         <w:t xml:space="preserve">La limitación estructural de LIME es su estabilidad casi nula (0.014). La</w:t>
@@ -25521,6 +26035,8 @@
     <w:p>
       <w:pPr>
         <w:pStyle w:val="FirstParagraph"/>
+        <w:jc w:val="both"/>
+        <w:spacing w:line="480" w:lineRule="auto"/>
       </w:pPr>
       <w:r>
         <w:t xml:space="preserve">Anchors tiene una cobertura de solo 56 celdas calificadas (74.7%), lo que</w:t>
@@ -25583,6 +26099,8 @@
     <w:p>
       <w:pPr>
         <w:pStyle w:val="Textoindependiente"/>
+        <w:jc w:val="both"/>
+        <w:spacing w:line="480" w:lineRule="auto"/>
       </w:pPr>
       <w:r>
         <w:t xml:space="preserve">La parsimonia de Anchors es comparable a la de LIME (0.085), pero con mayor</w:t>
@@ -25643,6 +26161,8 @@
     <w:p>
       <w:pPr>
         <w:pStyle w:val="FirstParagraph"/>
+        <w:jc w:val="both"/>
+        <w:spacing w:line="480" w:lineRule="auto"/>
       </w:pPr>
       <w:r>
         <w:t xml:space="preserve">DiCE ocupa el último lugar en fidelidad (0.172) y una posición intermedia en</w:t>
@@ -25693,6 +26213,8 @@
     <w:p>
       <w:pPr>
         <w:pStyle w:val="Textoindependiente"/>
+        <w:jc w:val="both"/>
+        <w:spacing w:line="480" w:lineRule="auto"/>
       </w:pPr>
       <w:r>
         <w:t xml:space="preserve">La estabilidad moderada de DiCE (0.366) es coherente: los contrafactuales</w:t>
@@ -25757,6 +26279,8 @@
     <w:p>
       <w:pPr>
         <w:pStyle w:val="FirstParagraph"/>
+        <w:jc w:val="both"/>
+        <w:spacing w:line="480" w:lineRule="auto"/>
       </w:pPr>
       <w:r>
         <w:t xml:space="preserve">El modelo base influye significativamente sobre los valores absolutos de las</w:t>
@@ -25777,6 +26301,8 @@
     <w:p>
       <w:pPr>
         <w:pStyle w:val="Textoindependiente"/>
+        <w:jc w:val="both"/>
+        <w:spacing w:line="480" w:lineRule="auto"/>
       </w:pPr>
       <w:r>
         <w:rPr>
@@ -25828,6 +26354,8 @@
     <w:p>
       <w:pPr>
         <w:pStyle w:val="Textoindependiente"/>
+        <w:jc w:val="both"/>
+        <w:spacing w:line="480" w:lineRule="auto"/>
       </w:pPr>
       <w:r>
         <w:rPr>
@@ -25870,6 +26398,8 @@
     <w:p>
       <w:pPr>
         <w:pStyle w:val="Textoindependiente"/>
+        <w:jc w:val="both"/>
+        <w:spacing w:line="480" w:lineRule="auto"/>
       </w:pPr>
       <w:r>
         <w:rPr>
@@ -25906,6 +26436,8 @@
     <w:p>
       <w:pPr>
         <w:pStyle w:val="Textoindependiente"/>
+        <w:jc w:val="both"/>
+        <w:spacing w:line="480" w:lineRule="auto"/>
       </w:pPr>
       <w:r>
         <w:rPr>
@@ -25958,6 +26490,8 @@
     <w:p>
       <w:pPr>
         <w:pStyle w:val="FirstParagraph"/>
+        <w:jc w:val="both"/>
+        <w:spacing w:line="480" w:lineRule="auto"/>
       </w:pPr>
       <w:r>
         <w:t xml:space="preserve">El análisis del efecto de</w:t>
@@ -26138,6 +26672,8 @@
     <w:p>
       <w:pPr>
         <w:pStyle w:val="Textoindependiente"/>
+        <w:jc w:val="both"/>
+        <w:spacing w:line="480" w:lineRule="auto"/>
       </w:pPr>
       <w:r>
         <w:t xml:space="preserve">La invarianza de las métricas ante el tamaño de muestra tiene dos implicaciones:</w:t>
@@ -26239,6 +26775,8 @@
     <w:p>
       <w:pPr>
         <w:pStyle w:val="FirstParagraph"/>
+        <w:jc w:val="both"/>
+        <w:spacing w:line="480" w:lineRule="auto"/>
       </w:pPr>
       <w:r>
         <w:t xml:space="preserve">Los tres ejes confirmatorios convergen en una imagen coherente: SHAP es el</w:t>
@@ -26301,6 +26839,8 @@
     <w:p>
       <w:pPr>
         <w:pStyle w:val="Textoindependiente"/>
+        <w:jc w:val="both"/>
+        <w:spacing w:line="480" w:lineRule="auto"/>
       </w:pPr>
       <w:r>
         <w:t xml:space="preserve">El hallazgo quizás más relevante para el campo es la disociación entre</w:t>
@@ -26345,6 +26885,8 @@
     <w:p>
       <w:pPr>
         <w:pStyle w:val="Textoindependiente"/>
+        <w:jc w:val="both"/>
+        <w:spacing w:line="480" w:lineRule="auto"/>
       </w:pPr>
       <w:r>
         <w:t xml:space="preserve">La magnitud del efecto en las comparaciones SHAP-LIME (</w:t>
@@ -26484,6 +27026,8 @@
     <w:p>
       <w:pPr>
         <w:pStyle w:val="FirstParagraph"/>
+        <w:jc w:val="both"/>
+        <w:spacing w:line="480" w:lineRule="auto"/>
       </w:pPr>
       <w:r>
         <w:t xml:space="preserve">Los resultados permiten derivar criterios técnicos de selección de método XAI</w:t>
@@ -26504,6 +27048,8 @@
     <w:p>
       <w:pPr>
         <w:pStyle w:val="Textoindependiente"/>
+        <w:jc w:val="both"/>
+        <w:spacing w:line="480" w:lineRule="auto"/>
       </w:pPr>
       <w:r>
         <w:rPr>
@@ -26552,6 +27098,8 @@
     <w:p>
       <w:pPr>
         <w:pStyle w:val="Textoindependiente"/>
+        <w:jc w:val="both"/>
+        <w:spacing w:line="480" w:lineRule="auto"/>
       </w:pPr>
       <w:r>
         <w:rPr>
@@ -26600,6 +27148,8 @@
     <w:p>
       <w:pPr>
         <w:pStyle w:val="Textoindependiente"/>
+        <w:jc w:val="both"/>
+        <w:spacing w:line="480" w:lineRule="auto"/>
       </w:pPr>
       <w:r>
         <w:rPr>
@@ -26647,6 +27197,8 @@
     <w:p>
       <w:pPr>
         <w:pStyle w:val="Textoindependiente"/>
+        <w:jc w:val="both"/>
+        <w:spacing w:line="480" w:lineRule="auto"/>
       </w:pPr>
       <w:r>
         <w:rPr>
@@ -26693,6 +27245,8 @@
     <w:p>
       <w:pPr>
         <w:pStyle w:val="FirstParagraph"/>
+        <w:jc w:val="both"/>
+        <w:spacing w:line="480" w:lineRule="auto"/>
       </w:pPr>
       <w:r>
         <w:t xml:space="preserve">Los hallazgos de este benchmark contribuyen al campo en tres dimensiones. En</w:t>
@@ -26773,6 +27327,8 @@
     <w:p>
       <w:pPr>
         <w:pStyle w:val="Textoindependiente"/>
+        <w:jc w:val="both"/>
+        <w:spacing w:line="480" w:lineRule="auto"/>
       </w:pPr>
       <w:r>
         <w:t xml:space="preserve">Las limitaciones principales del estudio son las siguientes. Primero, el</w:t>
@@ -26883,6 +27439,8 @@
     <w:p>
       <w:pPr>
         <w:pStyle w:val="FirstParagraph"/>
+        <w:jc w:val="both"/>
+        <w:spacing w:line="480" w:lineRule="auto"/>
       </w:pPr>
       <w:r>
         <w:t xml:space="preserve">Esta tesis parte de una constatación empírica recurrente en la literatura: el</w:t>
@@ -26984,6 +27542,8 @@
     <w:p>
       <w:pPr>
         <w:pStyle w:val="FirstParagraph"/>
+        <w:jc w:val="both"/>
+        <w:spacing w:line="480" w:lineRule="auto"/>
       </w:pPr>
       <w:r>
         <w:t xml:space="preserve">El problema de investigación formulado en el Capítulo 1 pregunta:</w:t>
@@ -27058,6 +27618,8 @@
     <w:p>
       <w:pPr>
         <w:pStyle w:val="Textoindependiente"/>
+        <w:jc w:val="both"/>
+        <w:spacing w:line="480" w:lineRule="auto"/>
       </w:pPr>
       <w:r>
         <w:t xml:space="preserve">Los resultados del benchmark responden esta pregunta con precisión</w:t>
@@ -27182,6 +27744,8 @@
     <w:p>
       <w:pPr>
         <w:pStyle w:val="Textoindependiente"/>
+        <w:jc w:val="both"/>
+        <w:spacing w:line="480" w:lineRule="auto"/>
       </w:pPr>
       <w:r>
         <w:t xml:space="preserve">La resolución formal de las hipótesis y objetivos se sintetiza en la tabla</w:t>
@@ -27576,6 +28140,8 @@
     <w:p>
       <w:pPr>
         <w:pStyle w:val="Textoindependiente"/>
+        <w:jc w:val="both"/>
+        <w:spacing w:line="480" w:lineRule="auto"/>
       </w:pPr>
       <w:r>
         <w:t xml:space="preserve"> </w:t>
@@ -27787,6 +28353,8 @@
     <w:p>
       <w:pPr>
         <w:pStyle w:val="Textoindependiente"/>
+        <w:jc w:val="both"/>
+        <w:spacing w:line="480" w:lineRule="auto"/>
       </w:pPr>
       <w:r>
         <w:t xml:space="preserve">Además de estos objetivos confirmativos, la tesis produjo una capa descriptiva</w:t>
@@ -27862,6 +28430,8 @@
     <w:p>
       <w:pPr>
         <w:pStyle w:val="FirstParagraph"/>
+        <w:jc w:val="both"/>
+        <w:spacing w:line="480" w:lineRule="auto"/>
       </w:pPr>
       <w:r>
         <w:t xml:space="preserve">El estado del arte en evaluación XAI muestra un patrón claro: los estudios</w:t>
@@ -27995,6 +28565,8 @@
     <w:p>
       <w:pPr>
         <w:pStyle w:val="Textoindependiente"/>
+        <w:jc w:val="both"/>
+        <w:spacing w:line="480" w:lineRule="auto"/>
       </w:pPr>
       <w:r>
         <w:t xml:space="preserve">El Estudio C propone una taxonomía estructurada en cuatro ejes ortogonales que</w:t>
@@ -28127,6 +28699,8 @@
     <w:p>
       <w:pPr>
         <w:pStyle w:val="FirstParagraph"/>
+        <w:jc w:val="both"/>
+        <w:spacing w:line="480" w:lineRule="auto"/>
       </w:pPr>
       <w:r>
         <w:rPr>
@@ -28169,6 +28743,8 @@
     <w:p>
       <w:pPr>
         <w:pStyle w:val="Textoindependiente"/>
+        <w:jc w:val="both"/>
+        <w:spacing w:line="480" w:lineRule="auto"/>
       </w:pPr>
       <w:r>
         <w:t xml:space="preserve">Este eje clasifica la dimensión de la explicación que la métrica interroga. Se</w:t>
@@ -28187,6 +28763,8 @@
           <w:ilvl w:val="0"/>
           <w:numId w:val="1014"/>
         </w:numPr>
+        <w:jc w:val="both"/>
+        <w:spacing w:line="480" w:lineRule="auto"/>
       </w:pPr>
       <w:r>
         <w:rPr>
@@ -28230,6 +28808,8 @@
           <w:ilvl w:val="0"/>
           <w:numId w:val="1014"/>
         </w:numPr>
+        <w:jc w:val="both"/>
+        <w:spacing w:line="480" w:lineRule="auto"/>
       </w:pPr>
       <w:r>
         <w:rPr>
@@ -28273,6 +28853,8 @@
           <w:ilvl w:val="0"/>
           <w:numId w:val="1014"/>
         </w:numPr>
+        <w:jc w:val="both"/>
+        <w:spacing w:line="480" w:lineRule="auto"/>
       </w:pPr>
       <w:r>
         <w:rPr>
@@ -28316,6 +28898,8 @@
           <w:ilvl w:val="0"/>
           <w:numId w:val="1014"/>
         </w:numPr>
+        <w:jc w:val="both"/>
+        <w:spacing w:line="480" w:lineRule="auto"/>
       </w:pPr>
       <w:r>
         <w:rPr>
@@ -28372,6 +28956,8 @@
           <w:ilvl w:val="0"/>
           <w:numId w:val="1014"/>
         </w:numPr>
+        <w:jc w:val="both"/>
+        <w:spacing w:line="480" w:lineRule="auto"/>
       </w:pPr>
       <w:r>
         <w:rPr>
@@ -28402,6 +28988,8 @@
     <w:p>
       <w:pPr>
         <w:pStyle w:val="FirstParagraph"/>
+        <w:jc w:val="both"/>
+        <w:spacing w:line="480" w:lineRule="auto"/>
       </w:pPr>
       <w:r>
         <w:rPr>
@@ -28444,6 +29032,8 @@
     <w:p>
       <w:pPr>
         <w:pStyle w:val="Textoindependiente"/>
+        <w:jc w:val="both"/>
+        <w:spacing w:line="480" w:lineRule="auto"/>
       </w:pPr>
       <w:r>
         <w:t xml:space="preserve">Las métricas se diferencian por la operación que genera la señal de evaluación.</w:t>
@@ -28462,6 +29052,8 @@
           <w:ilvl w:val="0"/>
           <w:numId w:val="1015"/>
         </w:numPr>
+        <w:jc w:val="both"/>
+        <w:spacing w:line="480" w:lineRule="auto"/>
       </w:pPr>
       <w:r>
         <w:rPr>
@@ -28502,6 +29094,8 @@
           <w:ilvl w:val="0"/>
           <w:numId w:val="1015"/>
         </w:numPr>
+        <w:jc w:val="both"/>
+        <w:spacing w:line="480" w:lineRule="auto"/>
       </w:pPr>
       <w:r>
         <w:rPr>
@@ -28542,6 +29136,8 @@
           <w:ilvl w:val="0"/>
           <w:numId w:val="1015"/>
         </w:numPr>
+        <w:jc w:val="both"/>
+        <w:spacing w:line="480" w:lineRule="auto"/>
       </w:pPr>
       <w:r>
         <w:rPr>
@@ -28588,6 +29184,8 @@
           <w:ilvl w:val="0"/>
           <w:numId w:val="1015"/>
         </w:numPr>
+        <w:jc w:val="both"/>
+        <w:spacing w:line="480" w:lineRule="auto"/>
       </w:pPr>
       <w:r>
         <w:rPr>
@@ -28624,6 +29222,8 @@
     <w:p>
       <w:pPr>
         <w:pStyle w:val="FirstParagraph"/>
+        <w:jc w:val="both"/>
+        <w:spacing w:line="480" w:lineRule="auto"/>
       </w:pPr>
       <w:r>
         <w:rPr>
@@ -28666,6 +29266,8 @@
     <w:p>
       <w:pPr>
         <w:pStyle w:val="Textoindependiente"/>
+        <w:jc w:val="both"/>
+        <w:spacing w:line="480" w:lineRule="auto"/>
       </w:pPr>
       <w:r>
         <w:t xml:space="preserve">Siguiendo la sistematización de Schwalbe y Finzel</w:t>
@@ -28711,6 +29313,8 @@
           <w:ilvl w:val="0"/>
           <w:numId w:val="1016"/>
         </w:numPr>
+        <w:jc w:val="both"/>
+        <w:spacing w:line="480" w:lineRule="auto"/>
       </w:pPr>
       <w:r>
         <w:rPr>
@@ -28751,6 +29355,8 @@
           <w:ilvl w:val="0"/>
           <w:numId w:val="1016"/>
         </w:numPr>
+        <w:jc w:val="both"/>
+        <w:spacing w:line="480" w:lineRule="auto"/>
       </w:pPr>
       <w:r>
         <w:rPr>
@@ -28782,6 +29388,8 @@
           <w:ilvl w:val="0"/>
           <w:numId w:val="1016"/>
         </w:numPr>
+        <w:jc w:val="both"/>
+        <w:spacing w:line="480" w:lineRule="auto"/>
       </w:pPr>
       <w:r>
         <w:rPr>
@@ -28816,6 +29424,8 @@
           <w:ilvl w:val="0"/>
           <w:numId w:val="1016"/>
         </w:numPr>
+        <w:jc w:val="both"/>
+        <w:spacing w:line="480" w:lineRule="auto"/>
       </w:pPr>
       <w:r>
         <w:rPr>
@@ -28841,6 +29451,8 @@
           <w:ilvl w:val="0"/>
           <w:numId w:val="1016"/>
         </w:numPr>
+        <w:jc w:val="both"/>
+        <w:spacing w:line="480" w:lineRule="auto"/>
       </w:pPr>
       <w:r>
         <w:rPr>
@@ -28866,6 +29478,8 @@
           <w:ilvl w:val="0"/>
           <w:numId w:val="1016"/>
         </w:numPr>
+        <w:jc w:val="both"/>
+        <w:spacing w:line="480" w:lineRule="auto"/>
       </w:pPr>
       <w:r>
         <w:rPr>
@@ -28896,6 +29510,8 @@
     <w:p>
       <w:pPr>
         <w:pStyle w:val="FirstParagraph"/>
+        <w:jc w:val="both"/>
+        <w:spacing w:line="480" w:lineRule="auto"/>
       </w:pPr>
       <w:r>
         <w:rPr>
@@ -28938,6 +29554,8 @@
     <w:p>
       <w:pPr>
         <w:pStyle w:val="Textoindependiente"/>
+        <w:jc w:val="both"/>
+        <w:spacing w:line="480" w:lineRule="auto"/>
       </w:pPr>
       <w:r>
         <w:t xml:space="preserve">El contexto de tarea determina qué propiedades de calidad son prioritarias y</w:t>
@@ -28971,6 +29589,8 @@
           <w:ilvl w:val="0"/>
           <w:numId w:val="1017"/>
         </w:numPr>
+        <w:jc w:val="both"/>
+        <w:spacing w:line="480" w:lineRule="auto"/>
       </w:pPr>
       <w:r>
         <w:rPr>
@@ -28996,6 +29616,8 @@
           <w:ilvl w:val="0"/>
           <w:numId w:val="1017"/>
         </w:numPr>
+        <w:jc w:val="both"/>
+        <w:spacing w:line="480" w:lineRule="auto"/>
       </w:pPr>
       <w:r>
         <w:rPr>
@@ -29021,6 +29643,8 @@
           <w:ilvl w:val="0"/>
           <w:numId w:val="1017"/>
         </w:numPr>
+        <w:jc w:val="both"/>
+        <w:spacing w:line="480" w:lineRule="auto"/>
       </w:pPr>
       <w:r>
         <w:rPr>
@@ -29046,6 +29670,8 @@
           <w:ilvl w:val="0"/>
           <w:numId w:val="1017"/>
         </w:numPr>
+        <w:jc w:val="both"/>
+        <w:spacing w:line="480" w:lineRule="auto"/>
       </w:pPr>
       <w:r>
         <w:rPr>
@@ -29077,6 +29703,8 @@
     <w:p>
       <w:pPr>
         <w:pStyle w:val="FirstParagraph"/>
+        <w:jc w:val="both"/>
+        <w:spacing w:line="480" w:lineRule="auto"/>
       </w:pPr>
       <w:r>
         <w:t xml:space="preserve">Las cinco métricas operacionalizadas en los Estudios A y B se localizan en la</w:t>
@@ -29523,6 +30151,8 @@
     <w:p>
       <w:pPr>
         <w:pStyle w:val="FirstParagraph"/>
+        <w:jc w:val="both"/>
+        <w:spacing w:line="480" w:lineRule="auto"/>
       </w:pPr>
       <w:r>
         <w:t xml:space="preserve">El valor de la taxonomía no es meramente descriptivo. Permite derivar dos</w:t>
@@ -29537,6 +30167,8 @@
     <w:p>
       <w:pPr>
         <w:pStyle w:val="Textoindependiente"/>
+        <w:jc w:val="both"/>
+        <w:spacing w:line="480" w:lineRule="auto"/>
       </w:pPr>
       <w:r>
         <w:rPr>
@@ -29618,6 +30250,8 @@
     <w:p>
       <w:pPr>
         <w:pStyle w:val="Textoindependiente"/>
+        <w:jc w:val="both"/>
+        <w:spacing w:line="480" w:lineRule="auto"/>
       </w:pPr>
       <w:r>
         <w:rPr>
@@ -29723,6 +30357,8 @@
     <w:p>
       <w:pPr>
         <w:pStyle w:val="FirstParagraph"/>
+        <w:jc w:val="both"/>
+        <w:spacing w:line="480" w:lineRule="auto"/>
       </w:pPr>
       <w:r>
         <w:t xml:space="preserve">El protocolo FOM-7 (</w:t>
@@ -29789,6 +30425,8 @@
     <w:p>
       <w:pPr>
         <w:pStyle w:val="Textoindependiente"/>
+        <w:jc w:val="both"/>
+        <w:spacing w:line="480" w:lineRule="auto"/>
       </w:pPr>
       <w:r>
         <w:t xml:space="preserve">La contribución metodológica no es la lista de siete pasos —cada uno de ellos</w:t>
@@ -29881,6 +30519,8 @@
     <w:p>
       <w:pPr>
         <w:pStyle w:val="Textoindependiente"/>
+        <w:jc w:val="both"/>
+        <w:spacing w:line="480" w:lineRule="auto"/>
       </w:pPr>
       <w:r>
         <w:t xml:space="preserve">El protocolo FOM-7 está disponible como código fuente reproducible con</w:t>
@@ -29936,6 +30576,8 @@
     <w:p>
       <w:pPr>
         <w:pStyle w:val="FirstParagraph"/>
+        <w:jc w:val="both"/>
+        <w:spacing w:line="480" w:lineRule="auto"/>
       </w:pPr>
       <w:r>
         <w:t xml:space="preserve">La disociación empírica entre fidelidad y estabilidad, documentada con</w:t>
@@ -30039,6 +30681,8 @@
     <w:p>
       <w:pPr>
         <w:pStyle w:val="Textoindependiente"/>
+        <w:jc w:val="both"/>
+        <w:spacing w:line="480" w:lineRule="auto"/>
       </w:pPr>
       <w:r>
         <w:t xml:space="preserve">La taxonomía del Estudio C complementa este hallazgo empírico con un marco</w:t>
@@ -30150,6 +30794,8 @@
     <w:p>
       <w:pPr>
         <w:pStyle w:val="FirstParagraph"/>
+        <w:jc w:val="both"/>
+        <w:spacing w:line="480" w:lineRule="auto"/>
       </w:pPr>
       <w:r>
         <w:t xml:space="preserve">Los resultados del benchmark son suficientemente consistentes para formular</w:t>
@@ -30179,6 +30825,8 @@
     <w:p>
       <w:pPr>
         <w:pStyle w:val="Textoindependiente"/>
+        <w:jc w:val="both"/>
+        <w:spacing w:line="480" w:lineRule="auto"/>
       </w:pPr>
       <w:r>
         <w:rPr>
@@ -30269,6 +30917,8 @@
     <w:p>
       <w:pPr>
         <w:pStyle w:val="Textoindependiente"/>
+        <w:jc w:val="both"/>
+        <w:spacing w:line="480" w:lineRule="auto"/>
       </w:pPr>
       <w:r>
         <w:rPr>
@@ -30311,6 +30961,8 @@
     <w:p>
       <w:pPr>
         <w:pStyle w:val="Textoindependiente"/>
+        <w:jc w:val="both"/>
+        <w:spacing w:line="480" w:lineRule="auto"/>
       </w:pPr>
       <w:r>
         <w:rPr>
@@ -30353,6 +31005,8 @@
     <w:p>
       <w:pPr>
         <w:pStyle w:val="Textoindependiente"/>
+        <w:jc w:val="both"/>
+        <w:spacing w:line="480" w:lineRule="auto"/>
       </w:pPr>
       <w:r>
         <w:rPr>
@@ -30410,6 +31064,8 @@
     <w:p>
       <w:pPr>
         <w:pStyle w:val="FirstParagraph"/>
+        <w:jc w:val="both"/>
+        <w:spacing w:line="480" w:lineRule="auto"/>
       </w:pPr>
       <w:r>
         <w:t xml:space="preserve">Cuatro limitaciones deben tenerse en cuenta al interpretar los resultados y</w:t>
@@ -30424,6 +31080,8 @@
     <w:p>
       <w:pPr>
         <w:pStyle w:val="Textoindependiente"/>
+        <w:jc w:val="both"/>
+        <w:spacing w:line="480" w:lineRule="auto"/>
       </w:pPr>
       <w:r>
         <w:rPr>
@@ -30472,6 +31130,8 @@
     <w:p>
       <w:pPr>
         <w:pStyle w:val="Textoindependiente"/>
+        <w:jc w:val="both"/>
+        <w:spacing w:line="480" w:lineRule="auto"/>
       </w:pPr>
       <w:r>
         <w:rPr>
@@ -30541,6 +31201,8 @@
     <w:p>
       <w:pPr>
         <w:pStyle w:val="Textoindependiente"/>
+        <w:jc w:val="both"/>
+        <w:spacing w:line="480" w:lineRule="auto"/>
       </w:pPr>
       <w:r>
         <w:rPr>
@@ -30601,6 +31263,8 @@
     <w:p>
       <w:pPr>
         <w:pStyle w:val="Textoindependiente"/>
+        <w:jc w:val="both"/>
+        <w:spacing w:line="480" w:lineRule="auto"/>
       </w:pPr>
       <w:r>
         <w:rPr>
@@ -30653,6 +31317,8 @@
     <w:p>
       <w:pPr>
         <w:pStyle w:val="FirstParagraph"/>
+        <w:jc w:val="both"/>
+        <w:spacing w:line="480" w:lineRule="auto"/>
       </w:pPr>
       <w:r>
         <w:t xml:space="preserve">Los resultados, las limitaciones y la taxonomía del Estudio C convergen en</w:t>
@@ -30667,6 +31333,8 @@
     <w:p>
       <w:pPr>
         <w:pStyle w:val="Textoindependiente"/>
+        <w:jc w:val="both"/>
+        <w:spacing w:line="480" w:lineRule="auto"/>
       </w:pPr>
       <w:r>
         <w:rPr>
@@ -30721,6 +31389,8 @@
     <w:p>
       <w:pPr>
         <w:pStyle w:val="Textoindependiente"/>
+        <w:jc w:val="both"/>
+        <w:spacing w:line="480" w:lineRule="auto"/>
       </w:pPr>
       <w:r>
         <w:rPr>
@@ -30769,6 +31439,8 @@
     <w:p>
       <w:pPr>
         <w:pStyle w:val="Textoindependiente"/>
+        <w:jc w:val="both"/>
+        <w:spacing w:line="480" w:lineRule="auto"/>
       </w:pPr>
       <w:r>
         <w:rPr>
@@ -30817,6 +31489,8 @@
     <w:p>
       <w:pPr>
         <w:pStyle w:val="Textoindependiente"/>
+        <w:jc w:val="both"/>
+        <w:spacing w:line="480" w:lineRule="auto"/>
       </w:pPr>
       <w:r>
         <w:rPr>
@@ -30859,6 +31533,8 @@
     <w:p>
       <w:pPr>
         <w:pStyle w:val="Textoindependiente"/>
+        <w:jc w:val="both"/>
+        <w:spacing w:line="480" w:lineRule="auto"/>
       </w:pPr>
       <w:r>
         <w:rPr>
@@ -30951,6 +31627,8 @@
     <w:p>
       <w:pPr>
         <w:pStyle w:val="FirstParagraph"/>
+        <w:jc w:val="both"/>
+        <w:spacing w:line="480" w:lineRule="auto"/>
       </w:pPr>
       <w:r>
         <w:t xml:space="preserve">Esta tesis demuestra empíricamente que los métodos de explicabilidad</w:t>
@@ -31013,6 +31691,8 @@
     <w:p>
       <w:pPr>
         <w:pStyle w:val="Textoindependiente"/>
+        <w:jc w:val="both"/>
+        <w:spacing w:line="480" w:lineRule="auto"/>
       </w:pPr>
       <w:r>
         <w:t xml:space="preserve">El aporte adicional de esta investigación no es solo el resultado del</w:t>
@@ -31097,6 +31777,8 @@
     <w:p>
       <w:pPr>
         <w:pStyle w:val="Bibliography"/>
+        <w:jc w:val="both"/>
+        <w:spacing w:line="480" w:lineRule="auto"/>
       </w:pPr>
       <w:r>
         <w:t xml:space="preserve">n.d.</w:t>
@@ -31107,6 +31789,8 @@
     <w:p>
       <w:pPr>
         <w:pStyle w:val="Bibliography"/>
+        <w:jc w:val="both"/>
+        <w:spacing w:line="480" w:lineRule="auto"/>
       </w:pPr>
       <w:r>
         <w:t xml:space="preserve">Abdul Kadir, M., A. Mosavi, and D. Sonntag. 2023.</w:t>
@@ -31150,6 +31834,8 @@
     <w:p>
       <w:pPr>
         <w:pStyle w:val="Bibliography"/>
+        <w:jc w:val="both"/>
+        <w:spacing w:line="480" w:lineRule="auto"/>
       </w:pPr>
       <w:r>
         <w:t xml:space="preserve">Adadi, &amp; Berrada, A. 2018.</w:t>
@@ -31193,6 +31879,8 @@
     <w:p>
       <w:pPr>
         <w:pStyle w:val="Bibliography"/>
+        <w:jc w:val="both"/>
+        <w:spacing w:line="480" w:lineRule="auto"/>
       </w:pPr>
       <w:r>
         <w:t xml:space="preserve">Agarwal, C., D. Ley, S. Krishna, et al. 2022.</w:t>
@@ -31222,6 +31910,8 @@
     <w:p>
       <w:pPr>
         <w:pStyle w:val="Bibliography"/>
+        <w:jc w:val="both"/>
+        <w:spacing w:line="480" w:lineRule="auto"/>
       </w:pPr>
       <w:r>
         <w:t xml:space="preserve">Ali, Abuhmed, S. 2023.</w:t>
@@ -31265,6 +31955,8 @@
     <w:p>
       <w:pPr>
         <w:pStyle w:val="Bibliography"/>
+        <w:jc w:val="both"/>
+        <w:spacing w:line="480" w:lineRule="auto"/>
       </w:pPr>
       <w:r>
         <w:t xml:space="preserve">Allen, Gan, G. I. 2024.</w:t>
@@ -31308,6 +32000,8 @@
     <w:p>
       <w:pPr>
         <w:pStyle w:val="Bibliography"/>
+        <w:jc w:val="both"/>
+        <w:spacing w:line="480" w:lineRule="auto"/>
       </w:pPr>
       <w:r>
         <w:t xml:space="preserve">Altukhi, Pradhan, Z. M. 2025.</w:t>
@@ -31351,6 +32045,8 @@
     <w:p>
       <w:pPr>
         <w:pStyle w:val="Bibliography"/>
+        <w:jc w:val="both"/>
+        <w:spacing w:line="480" w:lineRule="auto"/>
       </w:pPr>
       <w:r>
         <w:t xml:space="preserve">Angelov, Soares, P. P. 2021.</w:t>
@@ -31394,6 +32090,8 @@
     <w:p>
       <w:pPr>
         <w:pStyle w:val="Bibliography"/>
+        <w:jc w:val="both"/>
+        <w:spacing w:line="480" w:lineRule="auto"/>
       </w:pPr>
       <w:r>
         <w:t xml:space="preserve">Arrieta, Díaz-Rodríguez, A. B. 2019a.</w:t>
@@ -31437,6 +32135,8 @@
     <w:p>
       <w:pPr>
         <w:pStyle w:val="Bibliography"/>
+        <w:jc w:val="both"/>
+        <w:spacing w:line="480" w:lineRule="auto"/>
       </w:pPr>
       <w:r>
         <w:t xml:space="preserve">Belle, &amp; Papantonis, V. 2021.</w:t>
@@ -31480,6 +32180,8 @@
     <w:p>
       <w:pPr>
         <w:pStyle w:val="Bibliography"/>
+        <w:jc w:val="both"/>
+        <w:spacing w:line="480" w:lineRule="auto"/>
       </w:pPr>
       <w:r>
         <w:t xml:space="preserve">Bhattacharya, A., and K. Verbert. 2024.</w:t>
@@ -31523,6 +32225,8 @@
     <w:p>
       <w:pPr>
         <w:pStyle w:val="Bibliography"/>
+        <w:jc w:val="both"/>
+        <w:spacing w:line="480" w:lineRule="auto"/>
       </w:pPr>
       <w:r>
         <w:t xml:space="preserve">Breiman, L. 2001.</w:t>
@@ -31566,6 +32270,8 @@
     <w:p>
       <w:pPr>
         <w:pStyle w:val="Bibliography"/>
+        <w:jc w:val="both"/>
+        <w:spacing w:line="480" w:lineRule="auto"/>
       </w:pPr>
       <w:r>
         <w:t xml:space="preserve">Canha, D., S. Kubler, K. Främling, and G. Fagherazzi. 2025.</w:t>
@@ -31612,6 +32318,8 @@
     <w:p>
       <w:pPr>
         <w:pStyle w:val="Bibliography"/>
+        <w:jc w:val="both"/>
+        <w:spacing w:line="480" w:lineRule="auto"/>
       </w:pPr>
       <w:r>
         <w:t xml:space="preserve">Demšar, Janez. 2006.</w:t>
@@ -31658,6 +32366,8 @@
     <w:p>
       <w:pPr>
         <w:pStyle w:val="Bibliography"/>
+        <w:jc w:val="both"/>
+        <w:spacing w:line="480" w:lineRule="auto"/>
       </w:pPr>
       <w:r>
         <w:t xml:space="preserve">Doshi-Velez, &amp; Kim, F. 2017.</w:t>
@@ -31701,6 +32411,8 @@
     <w:p>
       <w:pPr>
         <w:pStyle w:val="Bibliography"/>
+        <w:jc w:val="both"/>
+        <w:spacing w:line="480" w:lineRule="auto"/>
       </w:pPr>
       <w:r>
         <w:t xml:space="preserve">Floridi, Cowls, L. 2018.</w:t>
@@ -31744,6 +32456,8 @@
     <w:p>
       <w:pPr>
         <w:pStyle w:val="Bibliography"/>
+        <w:jc w:val="both"/>
+        <w:spacing w:line="480" w:lineRule="auto"/>
       </w:pPr>
       <w:r>
         <w:t xml:space="preserve">Friedman, Milton. 1937.</w:t>
@@ -31790,6 +32504,8 @@
     <w:p>
       <w:pPr>
         <w:pStyle w:val="Bibliography"/>
+        <w:jc w:val="both"/>
+        <w:spacing w:line="480" w:lineRule="auto"/>
       </w:pPr>
       <w:r>
         <w:t xml:space="preserve">Gilpin, Bau, L. H. 2018.</w:t>
@@ -31833,6 +32549,8 @@
     <w:p>
       <w:pPr>
         <w:pStyle w:val="Bibliography"/>
+        <w:jc w:val="both"/>
+        <w:spacing w:line="480" w:lineRule="auto"/>
       </w:pPr>
       <w:r>
         <w:t xml:space="preserve">Hassija, Chamola, V. 2023.</w:t>
@@ -31876,6 +32594,8 @@
     <w:p>
       <w:pPr>
         <w:pStyle w:val="Bibliography"/>
+        <w:jc w:val="both"/>
+        <w:spacing w:line="480" w:lineRule="auto"/>
       </w:pPr>
       <w:r>
         <w:t xml:space="preserve">Hedström, A., L. Weber, D. Bareeva, et al. 2023.</w:t>
@@ -31908,6 +32628,8 @@
     <w:p>
       <w:pPr>
         <w:pStyle w:val="Bibliography"/>
+        <w:jc w:val="both"/>
+        <w:spacing w:line="480" w:lineRule="auto"/>
       </w:pPr>
       <w:r>
         <w:t xml:space="preserve">Kohavi, Ron. 1996.</w:t>
@@ -31951,6 +32673,8 @@
     <w:p>
       <w:pPr>
         <w:pStyle w:val="Bibliography"/>
+        <w:jc w:val="both"/>
+        <w:spacing w:line="480" w:lineRule="auto"/>
       </w:pPr>
       <w:r>
         <w:t xml:space="preserve">Lakens, Daniël. 2013.</w:t>
@@ -31997,6 +32721,8 @@
     <w:p>
       <w:pPr>
         <w:pStyle w:val="Bibliography"/>
+        <w:jc w:val="both"/>
+        <w:spacing w:line="480" w:lineRule="auto"/>
       </w:pPr>
       <w:r>
         <w:t xml:space="preserve">Linardatos, Pantelis, Vasilis Papastefanopoulos, and Sotiris Kotsiantis. 2021.</w:t>
@@ -32043,6 +32769,8 @@
     <w:p>
       <w:pPr>
         <w:pStyle w:val="Bibliography"/>
+        <w:jc w:val="both"/>
+        <w:spacing w:line="480" w:lineRule="auto"/>
       </w:pPr>
       <w:r>
         <w:t xml:space="preserve">Linardatos, Papastefanopoulos, P. 2020.</w:t>
@@ -32086,6 +32814,8 @@
     <w:p>
       <w:pPr>
         <w:pStyle w:val="Bibliography"/>
+        <w:jc w:val="both"/>
+        <w:spacing w:line="480" w:lineRule="auto"/>
       </w:pPr>
       <w:r>
         <w:t xml:space="preserve">Lipton, Z. C. 2018.</w:t>
@@ -32129,6 +32859,8 @@
     <w:p>
       <w:pPr>
         <w:pStyle w:val="Bibliography"/>
+        <w:jc w:val="both"/>
+        <w:spacing w:line="480" w:lineRule="auto"/>
       </w:pPr>
       <w:r>
         <w:t xml:space="preserve">Lundberg, &amp; Lee, S. M. 2017.</w:t>
@@ -32172,6 +32904,8 @@
     <w:p>
       <w:pPr>
         <w:pStyle w:val="Bibliography"/>
+        <w:jc w:val="both"/>
+        <w:spacing w:line="480" w:lineRule="auto"/>
       </w:pPr>
       <w:r>
         <w:t xml:space="preserve">Malwade, &amp; Budhavale, S. S. 2023.</w:t>
@@ -32215,6 +32949,8 @@
     <w:p>
       <w:pPr>
         <w:pStyle w:val="Bibliography"/>
+        <w:jc w:val="both"/>
+        <w:spacing w:line="480" w:lineRule="auto"/>
       </w:pPr>
       <w:r>
         <w:t xml:space="preserve">Marcinkevičs, &amp; Vogt, R. 2023.</w:t>
@@ -32258,6 +32994,8 @@
     <w:p>
       <w:pPr>
         <w:pStyle w:val="Bibliography"/>
+        <w:jc w:val="both"/>
+        <w:spacing w:line="480" w:lineRule="auto"/>
       </w:pPr>
       <w:r>
         <w:t xml:space="preserve">Mittelstadt, Russell, B. 2019.</w:t>
@@ -32301,6 +33039,8 @@
     <w:p>
       <w:pPr>
         <w:pStyle w:val="Bibliography"/>
+        <w:jc w:val="both"/>
+        <w:spacing w:line="480" w:lineRule="auto"/>
       </w:pPr>
       <w:r>
         <w:t xml:space="preserve">Mothilal, Sharma, R. K. 2020.</w:t>
@@ -32344,6 +33084,8 @@
     <w:p>
       <w:pPr>
         <w:pStyle w:val="Bibliography"/>
+        <w:jc w:val="both"/>
+        <w:spacing w:line="480" w:lineRule="auto"/>
       </w:pPr>
       <w:r>
         <w:t xml:space="preserve">Murdoch, Singh, W. J. 2019.</w:t>
@@ -32387,6 +33129,8 @@
     <w:p>
       <w:pPr>
         <w:pStyle w:val="Bibliography"/>
+        <w:jc w:val="both"/>
+        <w:spacing w:line="480" w:lineRule="auto"/>
       </w:pPr>
       <w:r>
         <w:t xml:space="preserve">Nemenyi, Peter Bjorn. 1963.</w:t>
@@ -32416,6 +33160,8 @@
     <w:p>
       <w:pPr>
         <w:pStyle w:val="Bibliography"/>
+        <w:jc w:val="both"/>
+        <w:spacing w:line="480" w:lineRule="auto"/>
       </w:pPr>
       <w:r>
         <w:t xml:space="preserve">Nizam, T., and S. Zafar. 2023.</w:t>
@@ -32445,6 +33191,8 @@
     <w:p>
       <w:pPr>
         <w:pStyle w:val="Bibliography"/>
+        <w:jc w:val="both"/>
+        <w:spacing w:line="480" w:lineRule="auto"/>
       </w:pPr>
       <w:r>
         <w:t xml:space="preserve">Nussberger, Luo, A. 2022.</w:t>
@@ -32488,6 +33236,8 @@
     <w:p>
       <w:pPr>
         <w:pStyle w:val="Bibliography"/>
+        <w:jc w:val="both"/>
+        <w:spacing w:line="480" w:lineRule="auto"/>
       </w:pPr>
       <w:r>
         <w:t xml:space="preserve">Pawlicki, M., A. Pawlicka, F. Uccello, et al. 2024.</w:t>
@@ -32534,6 +33284,8 @@
     <w:p>
       <w:pPr>
         <w:pStyle w:val="Bibliography"/>
+        <w:jc w:val="both"/>
+        <w:spacing w:line="480" w:lineRule="auto"/>
       </w:pPr>
       <w:r>
         <w:t xml:space="preserve">Reif, E. et al.</w:t>
@@ -32566,6 +33318,8 @@
     <w:p>
       <w:pPr>
         <w:pStyle w:val="Bibliography"/>
+        <w:jc w:val="both"/>
+        <w:spacing w:line="480" w:lineRule="auto"/>
       </w:pPr>
       <w:r>
         <w:t xml:space="preserve">Ribeiro, Singh, M. T. 2016.</w:t>
@@ -32609,6 +33363,8 @@
     <w:p>
       <w:pPr>
         <w:pStyle w:val="Bibliography"/>
+        <w:jc w:val="both"/>
+        <w:spacing w:line="480" w:lineRule="auto"/>
       </w:pPr>
       <w:r>
         <w:t xml:space="preserve">Ribeiro, Singh, M. T. 2018.</w:t>
@@ -32652,6 +33408,8 @@
     <w:p>
       <w:pPr>
         <w:pStyle w:val="Bibliography"/>
+        <w:jc w:val="both"/>
+        <w:spacing w:line="480" w:lineRule="auto"/>
       </w:pPr>
       <w:r>
         <w:t xml:space="preserve">Rudin, Chen, C. 2022.</w:t>
@@ -32695,6 +33453,8 @@
     <w:p>
       <w:pPr>
         <w:pStyle w:val="Bibliography"/>
+        <w:jc w:val="both"/>
+        <w:spacing w:line="480" w:lineRule="auto"/>
       </w:pPr>
       <w:r>
         <w:t xml:space="preserve">Saarela, &amp; Podgorelec, M. 2024.</w:t>
@@ -32738,6 +33498,8 @@
     <w:p>
       <w:pPr>
         <w:pStyle w:val="Bibliography"/>
+        <w:jc w:val="both"/>
+        <w:spacing w:line="480" w:lineRule="auto"/>
       </w:pPr>
       <w:r>
         <w:t xml:space="preserve">Samek, Montavon, W. 2019.</w:t>
@@ -32781,6 +33543,8 @@
     <w:p>
       <w:pPr>
         <w:pStyle w:val="Bibliography"/>
+        <w:jc w:val="both"/>
+        <w:spacing w:line="480" w:lineRule="auto"/>
       </w:pPr>
       <w:r>
         <w:t xml:space="preserve">Schwalbe, &amp; Finzel, G. 2023.</w:t>
@@ -32824,6 +33588,8 @@
     <w:p>
       <w:pPr>
         <w:pStyle w:val="Bibliography"/>
+        <w:jc w:val="both"/>
+        <w:spacing w:line="480" w:lineRule="auto"/>
       </w:pPr>
       <w:r>
         <w:t xml:space="preserve">Tripathy, &amp; Seetha, B. K. 2024.</w:t>
@@ -32867,6 +33633,8 @@
     <w:p>
       <w:pPr>
         <w:pStyle w:val="Bibliography"/>
+        <w:jc w:val="both"/>
+        <w:spacing w:line="480" w:lineRule="auto"/>
       </w:pPr>
       <w:r>
         <w:t xml:space="preserve">Wachter, Mittelstadt, S. 2017.</w:t>
@@ -32910,6 +33678,8 @@
     <w:p>
       <w:pPr>
         <w:pStyle w:val="Bibliography"/>
+        <w:jc w:val="both"/>
+        <w:spacing w:line="480" w:lineRule="auto"/>
       </w:pPr>
       <w:r>
         <w:t xml:space="preserve">Wilcoxon, Frank. 1945.</w:t>
@@ -32956,6 +33726,8 @@
     <w:p>
       <w:pPr>
         <w:pStyle w:val="Bibliography"/>
+        <w:jc w:val="both"/>
+        <w:spacing w:line="480" w:lineRule="auto"/>
       </w:pPr>
       <w:r>
         <w:t xml:space="preserve">Zheng, X., F. Shirani, Z. Chen, et al. 2025.</w:t>
@@ -38378,7 +39150,7 @@
 </file>
 
 <file path=word/styles.xml><?xml version="1.0" encoding="utf-8"?>
-<w:styles xmlns:r="http://schemas.openxmlformats.org/officeDocument/2006/relationships" xmlns:w="http://schemas.openxmlformats.org/wordprocessingml/2006/main">
+<w:styles xmlns:w="http://schemas.openxmlformats.org/wordprocessingml/2006/main">
   <w:docDefaults>
     <w:rPrDefault>
       <w:rPr>
@@ -38540,6 +39312,10 @@
     <w:rPr>
       <w:lang w:val="es-MX"/>
     </w:rPr>
+    <w:pPr>
+      <w:jc w:val="both"/>
+      <w:spacing w:line="480" w:lineRule="auto"/>
+    </w:pPr>
   </w:style>
   <w:style w:styleId="Ttulo1" w:type="paragraph">
     <w:name w:val="heading 1"/>
@@ -38689,7 +39465,8 @@
     <w:unhideWhenUsed/>
     <w:rsid w:val="00781846"/>
     <w:pPr>
-      <w:spacing w:after="120"/>
+      <w:spacing w:after="120" w:line="480" w:lineRule="auto"/>
+      <w:jc w:val="both"/>
     </w:pPr>
   </w:style>
   <w:style w:customStyle="1" w:styleId="TextoindependienteCar" w:type="character">
@@ -38794,6 +39571,8 @@
     <w:pPr>
       <w:ind w:left="720"/>
       <w:contextualSpacing/>
+      <w:jc w:val="both"/>
+      <w:spacing w:line="480" w:lineRule="auto"/>
     </w:pPr>
   </w:style>
   <w:style w:styleId="Hipervnculovisitado" w:type="character">
@@ -39169,7 +39948,8 @@
       <w:autoSpaceDE w:val="0"/>
       <w:autoSpaceDN w:val="0"/>
       <w:adjustRightInd w:val="0"/>
-      <w:spacing w:after="0" w:line="240" w:lineRule="auto"/>
+      <w:spacing w:after="0" w:line="480" w:lineRule="auto"/>
+      <w:jc w:val="both"/>
     </w:pPr>
     <w:rPr>
       <w:rFonts w:cs="Times New Roman"/>

</xml_diff>